<commit_message>
Address review round 6: unify interaction CI, sanitize DOCX claims, clean theory TeX, add test suite
- Align stage interaction CI to emitted [-2.33, 0.59] in main.tex and DOCX (W-R6-1)
- Restore \alpha and eliminate non-printing control bytes in theory doc (W-R6-2)
- Sanitize surviving over-claims in DOCX abstract, main fit, peak phase, and limitations (W-R6-3)
- Refine line 528: downgrade IV to robustness check, remove over-reading mechanism clause, add parameter citations, and note unweighted 2SLS (W-R6-4)
- Add Corollary 1 corner solution, replace Althouse citation with Azmon & Stoner, and tone down rhetoric (W-R3-6, W-R3-3, W-R5-6)
- Add automated verification test (tests/check_paper_numbers.py), LICENSE, requirements.txt, and update README (W-R6-5, W8)
- Rebuild main.pdf (28 pp), main_docx.docx, and Fig. 4
</commit_message>
<xml_diff>
--- a/paper/main_docx.docx
+++ b/paper/main_docx.docx
@@ -37,7 +37,7 @@
         <w:rPr>
           <w:sz w:val="24"/>
         </w:rPr>
-        <w:t xml:space="preserve">摘要：准确识别疫情增长并预测短期病例负担是现代传染病预警与公共卫生应急响应的核心支柱。常规直觉认为样本量越大推断精度越高，但在个体超传播、监测漏报与共同环境扰动并存时，“样本量”与“信息量”不能简单等同。既有信息下界文献所确立的标度律主要建立在当期再生数 R_t 这一类估计目标之上；本文证明，一旦推断目标切换为消除单周共同波动的跨期基础水平 R̄，信息标度律随之改变，据此将“病例规模何时不再主导推断误差”作为监测设计问题展开严格推导。主要理论结果表明：（1）在已知真实风险集 n、报告率 ρ 与离散参数 k 的基准负二项分支--二项报告模型下，矩估计量 R̂_t 恰为条件极大似然估计且严格达到 Fisher 信息逆，方差随期望报告规模 m=ρn 单调收敛于零；（2）以该单期估计量推断跨期基础水平 R̄ 时，方差受制于环境随机性底板 v_R，由此导出环境方差项与规模相关项相等的平滑交叉点 m_×；（3）监测杠杆存在本质非对称性：提高报告率 ρ 仅能消除漏报抽稀方差，唯有扩大感染基数 n 才能同时压制超传播方差与计数波动；在总预算 B 约束下拉长独立观测期数 T 能以 O(1/T) 削减环境方差；（4）在成本约束下推导出了最优单期监测规模闭式解 m*，澄清了交叉点是方差成分平衡点而非刚性边界；（5）给出了基于负二项单调似然比的精确上尾增长判定检验与离散功效公式，并在时间序列更新过程中清晰剥离了事前预测与事后统计量的代数联系。实证方面，利用美国 CDC NHSN 2020—2026 年覆盖 50 个州及华盛顿特区的 16,218 个州--周流感住院真实监测数据进行系统检验：流行初期波段仿射 FGLS 拟合得经验截距 a=0.0991、规模斜率 b=2.2434 显著为正，经验交叉点约为 22.6 例/周（跨规格呈现 10.6—42.7 的分布跨度）；误差预算分解表明与规模无关拟合项占 39%—55%（回顾口径 54.6%），样本内已实现的大规模观测（D_t≥250）误差约为全体平均的六成；达峰期近 89% 的总体误差源于平稳基准在流行拐点处的常数偏移，控制偏移后达峰期内部规模项依然显著为正（统一尺度下阶段斜率差异未达统计显著），证明所谓“样本量失效”实为平稳性假设破缺而非规模效应失效；时变交叉点在流感季（中位数 19.7—20.4）与非流感季（46.9—47.9）呈现系统性分异；进一步通过 Cori 时变更新过程基线对拍、预测偏差项分解以及季节内独立 2SLS 工具变量回归证实了规模效应的强稳健性。本研究为优化公共卫生监测资源在样本覆盖、环境协变量采集与多期时空平滑之间的科学配置提供了定量分析参照。</w:t>
+        <w:t xml:space="preserve">摘要：准确识别疫情增长并预测短期病例负担是现代传染病预警与公共卫生应急响应的核心支柱。常规直觉认为样本量越大推断精度越高，但在个体超传播、监测漏报与共同环境扰动并存时，“样本量”与“信息量”不能简单等同。既有信息下界文献所确立的标度律主要建立在当期再生数 R_t 这一类估计目标之上；本文证明，一旦推断目标切换为消除单周共同波动的跨期基础水平 R̄，信息标度律随之改变，据此将“病例规模何时不再主导推断误差”作为监测设计问题展开严格推导。主要理论结果表明：（1）在已知真实风险集 n、报告率 ρ 与离散参数 k 的基准负二项分支--二项报告模型下，矩估计量 R̂_t 恰为条件极大似然估计且严格达到 Fisher 信息逆，方差随期望报告规模 m=ρn 单调收敛于零；（2）以该单期估计量推断跨期基础水平 R̄ 时，方差受制于环境随机性底板 v_R，由此导出环境方差项与规模相关项相等的平滑交叉点 m_×；（3）监测杠杆存在本质非对称性：提高报告率 ρ 仅能消除漏报抽稀方差，唯有扩大感染基数 n 才能同时压制超传播方差与计数波动；在总预算 B 约束下拉长独立观测期数 T 能以 O(1/T) 削减环境方差；（4）在成本约束下推导出了最优单期监测规模闭式解 m*，澄清了交叉点是方差成分平衡点而非刚性边界；（5）给出了基于负二项单调似然比的精确上尾增长判定检验与离散功效公式，并在时间序列更新过程中清晰剥离了事前预测与事后统计量的代数联系。实证方面，利用美国 CDC NHSN 2020—2026 年覆盖 50 个州及华盛顿特区的 16,218 个州--周流感住院真实监测数据进行系统检验：流行初期波段仿射 FGLS 拟合得经验截距 a=0.0991、规模斜率 b=2.2434 显著为正，经验交叉点约为 22.6 例/周（跨规格呈现 10.6—42.7 的分布跨度）；误差预算分解表明与规模无关拟合项占 39%—55%（回顾口径 54.6%），样本内已实现的大规模观测（D_t≥250）误差约为全体平均的六成；达峰期近 89% 的总体误差源于平稳基准在流行拐点处的常数偏移，控制偏移后达峰期内部规模项依然显著为正（统一尺度下阶段斜率差异未达统计显著），证明所谓“样本量失效”实为平稳性假设破缺而非规模效应失效；时变交叉点在流感季（中位数 19.7—20.4）与非流感季（46.9—47.9）呈现系统性分异。本研究为优化公共卫生监测资源在样本覆盖、环境协变量采集与多期时空平滑之间的科学配置提供了定量分析参照。</w:t>
       </w:r>
     </w:p>
     <w:p>
@@ -184,7 +184,7 @@
         <w:rPr>
           <w:sz w:val="24"/>
         </w:rPr>
-        <w:t xml:space="preserve">第四，人口统计随机性与环境随机性二分。生态动力学经典理论阐明了微观繁殖抽样随机性与宏观共同环境扰动的本质对立[18,33]。微观随机性随种群规模扩大而迅速衰减，但宏观环境震荡在单期横截面内具有共同乘性特征，无法凭单期病例聚合消除[16,17,19]。在计量统计学中，这一问题与经典测量误差模型及方差成分信度理论在代数分解形式上高度一致[22,23,24,25]，为交叉点提供了信度比等于0.5的理论锚点。</w:t>
+        <w:t xml:space="preserve">第四，人口统计随机性与环境随机性二分。生态动力学经典理论阐明了微观繁殖抽样随机性与宏观共同环境扰动的本质对立[18,33]。微观随机性随种群规模扩大而迅速衰减，但宏观环境震荡在单期横截面内具有共同乘性特征，无法凭单期病例聚合消除[16,17,19]。在计量统计学中，这一问题与经典测量误差模型及方差成分信度理论在代数分解形式上高度一致[22,23,24,25]，在方差分解的代数形式上恰对应单期估计方差内部信度比（即信号方差占总方差比例）等于0.5的对称位置[23]。</w:t>
       </w:r>
     </w:p>
     <w:p>
@@ -1243,7 +1243,7 @@
         <w:rPr>
           <w:sz w:val="24"/>
         </w:rPr>
-        <w:t xml:space="preserve">在数理结构上，m_×处单期估计方差内部信度比（即信号方差占总方差比例）恰好等于0.5。交叉点代表规模项与环境项权重的平滑交接点，而非突变的硬阈值。当m&gt;m_×后，环境方差开始占主导，增加病例数仅能作用于占比逐渐缩小的A/m项。</w:t>
+        <w:t xml:space="preserve">在方差分解的代数形式上，m_×处单期估计方差内部信度比（即信号方差占总方差比例）恰好等于0.5。交叉点代表规模项与环境项权重的平滑交接点，而非突变的硬阈值。当m&gt;m_×后，环境方差开始占主导，增加病例数仅能作用于占比逐渐缩小的A/m项。</w:t>
       </w:r>
     </w:p>
     <w:p>
@@ -1814,7 +1814,7 @@
         <w:rPr>
           <w:sz w:val="24"/>
         </w:rPr>
-        <w:t xml:space="preserve">注记：命题4中无固定成本的纯人数预算对应c_0=0特例，此时m*→0；推论1则刻画了存在固定运作开销时的现实平衡。若环境扰动存在AR(1)自相关，有效环境方差增大，最优单期规模相应调整为m*_AR = sqrt((c_0/c_1)·m_×·(1-r)/(1+r)) &lt; m*。最优规模m*对未知方差参数的依赖完全通过交叉点m_×体现，证明了真实最优决策取决于成本结构与交叉点的几何权衡。</w:t>
+        <w:t xml:space="preserve">注记：若由内部一阶条件求出的规模超出可行上界（即sqrt((c_0/c_1)m_×) &gt; (B-c_0)/c_1），则由凸函数单调性取边界角点解m* = (B-c_0)/c_1（对应T=1）。命题4中无固定成本的纯人数预算对应c_0=0特例，此时m*→0；推论1则刻画了存在固定运作开销时的现实平衡。若环境扰动存在AR(1)自相关，有效环境方差增大，最优单期规模相应调整为m*_AR = sqrt((c_0/c_1)·m_×·(1-r)/(1+r)) &lt; m*。最优规模m*对未知方差参数的依赖完全通过交叉点m_×体现，证明了真实最优决策取决于成本结构与交叉点的几何权衡。</w:t>
       </w:r>
     </w:p>
     <w:p>
@@ -2362,7 +2362,7 @@
                     <pic:cNvPicPr/>
                   </pic:nvPicPr>
                   <pic:blipFill>
-                    <a:blip r:embed="R565c1d2acc4e44ac" cstate="print"/>
+                    <a:blip r:embed="R762530020fec427c" cstate="print"/>
                     <a:stretch>
                       <a:fillRect/>
                     </a:stretch>
@@ -2443,7 +2443,7 @@
                     <pic:cNvPicPr/>
                   </pic:nvPicPr>
                   <pic:blipFill>
-                    <a:blip r:embed="Rd9d2426725264045" cstate="print"/>
+                    <a:blip r:embed="R065074b4cc234755" cstate="print"/>
                     <a:stretch>
                       <a:fillRect/>
                     </a:stretch>
@@ -2524,7 +2524,7 @@
                     <pic:cNvPicPr/>
                   </pic:nvPicPr>
                   <pic:blipFill>
-                    <a:blip r:embed="R142fd0d1e63b4f17" cstate="print"/>
+                    <a:blip r:embed="R4ec986203ee748ef" cstate="print"/>
                     <a:stretch>
                       <a:fillRect/>
                     </a:stretch>
@@ -3044,7 +3044,7 @@
         <w:rPr>
           <w:sz w:val="24"/>
         </w:rPr>
-        <w:t xml:space="preserve">FGLS仿射拟合给出规模斜率b=2.2434（聚类bootstrap 95% CI [1.5019, 3.0161]，极显著排除零点），与规模无关经验损失截距a=0.0991，经验交叉点m_×^emp=b/a=22.6例/周（十分位拟合为22.6；截尾1%后移至10.6，属量级估计）。</w:t>
+        <w:t xml:space="preserve">FGLS仿射拟合给出规模斜率b=2.2434（聚类bootstrap 95% CI [1.5019, 3.0161]，排除零点），与规模无关经验损失截距a=0.0991，经验交叉点m_×^emp=b/a=22.6例/周（十分位拟合为22.6；截尾1%后移至10.6，属量级估计）。</w:t>
       </w:r>
     </w:p>
     <w:p>
@@ -3535,7 +3535,7 @@
         <w:rPr>
           <w:sz w:val="24"/>
         </w:rPr>
-        <w:t xml:space="preserve">表2表明：在所有更新过程基准中，预测误差在D_t≤100内随每周病例规模快速下降，越过百例后趋于平缓（约0.087–0.098），进入收益放缓的经验底板平台；在大规模段（D_t≥100），Cori 2周窗基准误差降至0.0903（略低于常数阶段均值在[250,600)箱的0.1032和[100,250)箱的0.1118），展现了时变参数适应局部转折的优势；仿射拟合给出b=6.0637（m_×=74.7）。无论采用常数基准还是时变更新基准，规模双曲衰减并在大尺度趋缓均表现出内在结构性。</w:t>
+        <w:t xml:space="preserve">表2表明：在所有更新过程基准中，预测误差在D_t≤100内随每周病例规模快速下降，越过百例后趋于平缓（约0.087–0.098），进入收益放缓的经验底板平台；在大规模段（D_t≥100），Cori 2周窗基准误差降至0.0903（略低于常数阶段均值在[250,600)箱的0.1032和[100,250)箱的0.1118），展现了时变参数适应局部转折的优势；仿射拟合给出b=6.0637（m_×=74.7）。无论采用常数基准还是时变更新基准，误差均随病例规模呈现递减形态并在大规模段趋缓，而具体点位取决于基准构造。</w:t>
       </w:r>
     </w:p>
     <w:p>
@@ -3995,7 +3995,7 @@
         <w:rPr>
           <w:sz w:val="24"/>
         </w:rPr>
-        <w:t xml:space="preserve">表4证实：统一尺度后达峰期斜率点估计（1.8521）低于初期，联合交互项（-0.9183，95%CI[-2.2702, 0.6261]）未达统计显著。两阶段未发现规模效应的显著退化或增强，证实达峰期失效的是平稳性假设而非病例规模。</w:t>
+        <w:t xml:space="preserve">表4证实：统一尺度后达峰期斜率点估计（1.8521）低于初期，联合交互项（-0.9183，按州聚类bootstrap 95%CI为[-2.33, 0.59]）包含零点且未达统计显著；结合达峰期总体样本中基准偏移项占总损失88.9%的分解证据，表明达峰期预测误差居高不下主要源于跨期平稳性假设失效，而非病例规模项丧失边际贡献。</w:t>
       </w:r>
     </w:p>
     <w:p>
@@ -4020,7 +4020,7 @@
                     <pic:cNvPicPr/>
                   </pic:nvPicPr>
                   <pic:blipFill>
-                    <a:blip r:embed="Re6768b2cc243486e" cstate="print"/>
+                    <a:blip r:embed="R277ef22e18c049e6" cstate="print"/>
                     <a:stretch>
                       <a:fillRect/>
                     </a:stretch>
@@ -4076,7 +4076,7 @@
         <w:rPr>
           <w:sz w:val="24"/>
         </w:rPr>
-        <w:t xml:space="preserve">以滞后3–5周输入核为工具变量开展2SLS回归：汇集样本中第一阶段稳健F=312.9，第二阶段差值(b_iv - b_ols)=1.3921，10,000次聚类bootstrap 95%CI为[0.43, 2.41]（重抽超越比例0.0014，排除零点），表明汇集样本下2SLS估计斜率高于OLS。分季独立检验中，各季节第一阶段稳健F均在75以上（强工具），b_iv均显著为正（2022–23季3.2787, 2023–24季2.1867, 2024–25季3.6131），差值在2024–25季表现为临界为正（[0.01, 3.47]）。鉴于排除限制难以在理论上绝对保证，该对照定位为说明变量误差不改变规模效应正向存在的强稳健性对照。</w:t>
+        <w:t xml:space="preserve">以滞后3–5周输入核为工具变量开展2SLS回归：汇集样本中第一阶段稳健F=312.9，第二阶段差值(b_iv - b_ols)=1.3921，10,000次聚类bootstrap 95%CI为[0.43, 2.41]（bootstrap单侧比例0.0014，排除零点），表明汇集样本下2SLS估计斜率高于OLS。分季独立检验中，各季节第一阶段稳健F均在75以上（强工具），b_iv均显著为正（2022–23季3.2787, 2023–24季2.1867, 2024–25季3.6131），差值在2024–25季表现为临界为正（[0.01, 3.47]）。鉴于排除限制难以在理论上绝对保证，该对照定位为说明变量误差不改变规模效应正向存在的稳健性对照。</w:t>
       </w:r>
     </w:p>
     <w:p>
@@ -4176,7 +4176,7 @@
         <w:rPr>
           <w:sz w:val="24"/>
         </w:rPr>
-        <w:t xml:space="preserve">本文对全部论断实施严格证据分层：(1)理论基准的条件性：命题1–6界定的是规范数理基准，真实时间序列中经验规模斜率相较单代参数存在时序重加权放大效应；(2)经验截距的机制类比性：截距a=0.0991同时包含未观测感染压力的代理不确定性，本文明确将其定性为经验损失下限而非环境方差的孤立识别；(3)因果推断的解释边界：自愿期覆盖率冲击与夏季低发期重叠，定位为相容的描述性证据；工具变量定位为强稳健性对照。</w:t>
+        <w:t xml:space="preserve">本文对全部论断实施严格证据分层：(1)理论基准的条件性：命题1–6界定的是规范数理基准，真实时间序列中经验规模斜率相较单代参数存在时序重加权放大效应；(2)经验截距的机制类比性：截距a=0.0991同时包含未观测感染压力的代理不确定性，本文明确将其定性为经验损失下限而非环境方差的孤立识别；(3)因果推断的解释边界：自愿期覆盖率冲击与夏季低发期重叠，定位为相容的描述性证据；工具变量定位为稳健性对照。</w:t>
       </w:r>
     </w:p>
     <w:p>
@@ -4617,7 +4617,7 @@
       </w:r>
     </w:p>
     <w:sectPr>
-      <w:footerReference w:type="default" r:id="R326ad9c04d5247a5"/>
+      <w:footerReference w:type="default" r:id="R17507cb385534bfc"/>
       <w:pgSz w:w="11906" w:h="16838"/>
       <w:pgMar w:top="1440" w:right="1803" w:bottom="1440" w:left="1803" w:header="850" w:footer="992"/>
       <w:docGrid w:type="default"/>

</xml_diff>

<commit_message>
Address review round 7: dynamically generate DOCX refs from .bib, refine parameters, update m*
- Generate DOCX bibliography dynamically from references.bib with full DOI parity (W-R7-1)
- Fix subtitle in Breto et al. title in references.bib and cite althouse2015enhancing in main.tex (W-R7-1, W-R7-6)
- Clarify illustrative theoretical parameter scenario and contextual derivation at line 528 (W-R7-2)
- Update Remark 5 m* numbers to 14.7-24.4 and 46.5-77.1 to match 21.6-59.4 (W-R7-3)
- Refine DOCX phrasing: add subject to P14, tone down '证明' to '表明', change '表4证实' to '表4显示' (W-R7-5)
- Synchronize Corollary 1 corner solution in theory document (W-R7-6)
- Update LICENSE copyright notice/scope and pin requirements.txt ranges (W-R7-6)
- Upgrade tests/check_paper_numbers.py with robust root resolution and 33-DOI parity checks (W-R7-4)
- Rebuild main.pdf (28 pp) and main_docx.docx
</commit_message>
<xml_diff>
--- a/paper/main_docx.docx
+++ b/paper/main_docx.docx
@@ -37,7 +37,7 @@
         <w:rPr>
           <w:sz w:val="24"/>
         </w:rPr>
-        <w:t xml:space="preserve">摘要：准确识别疫情增长并预测短期病例负担是现代传染病预警与公共卫生应急响应的核心支柱。常规直觉认为样本量越大推断精度越高，但在个体超传播、监测漏报与共同环境扰动并存时，“样本量”与“信息量”不能简单等同。既有信息下界文献所确立的标度律主要建立在当期再生数 R_t 这一类估计目标之上；本文证明，一旦推断目标切换为消除单周共同波动的跨期基础水平 R̄，信息标度律随之改变，据此将“病例规模何时不再主导推断误差”作为监测设计问题展开严格推导。主要理论结果表明：（1）在已知真实风险集 n、报告率 ρ 与离散参数 k 的基准负二项分支--二项报告模型下，矩估计量 R̂_t 恰为条件极大似然估计且严格达到 Fisher 信息逆，方差随期望报告规模 m=ρn 单调收敛于零；（2）以该单期估计量推断跨期基础水平 R̄ 时，方差受制于环境随机性底板 v_R，由此导出环境方差项与规模相关项相等的平滑交叉点 m_×；（3）监测杠杆存在本质非对称性：提高报告率 ρ 仅能消除漏报抽稀方差，唯有扩大感染基数 n 才能同时压制超传播方差与计数波动；在总预算 B 约束下拉长独立观测期数 T 能以 O(1/T) 削减环境方差；（4）在成本约束下推导出了最优单期监测规模闭式解 m*，澄清了交叉点是方差成分平衡点而非刚性边界；（5）给出了基于负二项单调似然比的精确上尾增长判定检验与离散功效公式，并在时间序列更新过程中清晰剥离了事前预测与事后统计量的代数联系。实证方面，利用美国 CDC NHSN 2020—2026 年覆盖 50 个州及华盛顿特区的 16,218 个州--周流感住院真实监测数据进行系统检验：流行初期波段仿射 FGLS 拟合得经验截距 a=0.0991、规模斜率 b=2.2434 显著为正，经验交叉点约为 22.6 例/周（跨规格呈现 10.6—42.7 的分布跨度）；误差预算分解表明与规模无关拟合项占 39%—55%（回顾口径 54.6%），样本内已实现的大规模观测（D_t≥250）误差约为全体平均的六成；达峰期近 89% 的总体误差源于平稳基准在流行拐点处的常数偏移，控制偏移后达峰期内部规模项依然显著为正（统一尺度下阶段斜率差异未达统计显著），证明所谓“样本量失效”实为平稳性假设破缺而非规模效应失效；时变交叉点在流感季（中位数 19.7—20.4）与非流感季（46.9—47.9）呈现系统性分异。本研究为优化公共卫生监测资源在样本覆盖、环境协变量采集与多期时空平滑之间的科学配置提供了定量分析参照。</w:t>
+        <w:t xml:space="preserve">摘要：准确识别疫情增长并预测短期病例负担是现代传染病预警与公共卫生应急响应的核心支柱。常规直觉认为样本量越大推断精度越高，但在个体超传播、监测漏报与共同环境扰动并存时，“样本量”与“信息量”不能简单等同。既有信息下界文献所确立的标度律主要建立在当期再生数 R_t 这一类估计目标之上；本文证明，一旦推断目标切换为消除单周共同波动的跨期基础水平 R̄，信息标度律随之改变，据此将“病例规模何时不再主导推断误差”作为监测设计问题展开严格推导。主要理论结果表明：（1）在已知真实风险集 n、报告率 ρ 与离散参数 k 的基准负二项分支--二项报告模型下，矩估计量 R̂_t 恰为条件极大似然估计且严格达到 Fisher 信息逆，方差随期望报告规模 m=ρn 单调收敛于零；（2）以该单期估计量推断跨期基础水平 R̄ 时，方差受制于环境随机性底板 v_R，由此导出环境方差项与规模相关项相等的平滑交叉点 m_×；（3）监测杠杆存在本质非对称性：提高报告率 ρ 仅能消除漏报抽稀方差，唯有扩大感染基数 n 才能同时压制超传播方差与计数波动；在总预算 B 约束下拉长独立观测期数 T 能以 O(1/T) 削减环境方差；（4）在成本约束下推导出了最优单期监测规模闭式解 m*，澄清了交叉点是方差成分平衡点而非刚性边界；（5）给出了基于负二项单调似然比的精确上尾增长判定检验与离散功效公式，并在时间序列更新过程中清晰剥离了事前预测与事后统计量的代数联系。实证方面，利用美国 CDC NHSN 2020—2026 年覆盖 50 个州及华盛顿特区的 16,218 个州--周流感住院真实监测数据进行系统检验：流行初期波段仿射 FGLS 拟合得经验截距 a=0.0991、规模斜率 b=2.2434 显著为正，经验交叉点约为 22.6 例/周（跨规格呈现 10.6—42.7 的分布跨度）；误差预算分解表明与规模无关拟合项占 39%—55%（回顾口径 54.6%），样本内已实现的大规模观测（D_t≥250）误差约为全体平均的六成；达峰期近 89% 的总体误差源于平稳基准在流行拐点处的常数偏移，控制偏移后达峰期内部规模项依然显著为正（两阶段斜率差异未达统计显著），表明所谓“样本量失效”实为跨期平稳性假设破缺而非病例规模项丧失作用；时变交叉点在流感季（中位数 19.7—20.4）与非流感季（46.9—47.9）呈现系统性分异。本研究为优化公共卫生监测资源在样本覆盖、环境协变量采集与多期时空平滑之间的科学配置提供了定量分析参照。</w:t>
       </w:r>
     </w:p>
     <w:p>
@@ -75,7 +75,7 @@
         <w:rPr>
           <w:sz w:val="24"/>
         </w:rPr>
-        <w:t xml:space="preserve">准确识别疫情由平稳或下降转为上升增长，并对随后数周的病例负担作出可靠预测，是现代传染病预警与公共卫生应急响应的核心支柱。在常规统计直觉中，大样本量通常意味着高推断精度，即增加捕获病例数能够持续压制随机计数波动的相对影响。然而，在传染病监测与动力学建模的真实场景下，这一直觉往往遭遇严峻挑战：病原体传播普遍具有高度个体异质性（超传播），导致继发感染数严重过离散[1,2]；监测系统普遍存在不同程度的不完全检测与报告延迟[20,31]；更关键的是，处于同一地理辖区或时间窗口内的宿主群体共同受到气象条件、人群接触模式以及周期性社会流动等环境随机扰动[16,33]。在个体微观超传播、宏观监测漏报与中观共同环境波动交织并存的条件下，“样本量”与“信息量”不能再被简单等同。</w:t>
+        <w:t xml:space="preserve">准确识别疫情由平稳或下降转为上升增长，并对随后数周的病例负担作出可靠预测，是现代传染病预警与公共卫生应急响应的核心支柱。在常规统计直觉中，大样本量通常意味着高推断精度，即增加捕获病例数能够持续压制随机计数波动的相对影响。然而，在传染病监测与动力学建模的真实场景下，这一直觉往往遭遇严峻挑战：病原体传播普遍具有高度个体异质性（超传播），导致继发感染数严重过离散[1,2]；监测系统普遍存在不同程度的不完全检测与报告延迟[32,31]；此外，处于同一地理辖区或时间窗口内的宿主群体共同受到气象条件、人群接触模式以及周期性社会流动等环境随机扰动[16,33]。在个体微观超传播、宏观监测漏报与中观共同环境波动交织并存的条件下，“样本量”与“信息量”不能再被简单等同。</w:t>
       </w:r>
     </w:p>
     <w:p>
@@ -184,19 +184,19 @@
         <w:rPr>
           <w:sz w:val="24"/>
         </w:rPr>
-        <w:t xml:space="preserve">第四，人口统计随机性与环境随机性二分。生态动力学经典理论阐明了微观繁殖抽样随机性与宏观共同环境扰动的本质对立[18,33]。微观随机性随种群规模扩大而迅速衰减，但宏观环境震荡在单期横截面内具有共同乘性特征，无法凭单期病例聚合消除[16,17,19]。在计量统计学中，这一问题与经典测量误差模型及方差成分信度理论在代数分解形式上高度一致[22,23,24,25]，在方差分解的代数形式上恰对应单期估计方差内部信度比（即信号方差占总方差比例）等于0.5的对称位置[23]。</w:t>
-      </w:r>
-    </w:p>
-    <w:p>
-      <w:pPr>
-        <w:spacing w:after="0"/>
-        <w:ind w:firstLine="480"/>
-      </w:pPr>
-      <w:r>
-        <w:rPr>
-          <w:sz w:val="24"/>
-        </w:rPr>
-        <w:t xml:space="preserve">第五，大规模真实监测与前瞻预测评估实践。美国CDC FluSight挑战赛等多模型集成实践表明，前瞻预测精度的提升迅速呈现收益递减平台，集合模型的误差往往受制于超预期的季节性漂移而非单个辖区的样本规模[26,27,28,29,30]；相对均方误差等评分规则展现出有效平衡不同发病规模量级的稳健优势[12]。</w:t>
+        <w:t xml:space="preserve">第四，人口统计随机性与环境随机性二分。生态动力学经典理论阐明了微观繁殖抽样随机性与宏观共同环境扰动的本质对立[18,33]。微观随机性随种群规模扩大而迅速衰减，但宏观环境震荡在单期横截面内具有共同乘性特征，无法凭单期病例聚合消除[16,17,19]。在计量统计学中，这一问题与经典测量误差模型及方差成分信度理论在代数形式上高度一致[22,23,24,25]，其交叉点在方差分解中恰对应单期估计方差内部信度比（即信号方差占总方差比例）等于0.5的对称位置[23]。</w:t>
+      </w:r>
+    </w:p>
+    <w:p>
+      <w:pPr>
+        <w:spacing w:after="0"/>
+        <w:ind w:firstLine="480"/>
+      </w:pPr>
+      <w:r>
+        <w:rPr>
+          <w:sz w:val="24"/>
+        </w:rPr>
+        <w:t xml:space="preserve">第五，大规模真实监测与前瞻预测评估实践。新型数据流拓展与美国CDC FluSight挑战赛等多模型集成实践表明[20,26,27,28,29,30]，前瞻预测精度的提升迅速呈现收益递减平台，集合模型的误差往往受制于超预期的季节性漂移而非单个辖区的样本规模；相对均方误差等评分规则展现出有效平衡不同发病规模量级的稳健优势[12]。</w:t>
       </w:r>
     </w:p>
     <w:p>
@@ -2362,7 +2362,7 @@
                     <pic:cNvPicPr/>
                   </pic:nvPicPr>
                   <pic:blipFill>
-                    <a:blip r:embed="R762530020fec427c" cstate="print"/>
+                    <a:blip r:embed="Rc4534a9216664325" cstate="print"/>
                     <a:stretch>
                       <a:fillRect/>
                     </a:stretch>
@@ -2443,7 +2443,7 @@
                     <pic:cNvPicPr/>
                   </pic:nvPicPr>
                   <pic:blipFill>
-                    <a:blip r:embed="R065074b4cc234755" cstate="print"/>
+                    <a:blip r:embed="Rf5157cda7fbd45b4" cstate="print"/>
                     <a:stretch>
                       <a:fillRect/>
                     </a:stretch>
@@ -2524,7 +2524,7 @@
                     <pic:cNvPicPr/>
                   </pic:nvPicPr>
                   <pic:blipFill>
-                    <a:blip r:embed="R4ec986203ee748ef" cstate="print"/>
+                    <a:blip r:embed="Rbc5957c425084ea3" cstate="print"/>
                     <a:stretch>
                       <a:fillRect/>
                     </a:stretch>
@@ -3995,7 +3995,7 @@
         <w:rPr>
           <w:sz w:val="24"/>
         </w:rPr>
-        <w:t xml:space="preserve">表4证实：统一尺度后达峰期斜率点估计（1.8521）低于初期，联合交互项（-0.9183，按州聚类bootstrap 95%CI为[-2.33, 0.59]）包含零点且未达统计显著；结合达峰期总体样本中基准偏移项占总损失88.9%的分解证据，表明达峰期预测误差居高不下主要源于跨期平稳性假设失效，而非病例规模项丧失边际贡献。</w:t>
+        <w:t xml:space="preserve">表4显示：统一尺度后达峰期斜率点估计（1.8521）低于初期，联合交互项（-0.9183，按州聚类bootstrap 95%CI为[-2.33, 0.59]）包含零点且未达统计显著；结合达峰期总体样本中基准偏移项占总损失88.9%的分解证据，表明达峰期预测误差居高不下主要源于跨期平稳性假设失效，而非病例规模项丧失边际贡献。</w:t>
       </w:r>
     </w:p>
     <w:p>
@@ -4020,7 +4020,7 @@
                     <pic:cNvPicPr/>
                   </pic:nvPicPr>
                   <pic:blipFill>
-                    <a:blip r:embed="R277ef22e18c049e6" cstate="print"/>
+                    <a:blip r:embed="Rbe4ad8f2b2344279" cstate="print"/>
                     <a:stretch>
                       <a:fillRect/>
                     </a:stretch>
@@ -4139,7 +4139,7 @@
         <w:rPr>
           <w:sz w:val="24"/>
         </w:rPr>
-        <w:t xml:space="preserve">本文研究为理解传染病监测中病例规模的推断价值提供了清晰的分析视角。既有前沿文献基于有效再生数推导出了Fisher信息下界随规模线性增长的标度律[9,10]，但该极限主要是针对测量当期瞬时参数R_t成立的。本文分析表明：一旦推断目标切换为消除单周共同波动的跨期基础水平R̄，共同环境随机性v_R构成了单期横截面内仅凭病例聚合无法消除的方差成分；由此导出的交叉点m_×，在数理结构上恰对应单期信度比等于0.5的对称位置[22,23]。</w:t>
+        <w:t xml:space="preserve">本文研究为理解传染病监测中病例规模的推断价值提供了清晰的分析视角。既有前沿文献基于有效再生数推导出了Fisher信息下界随规模线性增长的标度律[9,10]，但该极限主要是针对测量当期瞬时参数R_t成立的。本文分析表明：一旦推断目标切换为消除单周共同波动的跨期基础水平R̄，共同环境随机性v_R构成了单期横截面内仅凭病例聚合无法消除的方差成分；由此导出的交叉点m_×，在方差分解的代数形式上恰对应单期信度比等于0.5的对称位置[22,23]。</w:t>
       </w:r>
     </w:p>
     <w:p>
@@ -4250,7 +4250,7 @@
         <w:rPr>
           <w:sz w:val="21"/>
         </w:rPr>
-        <w:t xml:space="preserve">[1] Lloyd-Smith J O, Schreiber S J, Kopp P E, et al. Superspreading and the effect of individual variation on disease emergence. Nature, 2005, 438(7066): 355-359. DOI: 10.1038/nature04153.</w:t>
+        <w:t xml:space="preserve">[1] Lloyd-Smith James O, Schreiber Sebastian J, Kopp P Ekkehard, et al. Superspreading and the effect of individual variation on disease emergence. Nature, 2005, 438(7066): 355-359. DOI: 10.1038/nature04153.</w:t>
       </w:r>
     </w:p>
     <w:p>
@@ -4261,7 +4261,7 @@
         <w:rPr>
           <w:sz w:val="21"/>
         </w:rPr>
-        <w:t xml:space="preserve">[2] Endo A, Abbott S, Kucharski A J, et al. Estimating the overdispersion in COVID-19 transmission using outbreak sizes outside China. Wellcome Open Research, 2020, 5: 67. DOI: 10.12688/wellcomeopenres.15842.3.</w:t>
+        <w:t xml:space="preserve">[2] Endo Akira, Abbott Sam, Kucharski Adam J, et al. Estimating the overdispersion in COVID-19 transmission using outbreak sizes outside China. Wellcome Open Research, 2020, 5: 67. DOI: 10.12688/wellcomeopenres.15842.3.</w:t>
       </w:r>
     </w:p>
     <w:p>
@@ -4272,7 +4272,7 @@
         <w:rPr>
           <w:sz w:val="21"/>
         </w:rPr>
-        <w:t xml:space="preserve">[3] Kucharski A J, Russell T W, Diamond C, et al. Early dynamics of transmission and control of COVID-19: a mathematical modelling study. The Lancet Infectious Diseases, 2020, 20(5): 553-560. DOI: 10.1016/S1473-3099(20)30144-4.</w:t>
+        <w:t xml:space="preserve">[3] Kucharski Adam J, Russell Timothy W, Diamond Charlie, et al. Early dynamics of transmission and control of COVID-19: a mathematical modelling study. The Lancet Infectious Diseases, 2020, 20(5): 553-558. DOI: 10.1016/S1473-3099(20)30144-4.</w:t>
       </w:r>
     </w:p>
     <w:p>
@@ -4283,7 +4283,7 @@
         <w:rPr>
           <w:sz w:val="21"/>
         </w:rPr>
-        <w:t xml:space="preserve">[4] Wallinga J, Teunis P. Different epidemic curves for severe acute respiratory syndrome reveal similar impacts of control measures. American Journal of Epidemiology, 2004, 160(6): 509-516. DOI: 10.1093/aje/kwh255.</w:t>
+        <w:t xml:space="preserve">[4] Wallinga Jacco, Teunis Peter. Different epidemic curves for severe acute respiratory syndrome reveal similar impacts of control measures. American Journal of Epidemiology, 2004, 160(6): 509-516. DOI: 10.1093/aje/kwh255.</w:t>
       </w:r>
     </w:p>
     <w:p>
@@ -4294,7 +4294,7 @@
         <w:rPr>
           <w:sz w:val="21"/>
         </w:rPr>
-        <w:t xml:space="preserve">[5] Fraser C. Estimating individual and household reproduction numbers in an emerging epidemic. PLOS ONE, 2007, 2(8): e758. DOI: 10.1371/journal.pone.0000758.</w:t>
+        <w:t xml:space="preserve">[5] Fraser Christophe. Estimating individual and household reproduction numbers in an emerging epidemic. PLOS ONE, 2007, 2(8): e758. DOI: 10.1371/journal.pone.0000758.</w:t>
       </w:r>
     </w:p>
     <w:p>
@@ -4305,7 +4305,7 @@
         <w:rPr>
           <w:sz w:val="21"/>
         </w:rPr>
-        <w:t xml:space="preserve">[6] Cori A, Ferguson N M, Fraser C, et al. A new framework and software to estimate time-varying reproduction numbers during epidemics. American Journal of Epidemiology, 2013, 178(9): 1505-1512. DOI: 10.1093/aje/kwt133.</w:t>
+        <w:t xml:space="preserve">[6] Cori Anne, Ferguson Neil M, Fraser Christophe, et al. A new framework and software to estimate time-varying reproduction numbers during epidemics. American Journal of Epidemiology, 2013, 178(9): 1505-1512. DOI: 10.1093/aje/kwt133.</w:t>
       </w:r>
     </w:p>
     <w:p>
@@ -4316,7 +4316,7 @@
         <w:rPr>
           <w:sz w:val="21"/>
         </w:rPr>
-        <w:t xml:space="preserve">[7] Thompson R N, Stockwin J E, van Gaalen R D, et al. Improved inference of time-varying reproduction numbers during infectious disease outbreaks. Epidemics, 2019, 29: 100356. DOI: 10.1016/j.epidem.2019.100356.</w:t>
+        <w:t xml:space="preserve">[7] Thompson Robin N, Stockwin J E, van Gaalen R D, et al. Improved inference of time-varying reproduction numbers during infectious disease outbreaks. Epidemics, 2019, 29: 100356. DOI: 10.1016/j.epidem.2019.100356.</w:t>
       </w:r>
     </w:p>
     <w:p>
@@ -4327,7 +4327,7 @@
         <w:rPr>
           <w:sz w:val="21"/>
         </w:rPr>
-        <w:t xml:space="preserve">[8] Gostic K M, McGough L, Baskerville E B, et al. Practical considerations for measuring the effective reproductive number, Rt. PLOS Computational Biology, 2020, 16(12): e1008409. DOI: 10.1371/journal.pcbi.1008409.</w:t>
+        <w:t xml:space="preserve">[8] Gostic Katelyn M, McGough Lauren, Baskerville Edward B, et al. Practical considerations for measuring the effective reproductive number, $R_t$. PLOS Computational Biology, 2020, 16(12): e1008409. DOI: 10.1371/journal.pcbi.1008409.</w:t>
       </w:r>
     </w:p>
     <w:p>
@@ -4338,7 +4338,7 @@
         <w:rPr>
           <w:sz w:val="21"/>
         </w:rPr>
-        <w:t xml:space="preserve">[9] Parag K V, Donnelly C A. Fundamental limits on inferring epidemic resurgence in real time using effective reproduction numbers. PLOS Computational Biology, 2022, 18(4): e1010004. DOI: 10.1371/journal.pcbi.1010004.</w:t>
+        <w:t xml:space="preserve">[9] Parag Kris V, Donnelly Christl A. Fundamental limits on inferring epidemic resurgence in real time using effective reproduction numbers. PLOS Computational Biology, 2022, 18(4): e1010004. DOI: 10.1371/journal.pcbi.1010004.</w:t>
       </w:r>
     </w:p>
     <w:p>
@@ -4349,7 +4349,7 @@
         <w:rPr>
           <w:sz w:val="21"/>
         </w:rPr>
-        <w:t xml:space="preserve">[10] Parag K V, Donnelly C A, Zarebski A E. Quantifying the information in noisy epidemic curves. Nature Computational Science, 2022, 2(9): 584-594. DOI: 10.1038/s43588-022-00313-1.</w:t>
+        <w:t xml:space="preserve">[10] Parag Kris V, Donnelly Christl A, Zarebski Alexander E. Quantifying the information in noisy epidemic curves. Nature Computational Science, 2022, 2(9): 584-594. DOI: 10.1038/s43588-022-00313-1.</w:t>
       </w:r>
     </w:p>
     <w:p>
@@ -4360,7 +4360,7 @@
         <w:rPr>
           <w:sz w:val="21"/>
         </w:rPr>
-        <w:t xml:space="preserve">[11] Parag K V, Lambert B, Donnelly C A, Beregi S. Asymmetric limits on timely interventions from noisy epidemic data. Communications Physics, 2025, 8: 450. DOI: 10.1038/s42005-025-02358-w.</w:t>
+        <w:t xml:space="preserve">[11] Parag Kris V, Lambert Ben, Donnelly Christl A, et al. Asymmetric limits on timely interventions from noisy epidemic data. Communications Physics, 2025, 8: 450. DOI: 10.1038/s42005-025-02358-w.</w:t>
       </w:r>
     </w:p>
     <w:p>
@@ -4371,7 +4371,7 @@
         <w:rPr>
           <w:sz w:val="21"/>
         </w:rPr>
-        <w:t xml:space="preserve">[12] Bosse N I, Abbott S, Cori A, van Leeuwen E, Bracher J, Funk S. Scoring epidemiological forecasts on transformed scales. PLOS Computational Biology, 2023, 19(8): e1011393. DOI: 10.1371/journal.pcbi.1011393.</w:t>
+        <w:t xml:space="preserve">[12] Bosse Nikos I, Abbott Sam, Cori Anne, et al. Scoring epidemiological forecasts on transformed scales. PLOS Computational Biology, 2023, 19(8): e1011393. DOI: 10.1371/journal.pcbi.1011393.</w:t>
       </w:r>
     </w:p>
     <w:p>
@@ -4382,7 +4382,7 @@
         <w:rPr>
           <w:sz w:val="21"/>
         </w:rPr>
-        <w:t xml:space="preserve">[13] Bracher J, Held L. A marginal moment matching approach for fitting endemic-epidemic models to underreported disease surveillance counts. Biometrics, 2021, 77(4): 1348-1359. DOI: 10.1111/biom.13384.</w:t>
+        <w:t xml:space="preserve">[13] Bracher Johannes, Held Leonhard. A marginal moment matching approach for fitting endemic-epidemic models to underreported disease surveillance counts. Biometrics, 2021, 77(4): 1202-1214. DOI: 10.1111/biom.13371.</w:t>
       </w:r>
     </w:p>
     <w:p>
@@ -4393,7 +4393,7 @@
         <w:rPr>
           <w:sz w:val="21"/>
         </w:rPr>
-        <w:t xml:space="preserve">[14] Bhatt S, Ferguson N, Flaxman S, et al. Semi-mechanistic Bayesian modeling of COVID-19 with renewal processes. Journal of the Royal Statistical Society Series A: Statistics in Society, 2023, 186(4): 601-624. DOI: 10.1093/jrsssa/qnad001.</w:t>
+        <w:t xml:space="preserve">[14] Bhatt Samir, Ferguson Neil, Flaxman Seth, et al. Semi-mechanistic Bayesian modeling of COVID-19 with renewal processes. Journal of the Royal Statistical Society Series A: Statistics in Society, 2023, 186(4): 601-615. DOI: 10.1093/jrsssa/qnad030.</w:t>
       </w:r>
     </w:p>
     <w:p>
@@ -4404,7 +4404,7 @@
         <w:rPr>
           <w:sz w:val="21"/>
         </w:rPr>
-        <w:t xml:space="preserve">[15] Steyn N, Parag K V, Thompson R N. A primer on inference and prediction with epidemic renewal models and sequential Monte Carlo. Statistics in Medicine, 2025, 44(3): e70204. DOI: 10.1002/sim.70204.</w:t>
+        <w:t xml:space="preserve">[15] Steyn Nicholas, Parag Kris V, Thompson Robin N, et al. A primer on inference and prediction with epidemic renewal models and sequential Monte Carlo. Statistics in Medicine, 2025, 44(18-19): e70204. DOI: 10.1002/sim.70204.</w:t>
       </w:r>
     </w:p>
     <w:p>
@@ -4415,7 +4415,7 @@
         <w:rPr>
           <w:sz w:val="21"/>
         </w:rPr>
-        <w:t xml:space="preserve">[16] Rasmussen D A, Ratmann O, Koelle K. Inference for nonlinear epidemiological models using genealogies and time series. PLOS Computational Biology, 2011, 7(8): e1002136. DOI: 10.1371/journal.pcbi.1002136.</w:t>
+        <w:t xml:space="preserve">[16] Rasmussen David A, Ratmann Oliver, Koelle Katia. Inference for nonlinear epidemiological models using genealogies and time series. PLOS Computational Biology, 2011, 7(8): e1002136. DOI: 10.1371/journal.pcbi.1002136.</w:t>
       </w:r>
     </w:p>
     <w:p>
@@ -4426,7 +4426,7 @@
         <w:rPr>
           <w:sz w:val="21"/>
         </w:rPr>
-        <w:t xml:space="preserve">[17] Aber S, Di Q, Dalziel B D. Time-series modeling of epidemics in complex populations: Detecting changes in incidence volatility over time. PLOS Computational Biology, 2025, 21(2): e1012882. DOI: 10.1371/journal.pcbi.1012882.</w:t>
+        <w:t xml:space="preserve">[17] Aber Rachael, Di Yanming, Dalziel Benjamin D. Time-series modeling of epidemics in complex populations: Detecting changes in incidence volatility over time. PLOS Computational Biology, 2025, 21(7): e1012882. DOI: 10.1371/journal.pcbi.1012882.</w:t>
       </w:r>
     </w:p>
     <w:p>
@@ -4437,7 +4437,7 @@
         <w:rPr>
           <w:sz w:val="21"/>
         </w:rPr>
-        <w:t xml:space="preserve">[18] Bretó C, He D, Ionides E L, King A A. Time series analysis via mechanistic models: inference on imperfectly observed populations. The Annals of Applied Statistics, 2009, 3(1): 319-348. DOI: 10.1214/08-AOAS201.</w:t>
+        <w:t xml:space="preserve">[18] Bret\'o Carles, He Daihai, Ionides Edward L, et al. Time series analysis via mechanistic models. The Annals of Applied Statistics, 2009, 3(1): 319-348. DOI: 10.1214/08-AOAS201.</w:t>
       </w:r>
     </w:p>
     <w:p>
@@ -4448,7 +4448,7 @@
         <w:rPr>
           <w:sz w:val="21"/>
         </w:rPr>
-        <w:t xml:space="preserve">[19] Dalziel B D, Kissler S, Gog J R, et al. Urbanization and the geography of influenza in the United States. Science, 2018, 362(6410): 75-79. DOI: 10.1126/science.aat6030.</w:t>
+        <w:t xml:space="preserve">[19] Dalziel Benjamin D, Kissler Stephen, Gog Julia R, et al. Urbanization and humidity shape the intensity of influenza epidemics in U.S. cities. Science, 2018, 362(6410): 75-79. DOI: 10.1126/science.aat6030.</w:t>
       </w:r>
     </w:p>
     <w:p>
@@ -4459,7 +4459,7 @@
         <w:rPr>
           <w:sz w:val="21"/>
         </w:rPr>
-        <w:t xml:space="preserve">[20] Lipsitch M, Swerdlow D L, Finelli L. Enhancing the value of public health surveillance: simple models for surveillance data. PLOS Medicine, 2015, 12(7): e1001844. DOI: 10.1371/journal.pmed.1001844.</w:t>
+        <w:t xml:space="preserve">[20] Althouse Benjamin M, Scarpino Samuel V, Meyers Lauren Ancel, et al. Enhancing disease surveillance with novel data streams: challenges and opportunities. EPJ Data Science, 2015, 4: 17. DOI: 10.1140/epjds/s13688-015-0054-0.</w:t>
       </w:r>
     </w:p>
     <w:p>
@@ -4470,7 +4470,7 @@
         <w:rPr>
           <w:sz w:val="21"/>
         </w:rPr>
-        <w:t xml:space="preserve">[21] Nouvellet P, Cori A, Garske T, et al. A simple approach to measure controllability of infectious disease outbreaks. Epidemics, 2018, 22: 29-38. DOI: 10.1016/j.epidem.2017.02.012.</w:t>
+        <w:t xml:space="preserve">[21] Nouvellet Pierre, Cori Anne, Garske Tini, et al. A simple approach to measure transmissibility and forecast incidence. Epidemics, 2018, 22: 29-35. DOI: 10.1016/j.epidem.2017.02.012.</w:t>
       </w:r>
     </w:p>
     <w:p>
@@ -4481,7 +4481,7 @@
         <w:rPr>
           <w:sz w:val="21"/>
         </w:rPr>
-        <w:t xml:space="preserve">[22] Fuller W A. Measurement Error Models. New York: John Wiley &amp; Sons, 1987. DOI: 10.1002/9780470316665.</w:t>
+        <w:t xml:space="preserve">[22] Fuller Wayne A. Measurement Error Models. New York: John Wiley \&amp; Sons, 1987. DOI: 10.1002/9780470316665.</w:t>
       </w:r>
     </w:p>
     <w:p>
@@ -4492,7 +4492,7 @@
         <w:rPr>
           <w:sz w:val="21"/>
         </w:rPr>
-        <w:t xml:space="preserve">[23] Carroll R J, Ruppert D, Stefanski L A, Crainiceanu C M. Measurement Error in Nonlinear Models: A Modern Approach. 2nd ed. Boca Raton: Chapman &amp; Hall/CRC, 2006. DOI: 10.1201/9781420010138.</w:t>
+        <w:t xml:space="preserve">[23] Carroll Raymond J, Ruppert David, Stefanski Leonard A, et al. Measurement Error in Nonlinear Models: A Modern Perspective. 2nd ed. Boca Raton: Chapman \&amp; Hall/CRC, 2006. DOI: 10.1201/9781420010138.</w:t>
       </w:r>
     </w:p>
     <w:p>
@@ -4503,7 +4503,7 @@
         <w:rPr>
           <w:sz w:val="21"/>
         </w:rPr>
-        <w:t xml:space="preserve">[24] Armstrong B G. Effect of measurement error on epidemiological studies of environmental and nutritional risks. Annals of Epidemiology, 1998, 8(6): 381-387. DOI: 10.1016/S1047-2797(97)00234-8.</w:t>
+        <w:t xml:space="preserve">[24] Armstrong Ben G. Effect of measurement error on epidemiological studies of environmental and occupational exposures. Occupational and Environmental Medicine, 1998, 55(10): 651-656. DOI: 10.1136/oem.55.10.651.</w:t>
       </w:r>
     </w:p>
     <w:p>
@@ -4514,7 +4514,7 @@
         <w:rPr>
           <w:sz w:val="21"/>
         </w:rPr>
-        <w:t xml:space="preserve">[25] Verbeke G, Molenberghs G. Linear Mixed Models for Longitudinal Data. New York: Springer, 2000. DOI: 10.1007/978-1-4419-0300-6.</w:t>
+        <w:t xml:space="preserve">[25] Verbeke Geert, Molenberghs Geert. Linear Mixed Models for Longitudinal Data. New York: Springer, 2000. DOI: 10.1007/978-1-4419-0300-6.</w:t>
       </w:r>
     </w:p>
     <w:p>
@@ -4525,7 +4525,7 @@
         <w:rPr>
           <w:sz w:val="21"/>
         </w:rPr>
-        <w:t xml:space="preserve">[26] Reich N G, McGowan C J, Yamana T K, et al. Accuracy of real-time multi-model ensemble forecasts for seasonal influenza in the U.S. PLOS Computational Biology, 2019, 15(11): e1007486. DOI: 10.1371/journal.pcbi.1007486.</w:t>
+        <w:t xml:space="preserve">[26] Reich Nicholas G, McGowan Craig J, Yamana Teresa K, et al. Accuracy of real-time multi-model ensemble forecasts for seasonal influenza in the U.S.. PLOS Computational Biology, 2019, 15(11): e1007486. DOI: 10.1371/journal.pcbi.1007486.</w:t>
       </w:r>
     </w:p>
     <w:p>
@@ -4536,7 +4536,7 @@
         <w:rPr>
           <w:sz w:val="21"/>
         </w:rPr>
-        <w:t xml:space="preserve">[27] Cramer E Y, Ray E L, Lopez V K, et al. Evaluation of individual and ensemble probabilistic forecasts of COVID-19 mortality in the United States. Proceedings of the National Academy of Sciences, 2022, 119(15): e2113561119. DOI: 10.1073/pnas.2113561119.</w:t>
+        <w:t xml:space="preserve">[27] Cramer Estee Y, Ray Evan L, Lopez Velma K, et al. Evaluation of individual and ensemble probabilistic forecasts of COVID-19 mortality in the United States. Proceedings of the National Academy of Sciences, 2022, 119(15): e2113561119. DOI: 10.1073/pnas.2113561119.</w:t>
       </w:r>
     </w:p>
     <w:p>
@@ -4547,7 +4547,7 @@
         <w:rPr>
           <w:sz w:val="21"/>
         </w:rPr>
-        <w:t xml:space="preserve">[28] Ray E L, Brooks L C, Bien J, et al. Comparing trained and untrained probabilistic ensemble forecasts of COVID-19 cases and deaths in the United States. International Journal of Forecasting, 2023, 39(3): 1366-1383. DOI: 10.1016/j.ijforecast.2022.06.005.</w:t>
+        <w:t xml:space="preserve">[28] Ray Evan L, Brooks Logan C, Bien Jacob, et al. Comparing trained and untrained probabilistic ensemble forecasts of COVID-19 cases and deaths in the United States. International Journal of Forecasting, 2023, 39(3): 1366-1383. DOI: 10.1016/j.ijforecast.2022.06.005.</w:t>
       </w:r>
     </w:p>
     <w:p>
@@ -4558,7 +4558,7 @@
         <w:rPr>
           <w:sz w:val="21"/>
         </w:rPr>
-        <w:t xml:space="preserve">[29] Biggerstaff M, Alper D, Dredze M, et al. Results from the second open CDC challenge to predict the 2014-2015 influenza season. Epidemics, 2018, 24: 26-37. DOI: 10.1016/j.epidem.2018.02.003.</w:t>
+        <w:t xml:space="preserve">[29] Biggerstaff Matthew, Johansson Michael A, Alper David, et al. Results from the second year of a collaborative effort to forecast influenza seasons in the United States. Epidemics, 2018, 24: 26-33. DOI: 10.1016/j.epidem.2018.02.003.</w:t>
       </w:r>
     </w:p>
     <w:p>
@@ -4569,7 +4569,7 @@
         <w:rPr>
           <w:sz w:val="21"/>
         </w:rPr>
-        <w:t xml:space="preserve">[30] Jhung M A, Powell T, Dhara R, et al. Epidemiology of influenza-associated hospitalizations in the United States, 1993-2008. Clinical Infectious Diseases, 2012, 54(11): 1555-1562. DOI: 10.1093/cid/cis253.</w:t>
+        <w:t xml:space="preserve">[30] Zhou Hong, Thompson William W, Viboud Cecile G, et al. Hospitalizations associated with influenza and respiratory syncytial virus in the United States, 1993--2008. Clinical Infectious Diseases, 2012, 54(10): 1427-1436. DOI: 10.1093/cid/cis211.</w:t>
       </w:r>
     </w:p>
     <w:p>
@@ -4580,7 +4580,7 @@
         <w:rPr>
           <w:sz w:val="21"/>
         </w:rPr>
-        <w:t xml:space="preserve">[31] Stoner O, Economou T, Drummond G. Hierarchical spatio-temporal modeling for surveillance data with reporting delays and incomplete observation. Biometrics, 2023, 79(3): 2296-2308. DOI: 10.1111/biom.13788.</w:t>
+        <w:t xml:space="preserve">[31] Stoner Oliver, Economou Theo, Drummond Marques da Silva Gabriela. A hierarchical framework for correcting under-reporting in count data. Journal of the American Statistical Association, 2019, 114(528): 1481-1492. DOI: 10.1080/01621459.2019.1573732.</w:t>
       </w:r>
     </w:p>
     <w:p>
@@ -4591,7 +4591,7 @@
         <w:rPr>
           <w:sz w:val="21"/>
         </w:rPr>
-        <w:t xml:space="preserve">[32] Azmon A, Faes C, Hens N. Estimating the reproduction number from incompletely observed outbreaks: real-time monitoring and reporting delay adjustment. Epidemics, 2014, 9: 30-38. DOI: 10.1016/j.epidem.2014.09.006.</w:t>
+        <w:t xml:space="preserve">[32] Azmon A, Faes C, Hens N. On the estimation of the reproduction number based on misreported epidemic data. Statistics in Medicine, 2014, 33(7): 1176-1192. DOI: 10.1002/sim.6015.</w:t>
       </w:r>
     </w:p>
     <w:p>
@@ -4602,7 +4602,7 @@
         <w:rPr>
           <w:sz w:val="21"/>
         </w:rPr>
-        <w:t xml:space="preserve">[33] Rohani P, Keeling M J, Grenfell B T. The interplay between environmental and demographic stochasticity in infectious disease dynamics. Science, 2002, 297(5583): 1010-1012. DOI: 10.1126/science.1073801.</w:t>
+        <w:t xml:space="preserve">[33] Rohani Pejman, Keeling Matthew J, Grenfell Bryan T. The interplay between determinism and stochasticity in childhood diseases. The American Naturalist, 2002, 159(5): 469-481. DOI: 10.1086/339467.</w:t>
       </w:r>
     </w:p>
     <w:p>
@@ -4613,11 +4613,11 @@
         <w:rPr>
           <w:sz w:val="21"/>
         </w:rPr>
-        <w:t xml:space="preserve">[34] Centers for Disease Control and Prevention. Weekly Hospital Respiratory Data (HRD) Metrics by Jurisdiction, National Healthcare Safety Network (NHSN). CDC open-data catalogue record ua7e-t2fy, 2026. https://data.cdc.gov/d/ua7e-t2fy, accessed 2026-09-05. SHA-256: e48c2ea92e0beb552a6510b7b0c2fe7a7c9ea911cd27880169298c34de20c330.</w:t>
+        <w:t xml:space="preserve">[34] Centers for Disease Control and Prevention. Weekly Hospital Respiratory Data (HRD) Metrics by Jurisdiction, National Healthcare Safety Network (NHSN). https://data.cdc.gov/d/ua7e-t2fy, 2026. CDC open-data catalogue record ua7e-t2fy. Accessed 2026-09-05</w:t>
       </w:r>
     </w:p>
     <w:sectPr>
-      <w:footerReference w:type="default" r:id="R17507cb385534bfc"/>
+      <w:footerReference w:type="default" r:id="R14d3b96a4dae4539"/>
       <w:pgSz w:w="11906" w:h="16838"/>
       <w:pgMar w:top="1440" w:right="1803" w:bottom="1440" w:left="1803" w:header="850" w:footer="992"/>
       <w:docGrid w:type="default"/>

</xml_diff>

<commit_message>
Address review round 8: reconcile theory-empirical scale, sanitize DOCX typography, full number trace
- Reconcile line 528 theoretical vs empirical variance scale and state Tokars-derived rho (W-R8-1)
- Align Remark 5 wording to illustrative scenario (W-R8-1)
- Sanitize LaTeX typography and escapes in build_docx.py reference generator (W-R8-2)
- Disentangle forecasting plateau citations in DOCX P15 to mirror LaTeX line 66 (W-R8-3)
- Make build_docx.py portable with relative batch path (W-R8-5)
- Implement full 169-number trace and 34-DOI parity in check_paper_numbers.py (W-R8-4)
- Compact bibliography to preserve 28-page layout in main.pdf
</commit_message>
<xml_diff>
--- a/paper/main_docx.docx
+++ b/paper/main_docx.docx
@@ -196,7 +196,7 @@
         <w:rPr>
           <w:sz w:val="24"/>
         </w:rPr>
-        <w:t xml:space="preserve">第五，大规模真实监测与前瞻预测评估实践。新型数据流拓展与美国CDC FluSight挑战赛等多模型集成实践表明[20,26,27,28,29,30]，前瞻预测精度的提升迅速呈现收益递减平台，集合模型的误差往往受制于超预期的季节性漂移而非单个辖区的样本规模；相对均方误差等评分规则展现出有效平衡不同发病规模量级的稳健优势[12]。</w:t>
+        <w:t xml:space="preserve">第五，大规模真实监测与前瞻预测评估实践。从新型数据流拓展[20]到美国CDC FluSight挑战赛等多模型集成实践[26,29]，前瞻预测精度的提升迅速呈现收益递减平台，集合模型的误差往往受制于超预期的季节性漂移而非单个辖区的样本规模[27,28]；相对均方误差等评分规则展现出有效平衡不同发病规模量级的稳健优势[12]。而在历史住院基准方面，相关基础监测分析提供了关键的流行病学背景[30]。</w:t>
       </w:r>
     </w:p>
     <w:p>
@@ -2362,7 +2362,7 @@
                     <pic:cNvPicPr/>
                   </pic:nvPicPr>
                   <pic:blipFill>
-                    <a:blip r:embed="Rc4534a9216664325" cstate="print"/>
+                    <a:blip r:embed="Rcad9c09d70a244a4" cstate="print"/>
                     <a:stretch>
                       <a:fillRect/>
                     </a:stretch>
@@ -2443,7 +2443,7 @@
                     <pic:cNvPicPr/>
                   </pic:nvPicPr>
                   <pic:blipFill>
-                    <a:blip r:embed="Rf5157cda7fbd45b4" cstate="print"/>
+                    <a:blip r:embed="R4fbb98766e4c464e" cstate="print"/>
                     <a:stretch>
                       <a:fillRect/>
                     </a:stretch>
@@ -2524,7 +2524,7 @@
                     <pic:cNvPicPr/>
                   </pic:nvPicPr>
                   <pic:blipFill>
-                    <a:blip r:embed="Rbc5957c425084ea3" cstate="print"/>
+                    <a:blip r:embed="R7ae272e63d8d4221" cstate="print"/>
                     <a:stretch>
                       <a:fillRect/>
                     </a:stretch>
@@ -4020,7 +4020,7 @@
                     <pic:cNvPicPr/>
                   </pic:nvPicPr>
                   <pic:blipFill>
-                    <a:blip r:embed="Rbe4ad8f2b2344279" cstate="print"/>
+                    <a:blip r:embed="R48800087633b423e" cstate="print"/>
                     <a:stretch>
                       <a:fillRect/>
                     </a:stretch>
@@ -4076,7 +4076,7 @@
         <w:rPr>
           <w:sz w:val="24"/>
         </w:rPr>
-        <w:t xml:space="preserve">以滞后3–5周输入核为工具变量开展2SLS回归：汇集样本中第一阶段稳健F=312.9，第二阶段差值(b_iv - b_ols)=1.3921，10,000次聚类bootstrap 95%CI为[0.43, 2.41]（bootstrap单侧比例0.0014，排除零点），表明汇集样本下2SLS估计斜率高于OLS。分季独立检验中，各季节第一阶段稳健F均在75以上（强工具），b_iv均显著为正（2022–23季3.2787, 2023–24季2.1867, 2024–25季3.6131），差值在2024–25季表现为临界为正（[0.01, 3.47]）。鉴于排除限制难以在理论上绝对保证，该对照定位为说明变量误差不改变规模效应正向存在的稳健性对照。</w:t>
+        <w:t xml:space="preserve">以滞后3–5周输入核为工具变量开展2SLS回归：汇集样本中第一阶段稳健F=312.9，第二阶段差值(b_iv - b_ols)=1.3921，10,000次聚类bootstrap 95%CI为[0.43, 2.41]（bootstrap单侧比例0.0014，排除零点），表明汇集样本下2SLS估计斜率高于OLS。分季独立检验中，各季节第一阶段稳健F均在75以上（强工具），b_iv均显著为正（2022–23季3.2787, 2023–24季2.1867, 2024–25季3.6131），差值在2024–25季表现为临界为正（[0.01, 3.47]）。鉴于排除限制难以在理论上绝对保证，该对照定位为说明变量误差不改变规模效应正向存在的稳健性对照。在唯象示例参数设定下导出理论交叉点约 22–59 例（m_×≈21.6–59.4，基于Zhou等[30]住院负担与Tokars等[34]侵袭率折算捕获率）；未归一化绝对方差水平上规模无关项与相关项（约0.28与6.3）高于纯理论设定，但比值与理论交叉点数量级相容，重在比值形态一致性。</w:t>
       </w:r>
     </w:p>
     <w:p>
@@ -4226,7 +4226,7 @@
         <w:rPr>
           <w:sz w:val="24"/>
         </w:rPr>
-        <w:t xml:space="preserve">本文实证所用的全美各州周度流感住院监测数据来源于美国疾病控制与预防中心国家医疗保健安全网（CDC NHSN）公开数据库[34]（目录记录标识符ua7e-t2fy），数据集访问日期为2026年9月5日，分析所用交付CSV数据文件的SHA-256校验和为：e48c2ea92e0beb552a6510b7b0c2fe7a7c9ea911cd27880169298c34de20c330。全部代码与固化数据开源共享于：https://github.com/wangchi2068/case-count-inference-bottleneck。</w:t>
+        <w:t xml:space="preserve">本文实证所用的全美各州周度流感住院监测数据来源于美国疾病控制与预防中心国家医疗保健安全网（CDC NHSN）公开数据库[35]（目录记录标识符ua7e-t2fy），数据集访问日期为2026年9月5日，分析所用交付CSV数据文件的SHA-256校验和为：e48c2ea92e0beb552a6510b7b0c2fe7a7c9ea911cd27880169298c34de20c330。全部代码与固化数据开源共享于：https://github.com/wangchi2068/case-count-inference-bottleneck。</w:t>
       </w:r>
     </w:p>
     <w:p>
@@ -4327,7 +4327,7 @@
         <w:rPr>
           <w:sz w:val="21"/>
         </w:rPr>
-        <w:t xml:space="preserve">[8] Gostic Katelyn M, McGough Lauren, Baskerville Edward B, et al. Practical considerations for measuring the effective reproductive number, $R_t$. PLOS Computational Biology, 2020, 16(12): e1008409. DOI: 10.1371/journal.pcbi.1008409.</w:t>
+        <w:t xml:space="preserve">[8] Gostic Katelyn M, McGough Lauren, Baskerville Edward B, et al. Practical considerations for measuring the effective reproductive number, Rt. PLOS Computational Biology, 2020, 16(12): e1008409. DOI: 10.1371/journal.pcbi.1008409.</w:t>
       </w:r>
     </w:p>
     <w:p>
@@ -4437,7 +4437,7 @@
         <w:rPr>
           <w:sz w:val="21"/>
         </w:rPr>
-        <w:t xml:space="preserve">[18] Bret\'o Carles, He Daihai, Ionides Edward L, et al. Time series analysis via mechanistic models. The Annals of Applied Statistics, 2009, 3(1): 319-348. DOI: 10.1214/08-AOAS201.</w:t>
+        <w:t xml:space="preserve">[18] Bretó Carles, He Daihai, Ionides Edward L, et al. Time series analysis via mechanistic models. The Annals of Applied Statistics, 2009, 3(1): 319-348. DOI: 10.1214/08-AOAS201.</w:t>
       </w:r>
     </w:p>
     <w:p>
@@ -4481,7 +4481,7 @@
         <w:rPr>
           <w:sz w:val="21"/>
         </w:rPr>
-        <w:t xml:space="preserve">[22] Fuller Wayne A. Measurement Error Models. New York: John Wiley \&amp; Sons, 1987. DOI: 10.1002/9780470316665.</w:t>
+        <w:t xml:space="preserve">[22] Fuller Wayne A. Measurement Error Models. New York: John Wiley &amp; Sons, 1987. DOI: 10.1002/9780470316665.</w:t>
       </w:r>
     </w:p>
     <w:p>
@@ -4492,7 +4492,7 @@
         <w:rPr>
           <w:sz w:val="21"/>
         </w:rPr>
-        <w:t xml:space="preserve">[23] Carroll Raymond J, Ruppert David, Stefanski Leonard A, et al. Measurement Error in Nonlinear Models: A Modern Perspective. 2nd ed. Boca Raton: Chapman \&amp; Hall/CRC, 2006. DOI: 10.1201/9781420010138.</w:t>
+        <w:t xml:space="preserve">[23] Carroll Raymond J, Ruppert David, Stefanski Leonard A, et al. Measurement Error in Nonlinear Models: A Modern Perspective. 2nd ed. Boca Raton: Chapman &amp; Hall/CRC, 2006. DOI: 10.1201/9781420010138.</w:t>
       </w:r>
     </w:p>
     <w:p>
@@ -4569,7 +4569,7 @@
         <w:rPr>
           <w:sz w:val="21"/>
         </w:rPr>
-        <w:t xml:space="preserve">[30] Zhou Hong, Thompson William W, Viboud Cecile G, et al. Hospitalizations associated with influenza and respiratory syncytial virus in the United States, 1993--2008. Clinical Infectious Diseases, 2012, 54(10): 1427-1436. DOI: 10.1093/cid/cis211.</w:t>
+        <w:t xml:space="preserve">[30] Zhou Hong, Thompson William W, Viboud Cécile G, et al. Hospitalizations associated with influenza and respiratory syncytial virus in the United States, 1993-2008. Clinical Infectious Diseases, 2012, 54(10): 1427-1436. DOI: 10.1093/cid/cis211.</w:t>
       </w:r>
     </w:p>
     <w:p>
@@ -4613,11 +4613,22 @@
         <w:rPr>
           <w:sz w:val="21"/>
         </w:rPr>
-        <w:t xml:space="preserve">[34] Centers for Disease Control and Prevention. Weekly Hospital Respiratory Data (HRD) Metrics by Jurisdiction, National Healthcare Safety Network (NHSN). https://data.cdc.gov/d/ua7e-t2fy, 2026. CDC open-data catalogue record ua7e-t2fy. Accessed 2026-09-05</w:t>
+        <w:t xml:space="preserve">[34] Tokars Jerome I, Olsen Sonja J, Reed Carrie. Seasonal incidence of symptomatic influenza in the United States. Clinical Infectious Diseases, 2018, 66(10): 1511-1518. DOI: 10.1093/cid/cix1060.</w:t>
+      </w:r>
+    </w:p>
+    <w:p>
+      <w:pPr>
+        <w:spacing w:after="60"/>
+      </w:pPr>
+      <w:r>
+        <w:rPr>
+          <w:sz w:val="21"/>
+        </w:rPr>
+        <w:t xml:space="preserve">[35] Centers for Disease Control and Prevention. Weekly Hospital Respiratory Data (HRD) Metrics by Jurisdiction, National Healthcare Safety Network (NHSN). https://data.cdc.gov/d/ua7e-t2fy, 2026. CDC open-data catalogue record ua7e-t2fy. Accessed 2026-09-05</w:t>
       </w:r>
     </w:p>
     <w:sectPr>
-      <w:footerReference w:type="default" r:id="R14d3b96a4dae4539"/>
+      <w:footerReference w:type="default" r:id="Rebe59afc232b4d55"/>
       <w:pgSz w:w="11906" w:h="16838"/>
       <w:pgMar w:top="1440" w:right="1803" w:bottom="1440" w:left="1803" w:header="850" w:footer="992"/>
       <w:docGrid w:type="default"/>

</xml_diff>

<commit_message>
Address review round 9: state empirical rho conversion, update theoretical bounds, refine forecast citations
- Show exact rho conversion from Zhou & Tokars (0.0056-0.021) and update m_x (21.3-49.3) and m* (14.6-22.2, 46.1-70.2) (W-R9-1)
- Align forecast drift citations in main.tex and DOCX to dynamic trend shifts (W-R9-4)
- Fix doubled full stop in DOCX reference [26] and order citations in P5 (W-R9-3)
- Expand test suite documentation and trace explicitly derived quantities (W-R9-2)
- Rebuild main.pdf (strictly 28 pages) and main_docx.docx
</commit_message>
<xml_diff>
--- a/paper/main_docx.docx
+++ b/paper/main_docx.docx
@@ -75,7 +75,7 @@
         <w:rPr>
           <w:sz w:val="24"/>
         </w:rPr>
-        <w:t xml:space="preserve">准确识别疫情由平稳或下降转为上升增长，并对随后数周的病例负担作出可靠预测，是现代传染病预警与公共卫生应急响应的核心支柱。在常规统计直觉中，大样本量通常意味着高推断精度，即增加捕获病例数能够持续压制随机计数波动的相对影响。然而，在传染病监测与动力学建模的真实场景下，这一直觉往往遭遇严峻挑战：病原体传播普遍具有高度个体异质性（超传播），导致继发感染数严重过离散[1,2]；监测系统普遍存在不同程度的不完全检测与报告延迟[32,31]；此外，处于同一地理辖区或时间窗口内的宿主群体共同受到气象条件、人群接触模式以及周期性社会流动等环境随机扰动[16,33]。在个体微观超传播、宏观监测漏报与中观共同环境波动交织并存的条件下，“样本量”与“信息量”不能再被简单等同。</w:t>
+        <w:t xml:space="preserve">准确识别疫情由平稳或下降转为上升增长，并对随后数周的病例负担作出可靠预测，是现代传染病预警与公共卫生应急响应的核心支柱。在常规统计直觉中，大样本量通常意味着高推断精度，即增加捕获病例数能够持续压制随机计数波动的相对影响。然而，在传染病监测与动力学建模的真实场景下，这一直觉往往遭遇严峻挑战：病原体传播普遍具有高度个体异质性（超传播），导致继发感染数严重过离散[1,2]；监测系统普遍存在不同程度的不完全检测与报告延迟[31,32]；此外，处于同一地理辖区或时间窗口内的宿主群体共同受到气象条件、人群接触模式以及周期性社会流动等环境随机扰动[16,33]。在个体微观超传播、宏观监测漏报与中观共同环境波动交织并存的条件下，“样本量”与“信息量”不能再被简单等同。</w:t>
       </w:r>
     </w:p>
     <w:p>
@@ -196,7 +196,7 @@
         <w:rPr>
           <w:sz w:val="24"/>
         </w:rPr>
-        <w:t xml:space="preserve">第五，大规模真实监测与前瞻预测评估实践。从新型数据流拓展[20]到美国CDC FluSight挑战赛等多模型集成实践[26,29]，前瞻预测精度的提升迅速呈现收益递减平台，集合模型的误差往往受制于超预期的季节性漂移而非单个辖区的样本规模[27,28]；相对均方误差等评分规则展现出有效平衡不同发病规模量级的稳健优势[12]。而在历史住院基准方面，相关基础监测分析提供了关键的流行病学背景[30]。</w:t>
+        <w:t xml:space="preserve">第五，大规模真实监测与前瞻预测评估实践。从新型数据流拓展[20]到美国CDC FluSight挑战赛等多模型集成实践[26,29]，前瞻预测精度的提升迅速呈现收益递减平台，多模型集合在流行拐点与传播态势突变处面临显著的不确定性跃升[27,28]；相对均方误差等评分规则展现出有效平衡不同发病规模量级的稳健优势[12]。而在历史住院基准方面，相关基础监测分析为折算真实感染住院捕获比例提供了核心流行病学依据[30]。</w:t>
       </w:r>
     </w:p>
     <w:p>
@@ -2362,7 +2362,7 @@
                     <pic:cNvPicPr/>
                   </pic:nvPicPr>
                   <pic:blipFill>
-                    <a:blip r:embed="Rcad9c09d70a244a4" cstate="print"/>
+                    <a:blip r:embed="R564239f8d91b4220" cstate="print"/>
                     <a:stretch>
                       <a:fillRect/>
                     </a:stretch>
@@ -2443,7 +2443,7 @@
                     <pic:cNvPicPr/>
                   </pic:nvPicPr>
                   <pic:blipFill>
-                    <a:blip r:embed="R4fbb98766e4c464e" cstate="print"/>
+                    <a:blip r:embed="R4363c2ae665e491c" cstate="print"/>
                     <a:stretch>
                       <a:fillRect/>
                     </a:stretch>
@@ -2524,7 +2524,7 @@
                     <pic:cNvPicPr/>
                   </pic:nvPicPr>
                   <pic:blipFill>
-                    <a:blip r:embed="R7ae272e63d8d4221" cstate="print"/>
+                    <a:blip r:embed="R8a1146986f694485" cstate="print"/>
                     <a:stretch>
                       <a:fillRect/>
                     </a:stretch>
@@ -4020,7 +4020,7 @@
                     <pic:cNvPicPr/>
                   </pic:nvPicPr>
                   <pic:blipFill>
-                    <a:blip r:embed="R48800087633b423e" cstate="print"/>
+                    <a:blip r:embed="R21e803257563497e" cstate="print"/>
                     <a:stretch>
                       <a:fillRect/>
                     </a:stretch>
@@ -4076,7 +4076,7 @@
         <w:rPr>
           <w:sz w:val="24"/>
         </w:rPr>
-        <w:t xml:space="preserve">以滞后3–5周输入核为工具变量开展2SLS回归：汇集样本中第一阶段稳健F=312.9，第二阶段差值(b_iv - b_ols)=1.3921，10,000次聚类bootstrap 95%CI为[0.43, 2.41]（bootstrap单侧比例0.0014，排除零点），表明汇集样本下2SLS估计斜率高于OLS。分季独立检验中，各季节第一阶段稳健F均在75以上（强工具），b_iv均显著为正（2022–23季3.2787, 2023–24季2.1867, 2024–25季3.6131），差值在2024–25季表现为临界为正（[0.01, 3.47]）。鉴于排除限制难以在理论上绝对保证，该对照定位为说明变量误差不改变规模效应正向存在的稳健性对照。在唯象示例参数设定下导出理论交叉点约 22–59 例（m_×≈21.6–59.4，基于Zhou等[30]住院负担与Tokars等[34]侵袭率折算捕获率）；未归一化绝对方差水平上规模无关项与相关项（约0.28与6.3）高于纯理论设定，但比值与理论交叉点数量级相容，重在比值形态一致性。</w:t>
+        <w:t xml:space="preserve">以滞后3–5周输入核为工具变量开展2SLS回归：汇集样本中第一阶段稳健F=312.9，第二阶段差值(b_iv - b_ols)=1.3921，10,000次聚类bootstrap 95%CI为[0.43, 2.41]（bootstrap单侧比例0.0014，排除零点），表明汇集样本下2SLS估计斜率高于OLS。分季独立检验中，各季节第一阶段稳健F均在75以上（强工具），b_iv均显著为正（2022–23季3.2787, 2023–24季2.1867, 2024–25季3.6131），差值在2024–25季表现为临界为正（[0.01, 3.47]）。鉴于排除限制难以在理论上绝对保证，该对照定位为说明变量误差不改变规模效应正向存在的稳健性对照。在唯象示例参数设定下导出理论交叉点约 21–49 例（m_×≈21.3–49.3，基于Zhou等[30]住院率与Tokars等[34]侵袭率折算捕获率ρ∈[0.0056, 0.021]）；未归一化绝对方差水平上规模无关项与相关项（约0.28与6.3）高于纯理论设定，但比值与理论交叉点数量级相容，重在比值形态一致性。</w:t>
       </w:r>
     </w:p>
     <w:p>
@@ -4525,7 +4525,7 @@
         <w:rPr>
           <w:sz w:val="21"/>
         </w:rPr>
-        <w:t xml:space="preserve">[26] Reich Nicholas G, McGowan Craig J, Yamana Teresa K, et al. Accuracy of real-time multi-model ensemble forecasts for seasonal influenza in the U.S.. PLOS Computational Biology, 2019, 15(11): e1007486. DOI: 10.1371/journal.pcbi.1007486.</w:t>
+        <w:t xml:space="preserve">[26] Reich Nicholas G, McGowan Craig J, Yamana Teresa K, et al. Accuracy of real-time multi-model ensemble forecasts for seasonal influenza in the U.S. PLOS Computational Biology, 2019, 15(11): e1007486. DOI: 10.1371/journal.pcbi.1007486.</w:t>
       </w:r>
     </w:p>
     <w:p>
@@ -4628,7 +4628,7 @@
       </w:r>
     </w:p>
     <w:sectPr>
-      <w:footerReference w:type="default" r:id="Rebe59afc232b4d55"/>
+      <w:footerReference w:type="default" r:id="Rd0f0f06b5d4e4fcb"/>
       <w:pgSz w:w="11906" w:h="16838"/>
       <w:pgMar w:top="1440" w:right="1803" w:bottom="1440" w:left="1803" w:header="850" w:footer="992"/>
       <w:docGrid w:type="default"/>

</xml_diff>

<commit_message>
Address review round 10: finalize editorial precision on forecast bias, rho point estimate, and test comments
- Unify forecast turning-point bias and symptomatic hospitalization label in main.tex line 66 and DOCX P15 (W-R10-3)
- Harmonize illustrative scenario phrasing and Zhou point-estimate derivation at line 528 and DOCX P257 (W-R10-1, W-R10-4)
- Correct test comment labels for rho bounds and empirical Wald size in tests/check_paper_numbers.py (W-R10-2)
- Rebuild main.pdf (strictly 28 pages) and main_docx.docx
</commit_message>
<xml_diff>
--- a/paper/main_docx.docx
+++ b/paper/main_docx.docx
@@ -196,7 +196,7 @@
         <w:rPr>
           <w:sz w:val="24"/>
         </w:rPr>
-        <w:t xml:space="preserve">第五，大规模真实监测与前瞻预测评估实践。从新型数据流拓展[20]到美国CDC FluSight挑战赛等多模型集成实践[26,29]，前瞻预测精度的提升迅速呈现收益递减平台，多模型集合在流行拐点与传播态势突变处面临显著的不确定性跃升[27,28]；相对均方误差等评分规则展现出有效平衡不同发病规模量级的稳健优势[12]。而在历史住院基准方面，相关基础监测分析为折算真实感染住院捕获比例提供了核心流行病学依据[30]。</w:t>
+        <w:t xml:space="preserve">第五，大规模真实监测与前瞻预测评估实践。从新型数据流拓展[20]到美国CDC FluSight挑战赛等多模型集成实践[26,29]，前瞻预测精度的提升迅速呈现收益递减平台，多模型集合在流行拐点与传播态势突变处往往面临显著的预测偏差与区间覆盖不稳定[27,28]；相对均方误差等评分规则展现出有效平衡不同发病规模量级的稳健优势[12]。而在历史住院基准方面，相关基础监测分析为折算每例有症状感染的住院比例提供了核心流行病学依据[30]。</w:t>
       </w:r>
     </w:p>
     <w:p>
@@ -2362,7 +2362,7 @@
                     <pic:cNvPicPr/>
                   </pic:nvPicPr>
                   <pic:blipFill>
-                    <a:blip r:embed="R564239f8d91b4220" cstate="print"/>
+                    <a:blip r:embed="Ra287726f41aa415b" cstate="print"/>
                     <a:stretch>
                       <a:fillRect/>
                     </a:stretch>
@@ -2443,7 +2443,7 @@
                     <pic:cNvPicPr/>
                   </pic:nvPicPr>
                   <pic:blipFill>
-                    <a:blip r:embed="R4363c2ae665e491c" cstate="print"/>
+                    <a:blip r:embed="R534e9799a74b4687" cstate="print"/>
                     <a:stretch>
                       <a:fillRect/>
                     </a:stretch>
@@ -2524,7 +2524,7 @@
                     <pic:cNvPicPr/>
                   </pic:nvPicPr>
                   <pic:blipFill>
-                    <a:blip r:embed="R8a1146986f694485" cstate="print"/>
+                    <a:blip r:embed="R53fc0accac014387" cstate="print"/>
                     <a:stretch>
                       <a:fillRect/>
                     </a:stretch>
@@ -4020,7 +4020,7 @@
                     <pic:cNvPicPr/>
                   </pic:nvPicPr>
                   <pic:blipFill>
-                    <a:blip r:embed="R21e803257563497e" cstate="print"/>
+                    <a:blip r:embed="R728d1a7419d0490f" cstate="print"/>
                     <a:stretch>
                       <a:fillRect/>
                     </a:stretch>
@@ -4076,7 +4076,7 @@
         <w:rPr>
           <w:sz w:val="24"/>
         </w:rPr>
-        <w:t xml:space="preserve">以滞后3–5周输入核为工具变量开展2SLS回归：汇集样本中第一阶段稳健F=312.9，第二阶段差值(b_iv - b_ols)=1.3921，10,000次聚类bootstrap 95%CI为[0.43, 2.41]（bootstrap单侧比例0.0014，排除零点），表明汇集样本下2SLS估计斜率高于OLS。分季独立检验中，各季节第一阶段稳健F均在75以上（强工具），b_iv均显著为正（2022–23季3.2787, 2023–24季2.1867, 2024–25季3.6131），差值在2024–25季表现为临界为正（[0.01, 3.47]）。鉴于排除限制难以在理论上绝对保证，该对照定位为说明变量误差不改变规模效应正向存在的稳健性对照。在唯象示例参数设定下导出理论交叉点约 21–49 例（m_×≈21.3–49.3，基于Zhou等[30]住院率与Tokars等[34]侵袭率折算捕获率ρ∈[0.0056, 0.021]）；未归一化绝对方差水平上规模无关项与相关项（约0.28与6.3）高于纯理论设定，但比值与理论交叉点数量级相容，重在比值形态一致性。</w:t>
+        <w:t xml:space="preserve">以滞后3–5周输入核为工具变量开展2SLS回归：汇集样本中第一阶段稳健F=312.9，第二阶段差值(b_iv - b_ols)=1.3921，10,000次聚类bootstrap 95%CI为[0.43, 2.41]（bootstrap单侧比例0.0014，排除零点），表明汇集样本下2SLS估计斜率高于OLS。分季独立检验中，各季节第一阶段稳健F均在75以上（强工具），b_iv均显著为正（2022–23季3.2787, 2023–24季2.1867, 2024–25季3.6131），差值在2024–25季表现为临界为正（[0.01, 3.47]）。鉴于排除限制难以在理论上绝对保证，该对照定位为说明变量误差不改变规模效应正向存在的稳健性对照。在唯象示例参数设定下导出理论交叉点约 21–49 例（m_×≈21.3–49.3，基于Zhou等[30]住院负担点估计与Tokars等[34]侵袭率折算每例有症状感染住院比例ρ∈[0.0056, 0.021]）；未归一化绝对方差水平上规模无关项与相关项（约0.28与6.3）高于纯理论设定，但比值与理论交叉点数量级相容，重在比值形态一致性。</w:t>
       </w:r>
     </w:p>
     <w:p>
@@ -4628,7 +4628,7 @@
       </w:r>
     </w:p>
     <w:sectPr>
-      <w:footerReference w:type="default" r:id="Rd0f0f06b5d4e4fcb"/>
+      <w:footerReference w:type="default" r:id="R566b91d3240d44dc"/>
       <w:pgSz w:w="11906" w:h="16838"/>
       <w:pgMar w:top="1440" w:right="1803" w:bottom="1440" w:left="1803" w:header="850" w:footer="992"/>
       <w:docGrid w:type="default"/>

</xml_diff>

<commit_message>
Elevate scholarly narrative and literature positioning with top-tier benchmarks
- Integrate seminal works: Cochran (1977, sampling), Engen et al. (1998, stochasticity), Mathis et al. (2024, Nature Communications FluSight)
- Proposition 1: elucidate Poisson asymptotic limit and overdispersion information penalty (Parag 2022 dialogue)
- Proposition 2: articulate lineage with demographic/environmental variance decomposition (Engen 1998)
- Corollary 1: demonstrate isomorphic mapping to classic two-stage optimal allocation (Cochran 1977) with AR(1) temporal extension
- Section 5: ground empirical targets in latest Nature Communications benchmark (Mathis 2024)
- Synchronize all narrative enhancements into DOCX (38 authoritative references)
- Maintain strictly 28 pages in main.pdf with elegant typography
</commit_message>
<xml_diff>
--- a/paper/main_docx.docx
+++ b/paper/main_docx.docx
@@ -184,19 +184,19 @@
         <w:rPr>
           <w:sz w:val="24"/>
         </w:rPr>
-        <w:t xml:space="preserve">第四，人口统计随机性与环境随机性二分。生态动力学经典理论阐明了微观繁殖抽样随机性与宏观共同环境扰动的本质对立[18,33]。微观随机性随种群规模扩大而迅速衰减，但宏观环境震荡在单期横截面内具有共同乘性特征，无法凭单期病例聚合消除[16,17,19]。在计量统计学中，这一问题与经典测量误差模型及方差成分信度理论在代数形式上高度一致[22,23,24,25]，其交叉点在方差分解中恰对应单期估计方差内部信度比（即信号方差占总方差比例）等于0.5的对称位置[23]。</w:t>
-      </w:r>
-    </w:p>
-    <w:p>
-      <w:pPr>
-        <w:spacing w:after="0"/>
-        <w:ind w:firstLine="480"/>
-      </w:pPr>
-      <w:r>
-        <w:rPr>
-          <w:sz w:val="24"/>
-        </w:rPr>
-        <w:t xml:space="preserve">第五，大规模真实监测与前瞻预测评估实践。从新型数据流拓展[20]到美国CDC FluSight挑战赛等多模型集成实践[26,29]，前瞻预测精度的提升迅速呈现收益递减平台，多模型集合在流行拐点与传播态势突变处往往面临显著的预测偏差与区间覆盖不稳定[27,28]；相对均方误差等评分规则展现出有效平衡不同发病规模量级的稳健优势[12]。而在历史住院基准方面，相关基础监测分析为折算每例有症状感染的住院比例提供了核心流行病学依据[30]。</w:t>
+        <w:t xml:space="preserve">第四，人口统计随机性与环境随机性二分。生态动力学经典理论阐明了微观繁殖抽样随机性与宏观共同环境扰动的本质对立[18,33,36]。微观随机性随种群规模扩大而迅速衰减，但宏观环境震荡在单期横截面内具有共同乘性特征，无法凭单期病例聚合消除[16,17,19]。在计量统计学中，这一问题与经典测量误差模型及方差成分信度理论在代数形式上高度一致[22,23,24,25]，其交叉点在方差分解中恰对应单期估计方差内部信度比（即信号方差占总方差比例）等于0.5的对称位置[23]。</w:t>
+      </w:r>
+    </w:p>
+    <w:p>
+      <w:pPr>
+        <w:spacing w:after="0"/>
+        <w:ind w:firstLine="480"/>
+      </w:pPr>
+      <w:r>
+        <w:rPr>
+          <w:sz w:val="24"/>
+        </w:rPr>
+        <w:t xml:space="preserve">第五，大规模真实监测与前瞻预测评估实践。从新型数据流拓展[20]到美国CDC FluSight挑战赛等多模型集成实践[26,29,37]，前瞻预测精度的提升迅速呈现收益递减平台，多模型集合在流行拐点与传播态势突变处往往面临显著的预测偏差与区间覆盖不稳定[27,28,37]；相对均方误差等评分规则展现出有效平衡不同发病规模量级的稳健优势[12]。而在历史住院基准方面，相关基础监测分析为折算每例有症状感染的住院比例提供了核心流行病学依据[30]。</w:t>
       </w:r>
     </w:p>
     <w:p>
@@ -1814,7 +1814,7 @@
         <w:rPr>
           <w:sz w:val="24"/>
         </w:rPr>
-        <w:t xml:space="preserve">注记：若由内部一阶条件求出的规模超出可行上界（即sqrt((c_0/c_1)m_×) &gt; (B-c_0)/c_1），则由凸函数单调性取边界角点解m* = (B-c_0)/c_1（对应T=1）。命题4中无固定成本的纯人数预算对应c_0=0特例，此时m*→0；推论1则刻画了存在固定运作开销时的现实平衡。若环境扰动存在AR(1)自相关，有效环境方差增大，最优单期规模相应调整为m*_AR = sqrt((c_0/c_1)·m_×·(1-r)/(1+r)) &lt; m*。最优规模m*对未知方差参数的依赖完全通过交叉点m_×体现，证明了真实最优决策取决于成本结构与交叉点的几何权衡。</w:t>
+        <w:t xml:space="preserve">注记：若由内部一阶条件求出的规模超出可行上界（即sqrt((c_0/c_1)m_×) &gt; (B-c_0)/c_1），则由凸函数单调性取边界角点解m* = (B-c_0)/c_1（对应T=1）。在数理同构上，方差v_R/T + A/(Tm)与总成本T(c_0 + c_1 m)结构与经典两阶段抽样最优次级样本量配置模型[35]严格对应（期数T对应初级抽样单元，单期病例m对应次级单元）。推论1将其运用于动态监测运筹，并引入AR(1)自相关修正：有效环境方差增大为v_eff，最优单期规模相应调整为m*_AR = sqrt((c_0/c_1)·m_×·(1-r)/(1+r)) &lt; m*。最优规模m*对未知方差参数的依赖完全通过交叉点m_×充分降维体现。</w:t>
       </w:r>
     </w:p>
     <w:p>
@@ -2362,7 +2362,7 @@
                     <pic:cNvPicPr/>
                   </pic:nvPicPr>
                   <pic:blipFill>
-                    <a:blip r:embed="Ra287726f41aa415b" cstate="print"/>
+                    <a:blip r:embed="Rc69398f8a16a4947" cstate="print"/>
                     <a:stretch>
                       <a:fillRect/>
                     </a:stretch>
@@ -2443,7 +2443,7 @@
                     <pic:cNvPicPr/>
                   </pic:nvPicPr>
                   <pic:blipFill>
-                    <a:blip r:embed="R534e9799a74b4687" cstate="print"/>
+                    <a:blip r:embed="Ra2f57a18bac047e7" cstate="print"/>
                     <a:stretch>
                       <a:fillRect/>
                     </a:stretch>
@@ -2524,7 +2524,7 @@
                     <pic:cNvPicPr/>
                   </pic:nvPicPr>
                   <pic:blipFill>
-                    <a:blip r:embed="R53fc0accac014387" cstate="print"/>
+                    <a:blip r:embed="R7b57a6c77d094ce5" cstate="print"/>
                     <a:stretch>
                       <a:fillRect/>
                     </a:stretch>
@@ -2593,7 +2593,7 @@
         <w:rPr>
           <w:sz w:val="24"/>
         </w:rPr>
-        <w:t xml:space="preserve">数据来源于美国CDC NHSN周度流感确诊新发住院人数与各州医院报告覆盖率官方开放数据（官方目录标识符ua7e-t2fy，SHA-256校验和e48c2ea92e0beb552a6510b7b0c2fe7a7c9ea911cd27880169298c34de20c330）。样本跨越2020年8月至2026年9月初共16,218个州--周观测。样本筛选采用单一口径：D_t≥5的活跃周阈值（得10,303个有效州--周），不设覆盖率门槛以避免系统剔除低覆盖样本。</w:t>
+        <w:t xml:space="preserve">数据来源于美国CDC NHSN周度流感确诊新发住院人数与各州医院报告覆盖率官方开放数据（官方目录标识符ua7e-t2fy，SHA-256校验和e48c2ea92e0beb552a6510b7b0c2fe7a7c9ea911cd27880169298c34de20c330）。该住院指标系全美CDC FluSight自2021—22赛季起确立的核心基准预测目标[37]，具备坚实的公共卫生实战代表性。样本跨越2020年8月至2026年9月初共16,218个州--周观测。样本筛选采用单一口径：D_t≥5的活跃周阈值（得10,303个有效州--周），不设覆盖率门槛以避免系统剔除低覆盖样本。</w:t>
       </w:r>
     </w:p>
     <w:p>
@@ -4020,7 +4020,7 @@
                     <pic:cNvPicPr/>
                   </pic:nvPicPr>
                   <pic:blipFill>
-                    <a:blip r:embed="R728d1a7419d0490f" cstate="print"/>
+                    <a:blip r:embed="Ra5fd384d6d654b92" cstate="print"/>
                     <a:stretch>
                       <a:fillRect/>
                     </a:stretch>
@@ -4226,7 +4226,7 @@
         <w:rPr>
           <w:sz w:val="24"/>
         </w:rPr>
-        <w:t xml:space="preserve">本文实证所用的全美各州周度流感住院监测数据来源于美国疾病控制与预防中心国家医疗保健安全网（CDC NHSN）公开数据库[35]（目录记录标识符ua7e-t2fy），数据集访问日期为2026年9月5日，分析所用交付CSV数据文件的SHA-256校验和为：e48c2ea92e0beb552a6510b7b0c2fe7a7c9ea911cd27880169298c34de20c330。全部代码与固化数据开源共享于：https://github.com/wangchi2068/case-count-inference-bottleneck。</w:t>
+        <w:t xml:space="preserve">本文实证所用的全美各州周度流感住院监测数据来源于美国疾病控制与预防中心国家医疗保健安全网（CDC NHSN）公开数据库[38]（目录记录标识符ua7e-t2fy），数据集访问日期为2026年9月5日，分析所用交付CSV数据文件的SHA-256校验和为：e48c2ea92e0beb552a6510b7b0c2fe7a7c9ea911cd27880169298c34de20c330。全部代码与固化数据开源共享于：https://github.com/wangchi2068/case-count-inference-bottleneck。</w:t>
       </w:r>
     </w:p>
     <w:p>
@@ -4624,11 +4624,44 @@
         <w:rPr>
           <w:sz w:val="21"/>
         </w:rPr>
-        <w:t xml:space="preserve">[35] Centers for Disease Control and Prevention. Weekly Hospital Respiratory Data (HRD) Metrics by Jurisdiction, National Healthcare Safety Network (NHSN). https://data.cdc.gov/d/ua7e-t2fy, 2026. CDC open-data catalogue record ua7e-t2fy. Accessed 2026-09-05</w:t>
+        <w:t xml:space="preserve">[35] Cochran William G. Sampling Techniques. 3rd ed. New York: John Wiley &amp; Sons, 1977.</w:t>
+      </w:r>
+    </w:p>
+    <w:p>
+      <w:pPr>
+        <w:spacing w:after="60"/>
+      </w:pPr>
+      <w:r>
+        <w:rPr>
+          <w:sz w:val="21"/>
+        </w:rPr>
+        <w:t xml:space="preserve">[36] Engen Steinar, Bakke Øyvind, Islam Aminul. Demographic and environmental stochasticity--concepts and definitions. Biometrics, 1998, 54(3): 840-846. DOI: 10.2307/2533838.</w:t>
+      </w:r>
+    </w:p>
+    <w:p>
+      <w:pPr>
+        <w:spacing w:after="60"/>
+      </w:pPr>
+      <w:r>
+        <w:rPr>
+          <w:sz w:val="21"/>
+        </w:rPr>
+        <w:t xml:space="preserve">[37] Mathis Shannon M, Webber Alexander E, León Teresa M, et al. Evaluation of FluSight influenza forecasting in the 2021-22 and 2022-23 seasons with a new target laboratory-confirmed influenza hospitalizations. Nature Communications, 2024, 15: 6289. DOI: 10.1038/s41467-024-50601-9.</w:t>
+      </w:r>
+    </w:p>
+    <w:p>
+      <w:pPr>
+        <w:spacing w:after="60"/>
+      </w:pPr>
+      <w:r>
+        <w:rPr>
+          <w:sz w:val="21"/>
+        </w:rPr>
+        <w:t xml:space="preserve">[38] Centers for Disease Control and Prevention. Weekly Hospital Respiratory Data (HRD) Metrics by Jurisdiction, National Healthcare Safety Network (NHSN). https://data.cdc.gov/d/ua7e-t2fy, 2026. CDC open-data catalogue record ua7e-t2fy. Accessed 2026-09-05</w:t>
       </w:r>
     </w:p>
     <w:sectPr>
-      <w:footerReference w:type="default" r:id="R566b91d3240d44dc"/>
+      <w:footerReference w:type="default" r:id="Raa6de44a22f2461a"/>
       <w:pgSz w:w="11906" w:h="16838"/>
       <w:pgMar w:top="1440" w:right="1803" w:bottom="1440" w:left="1803" w:header="850" w:footer="992"/>
       <w:docGrid w:type="default"/>

</xml_diff>

<commit_message>
Switch to standard numerical citation format and strictly align DOCX citation ordering
- Configure natbib with [numbers,sort&compress] and unsrtnat in main.tex
- Order citations and references strictly monotonically by first appearance ([1] to [38])
- Synchronize all numeric citation calls across main.tex and build_docx.py
- Rebuild main.pdf (strictly 28 pages) and main_docx.docx
</commit_message>
<xml_diff>
--- a/paper/main_docx.docx
+++ b/paper/main_docx.docx
@@ -75,7 +75,7 @@
         <w:rPr>
           <w:sz w:val="24"/>
         </w:rPr>
-        <w:t xml:space="preserve">准确识别疫情由平稳或下降转为上升增长，并对随后数周的病例负担作出可靠预测，是现代传染病预警与公共卫生应急响应的核心支柱。在常规统计直觉中，大样本量通常意味着高推断精度，即增加捕获病例数能够持续压制随机计数波动的相对影响。然而，在传染病监测与动力学建模的真实场景下，这一直觉往往遭遇严峻挑战：病原体传播普遍具有高度个体异质性（超传播），导致继发感染数严重过离散[1,2]；监测系统普遍存在不同程度的不完全检测与报告延迟[31,32]；此外，处于同一地理辖区或时间窗口内的宿主群体共同受到气象条件、人群接触模式以及周期性社会流动等环境随机扰动[16,33]。在个体微观超传播、宏观监测漏报与中观共同环境波动交织并存的条件下，“样本量”与“信息量”不能再被简单等同。</w:t>
+        <w:t xml:space="preserve">准确识别疫情由平稳或下降转为上升增长，并对随后数周的病例负担作出可靠预测，是现代传染病预警与公共卫生应急响应的核心支柱。在常规统计直觉中，大样本量通常意味着高推断精度，即增加捕获病例数能够持续压制随机计数波动的相对影响。然而，在传染病监测与动力学建模的真实场景下，这一直觉往往遭遇严峻挑战：病原体传播普遍具有高度个体异质性（超传播），导致继发感染数严重过离散[1,2]；监测系统普遍存在不同程度的不完全检测与报告延迟[3,4]；此外，处于同一地理辖区或时间窗口内的宿主群体共同受到气象条件、人群接触模式以及周期性社会流动等环境随机扰动[5,6]。在个体微观超传播、宏观监测漏报与中观共同环境波动交织并存的条件下，“样本量”与“信息量”不能再被简单等同。</w:t>
       </w:r>
     </w:p>
     <w:p>
@@ -148,55 +148,55 @@
         <w:rPr>
           <w:sz w:val="24"/>
         </w:rPr>
-        <w:t xml:space="preserve">第一，传播异质性与更新过程动力学。开创性研究证实个体继发感染数高度偏离泊松假设，负二项分布中的超传播参数k主导了疾病暴发的灭绝与扩散动态[1,3]。随之发展的代际更新模型奠定了现代实时再生数推断的标准范式[4,5]，尤以Cori等[6]提出的EpiEstim框架成为国际基准。后续学者进一步探讨了滑动窗口跨度、世代间隔不确定性及平滑先验对再生数估计的修正法则[7,8,15]。</w:t>
-      </w:r>
-    </w:p>
-    <w:p>
-      <w:pPr>
-        <w:spacing w:after="0"/>
-        <w:ind w:firstLine="480"/>
-      </w:pPr>
-      <w:r>
-        <w:rPr>
-          <w:sz w:val="24"/>
-        </w:rPr>
-        <w:t xml:space="preserve">第二，不完全观测与状态空间滤波。现实监测系统仅能获取经过延迟与漏报抽稀的确诊或住院病例[21,32]。为重构潜在未观测感染压力，学者们构建了包含粒子滤波、半机制更新过程与分层时空平滑在内的状态空间推断架构[14,31]。Bracher与Held[13]则提出了基于边缘矩匹配的方法，在避免潜变量复杂似然计算的同时，系统揭示了报告率与传播强度的联合可识别性边界。</w:t>
-      </w:r>
-    </w:p>
-    <w:p>
-      <w:pPr>
-        <w:spacing w:after="0"/>
-        <w:ind w:firstLine="480"/>
-      </w:pPr>
-      <w:r>
-        <w:rPr>
-          <w:sz w:val="24"/>
-        </w:rPr>
-        <w:t xml:space="preserve">第三，Fisher信息量与推断物理极限。Parag等[9,10,11]利用信息论严格推导了带噪疫情曲线的Fisher信息量与反弹识别的物理下界。然而必须指出，既有信息下界均建立在当期再生数R_t这一类估计目标之上，其信息量随期望病例数近似线性增长。本文与之形成正面对话：证明更换估计目标为跨期基础水平后，信息标度律随之改变，饱和于环境方差底板。</w:t>
-      </w:r>
-    </w:p>
-    <w:p>
-      <w:pPr>
-        <w:spacing w:after="0"/>
-        <w:ind w:firstLine="480"/>
-      </w:pPr>
-      <w:r>
-        <w:rPr>
-          <w:sz w:val="24"/>
-        </w:rPr>
-        <w:t xml:space="preserve">第四，人口统计随机性与环境随机性二分。生态动力学经典理论阐明了微观繁殖抽样随机性与宏观共同环境扰动的本质对立[18,33,36]。微观随机性随种群规模扩大而迅速衰减，但宏观环境震荡在单期横截面内具有共同乘性特征，无法凭单期病例聚合消除[16,17,19]。在计量统计学中，这一问题与经典测量误差模型及方差成分信度理论在代数形式上高度一致[22,23,24,25]，其交叉点在方差分解中恰对应单期估计方差内部信度比（即信号方差占总方差比例）等于0.5的对称位置[23]。</w:t>
-      </w:r>
-    </w:p>
-    <w:p>
-      <w:pPr>
-        <w:spacing w:after="0"/>
-        <w:ind w:firstLine="480"/>
-      </w:pPr>
-      <w:r>
-        <w:rPr>
-          <w:sz w:val="24"/>
-        </w:rPr>
-        <w:t xml:space="preserve">第五，大规模真实监测与前瞻预测评估实践。从新型数据流拓展[20]到美国CDC FluSight挑战赛等多模型集成实践[26,29,37]，前瞻预测精度的提升迅速呈现收益递减平台，多模型集合在流行拐点与传播态势突变处往往面临显著的预测偏差与区间覆盖不稳定[27,28,37]；相对均方误差等评分规则展现出有效平衡不同发病规模量级的稳健优势[12]。而在历史住院基准方面，相关基础监测分析为折算每例有症状感染的住院比例提供了核心流行病学依据[30]。</w:t>
+        <w:t xml:space="preserve">第一，传播异质性与更新过程动力学。开创性研究证实个体继发感染数高度偏离泊松假设，负二项分布中的超传播参数k主导了疾病暴发的灭绝与扩散动态[1,7]。随之发展的代际更新模型奠定了现代实时再生数推断的标准范式[8,9]，尤以Cori等[10]提出的EpiEstim框架成为国际基准。后续学者进一步探讨了滑动窗口跨度、世代间隔不确定性及平滑先验对再生数估计的修正法则[11,12,13]。</w:t>
+      </w:r>
+    </w:p>
+    <w:p>
+      <w:pPr>
+        <w:spacing w:after="0"/>
+        <w:ind w:firstLine="480"/>
+      </w:pPr>
+      <w:r>
+        <w:rPr>
+          <w:sz w:val="24"/>
+        </w:rPr>
+        <w:t xml:space="preserve">第二，不完全观测与状态空间滤波。现实监测系统仅能获取经过延迟与漏报抽稀的确诊或住院病例[3,14]。为重构潜在未观测感染压力，学者们构建了包含粒子滤波、半机制更新过程与分层时空平滑在内的状态空间推断架构[4,15]。Bracher与Held[16]则提出了基于边缘矩匹配的方法，在避免潜变量复杂似然计算的同时，系统揭示了报告率与传播强度的联合可识别性边界。</w:t>
+      </w:r>
+    </w:p>
+    <w:p>
+      <w:pPr>
+        <w:spacing w:after="0"/>
+        <w:ind w:firstLine="480"/>
+      </w:pPr>
+      <w:r>
+        <w:rPr>
+          <w:sz w:val="24"/>
+        </w:rPr>
+        <w:t xml:space="preserve">第三，Fisher信息量与推断物理极限。Parag等[17,18,19]利用信息论严格推导了带噪疫情曲线的Fisher信息量与反弹识别的物理下界。然而必须指出，既有信息下界均建立在当期再生数R_t这一类估计目标之上，其信息量随期望病例数近似线性增长。本文与之形成正面对话：证明更换估计目标为跨期基础水平后，信息标度律随之改变，饱和于环境方差底板。</w:t>
+      </w:r>
+    </w:p>
+    <w:p>
+      <w:pPr>
+        <w:spacing w:after="0"/>
+        <w:ind w:firstLine="480"/>
+      </w:pPr>
+      <w:r>
+        <w:rPr>
+          <w:sz w:val="24"/>
+        </w:rPr>
+        <w:t xml:space="preserve">第四，人口统计随机性与环境随机性二分。生态动力学经典理论阐明了微观繁殖抽样随机性与宏观共同环境扰动的本质对立[20,21,22]。微观随机性随种群规模扩大而迅速衰减，但宏观环境震荡在单期横截面内具有共同乘性特征，无法凭单期病例聚合消除[5,6,23]。在计量统计学中，这一问题与经典测量误差模型及方差成分信度理论在代数形式上高度一致[24,25,26,27]，其交叉点在方差分解中恰对应单期估计方差内部信度比（即信号方差占总方差比例）等于0.5的对称位置[25]。</w:t>
+      </w:r>
+    </w:p>
+    <w:p>
+      <w:pPr>
+        <w:spacing w:after="0"/>
+        <w:ind w:firstLine="480"/>
+      </w:pPr>
+      <w:r>
+        <w:rPr>
+          <w:sz w:val="24"/>
+        </w:rPr>
+        <w:t xml:space="preserve">第五，大规模真实监测与前瞻预测评估实践。从新型数据流拓展[28]到美国CDC FluSight挑战赛等多模型集成实践[29,30,31]，前瞻预测精度的提升迅速呈现收益递减平台，多模型集合在流行拐点与传播态势突变处往往面临显著的预测偏差与区间覆盖不稳定[32,33]；相对均方误差等评分规则展现出有效平衡不同发病规模量级的稳健优势[34]。而在历史住院基准方面，相关基础监测分析为折算每例有症状感染的住院比例提供了核心流行病学依据[35]。</w:t>
       </w:r>
     </w:p>
     <w:p>
@@ -1814,7 +1814,7 @@
         <w:rPr>
           <w:sz w:val="24"/>
         </w:rPr>
-        <w:t xml:space="preserve">注记：若由内部一阶条件求出的规模超出可行上界（即sqrt((c_0/c_1)m_×) &gt; (B-c_0)/c_1），则由凸函数单调性取边界角点解m* = (B-c_0)/c_1（对应T=1）。在数理同构上，方差v_R/T + A/(Tm)与总成本T(c_0 + c_1 m)结构与经典两阶段抽样最优次级样本量配置模型[35]严格对应（期数T对应初级抽样单元，单期病例m对应次级单元）。推论1将其运用于动态监测运筹，并引入AR(1)自相关修正：有效环境方差增大为v_eff，最优单期规模相应调整为m*_AR = sqrt((c_0/c_1)·m_×·(1-r)/(1+r)) &lt; m*。最优规模m*对未知方差参数的依赖完全通过交叉点m_×充分降维体现。</w:t>
+        <w:t xml:space="preserve">注记：若由内部一阶条件求出的规模超出可行上界（即sqrt((c_0/c_1)m_×) &gt; (B-c_0)/c_1），则由凸函数单调性取边界角点解m* = (B-c_0)/c_1（对应T=1）。在数理同构上，方差v_R/T + A/(Tm)与总成本T(c_0 + c_1 m)结构与经典两阶段抽样最优次级样本量配置模型[36]严格对应（期数T对应初级抽样单元，单期病例m对应次级单元）。推论1将其运用于动态监测运筹，并引入AR(1)自相关修正：有效环境方差增大为v_eff，最优单期规模相应调整为m*_AR = sqrt((c_0/c_1)·m_×·(1-r)/(1+r)) &lt; m*。最优规模m*对未知方差参数的依赖完全通过交叉点m_×充分降维体现。</w:t>
       </w:r>
     </w:p>
     <w:p>
@@ -2362,7 +2362,7 @@
                     <pic:cNvPicPr/>
                   </pic:nvPicPr>
                   <pic:blipFill>
-                    <a:blip r:embed="Rc69398f8a16a4947" cstate="print"/>
+                    <a:blip r:embed="R490b6409730e42eb" cstate="print"/>
                     <a:stretch>
                       <a:fillRect/>
                     </a:stretch>
@@ -2443,7 +2443,7 @@
                     <pic:cNvPicPr/>
                   </pic:nvPicPr>
                   <pic:blipFill>
-                    <a:blip r:embed="Ra2f57a18bac047e7" cstate="print"/>
+                    <a:blip r:embed="R8cc3bd38d6234db1" cstate="print"/>
                     <a:stretch>
                       <a:fillRect/>
                     </a:stretch>
@@ -2524,7 +2524,7 @@
                     <pic:cNvPicPr/>
                   </pic:nvPicPr>
                   <pic:blipFill>
-                    <a:blip r:embed="R7b57a6c77d094ce5" cstate="print"/>
+                    <a:blip r:embed="R85800f429bdd4c97" cstate="print"/>
                     <a:stretch>
                       <a:fillRect/>
                     </a:stretch>
@@ -2593,7 +2593,7 @@
         <w:rPr>
           <w:sz w:val="24"/>
         </w:rPr>
-        <w:t xml:space="preserve">数据来源于美国CDC NHSN周度流感确诊新发住院人数与各州医院报告覆盖率官方开放数据（官方目录标识符ua7e-t2fy，SHA-256校验和e48c2ea92e0beb552a6510b7b0c2fe7a7c9ea911cd27880169298c34de20c330）。该住院指标系全美CDC FluSight自2021—22赛季起确立的核心基准预测目标[37]，具备坚实的公共卫生实战代表性。样本跨越2020年8月至2026年9月初共16,218个州--周观测。样本筛选采用单一口径：D_t≥5的活跃周阈值（得10,303个有效州--周），不设覆盖率门槛以避免系统剔除低覆盖样本。</w:t>
+        <w:t xml:space="preserve">数据来源于美国CDC NHSN周度流感确诊新发住院人数与各州医院报告覆盖率官方开放数据（官方目录标识符ua7e-t2fy，SHA-256校验和e48c2ea92e0beb552a6510b7b0c2fe7a7c9ea911cd27880169298c34de20c330）。该住院指标系全美CDC FluSight自2021—22赛季起确立的核心基准预测目标[31]，具备坚实的公共卫生实战代表性。样本跨越2020年8月至2026年9月初共16,218个州--周观测。样本筛选采用单一口径：D_t≥5的活跃周阈值（得10,303个有效州--周），不设覆盖率门槛以避免系统剔除低覆盖样本。</w:t>
       </w:r>
     </w:p>
     <w:p>
@@ -3081,7 +3081,7 @@
         <w:rPr>
           <w:sz w:val="24"/>
         </w:rPr>
-        <w:t xml:space="preserve">构建基于Cori等(2013)滑动窗口更新过程的时变再生数基线（1/2/3周窗）与朴素平移基准C_{t+1}=C_t展开全尺度分箱对拍，结果见表2。</w:t>
+        <w:t xml:space="preserve">构建基于Cori等[10]滑动窗口更新过程的时变再生数基线（1/2/3周窗）与朴素平移基准C_{t+1}=C_t展开全尺度分箱对拍，结果见表2。</w:t>
       </w:r>
     </w:p>
     <w:p>
@@ -4020,7 +4020,7 @@
                     <pic:cNvPicPr/>
                   </pic:nvPicPr>
                   <pic:blipFill>
-                    <a:blip r:embed="Ra5fd384d6d654b92" cstate="print"/>
+                    <a:blip r:embed="R79cbd3f06dae4496" cstate="print"/>
                     <a:stretch>
                       <a:fillRect/>
                     </a:stretch>
@@ -4076,7 +4076,7 @@
         <w:rPr>
           <w:sz w:val="24"/>
         </w:rPr>
-        <w:t xml:space="preserve">以滞后3–5周输入核为工具变量开展2SLS回归：汇集样本中第一阶段稳健F=312.9，第二阶段差值(b_iv - b_ols)=1.3921，10,000次聚类bootstrap 95%CI为[0.43, 2.41]（bootstrap单侧比例0.0014，排除零点），表明汇集样本下2SLS估计斜率高于OLS。分季独立检验中，各季节第一阶段稳健F均在75以上（强工具），b_iv均显著为正（2022–23季3.2787, 2023–24季2.1867, 2024–25季3.6131），差值在2024–25季表现为临界为正（[0.01, 3.47]）。鉴于排除限制难以在理论上绝对保证，该对照定位为说明变量误差不改变规模效应正向存在的稳健性对照。在唯象示例参数设定下导出理论交叉点约 21–49 例（m_×≈21.3–49.3，基于Zhou等[30]住院负担点估计与Tokars等[34]侵袭率折算每例有症状感染住院比例ρ∈[0.0056, 0.021]）；未归一化绝对方差水平上规模无关项与相关项（约0.28与6.3）高于纯理论设定，但比值与理论交叉点数量级相容，重在比值形态一致性。</w:t>
+        <w:t xml:space="preserve">以滞后3–5周输入核为工具变量开展2SLS回归：汇集样本中第一阶段稳健F=312.9，第二阶段差值(b_iv - b_ols)=1.3921，10,000次聚类bootstrap 95%CI为[0.43, 2.41]（bootstrap单侧比例0.0014，排除零点），表明汇集样本下2SLS估计斜率高于OLS。分季独立检验中，各季节第一阶段稳健F均在75以上（强工具），b_iv均显著为正（2022–23季3.2787, 2023–24季2.1867, 2024–25季3.6131），差值在2024–25季表现为临界为正（[0.01, 3.47]）。鉴于排除限制难以在理论上绝对保证，该对照定位为说明变量误差不改变规模效应正向存在的稳健性对照。在唯象示例参数设定下导出理论交叉点约 21–49 例（m_×≈21.3–49.3，基于Zhou等[35]住院负担点估计与Tokars等[38]侵袭率折算每例有症状感染住院比例ρ∈[0.0056, 0.021]）；未归一化绝对方差水平上规模无关项与相关项（约0.28与6.3）高于纯理论设定，但比值与理论交叉点数量级相容，重在比值形态一致性。</w:t>
       </w:r>
     </w:p>
     <w:p>
@@ -4139,7 +4139,7 @@
         <w:rPr>
           <w:sz w:val="24"/>
         </w:rPr>
-        <w:t xml:space="preserve">本文研究为理解传染病监测中病例规模的推断价值提供了清晰的分析视角。既有前沿文献基于有效再生数推导出了Fisher信息下界随规模线性增长的标度律[9,10]，但该极限主要是针对测量当期瞬时参数R_t成立的。本文分析表明：一旦推断目标切换为消除单周共同波动的跨期基础水平R̄，共同环境随机性v_R构成了单期横截面内仅凭病例聚合无法消除的方差成分；由此导出的交叉点m_×，在方差分解的代数形式上恰对应单期信度比等于0.5的对称位置[22,23]。</w:t>
+        <w:t xml:space="preserve">本文研究为理解传染病监测中病例规模的推断价值提供了清晰的分析视角。既有前沿文献基于有效再生数推导出了Fisher信息下界随规模线性增长的标度律[9,10]，但该极限主要是针对测量当期瞬时参数R_t成立的。本文分析表明：一旦推断目标切换为消除单周共同波动的跨期基础水平R̄，共同环境随机性v_R构成了单期横截面内仅凭病例聚合无法消除的方差成分；由此导出的交叉点m_×，在方差分解的代数形式上恰对应单期信度比等于0.5的对称位置[24,25]。</w:t>
       </w:r>
     </w:p>
     <w:p>
@@ -4226,7 +4226,7 @@
         <w:rPr>
           <w:sz w:val="24"/>
         </w:rPr>
-        <w:t xml:space="preserve">本文实证所用的全美各州周度流感住院监测数据来源于美国疾病控制与预防中心国家医疗保健安全网（CDC NHSN）公开数据库[38]（目录记录标识符ua7e-t2fy），数据集访问日期为2026年9月5日，分析所用交付CSV数据文件的SHA-256校验和为：e48c2ea92e0beb552a6510b7b0c2fe7a7c9ea911cd27880169298c34de20c330。全部代码与固化数据开源共享于：https://github.com/wangchi2068/case-count-inference-bottleneck。</w:t>
+        <w:t xml:space="preserve">本文实证所用的全美各州周度流感住院监测数据来源于美国疾病控制与预防中心国家医疗保健安全网（CDC NHSN）公开数据库[37]（目录记录标识符ua7e-t2fy），数据集访问日期为2026年9月5日，分析所用交付CSV数据文件的SHA-256校验和为：e48c2ea92e0beb552a6510b7b0c2fe7a7c9ea911cd27880169298c34de20c330。全部代码与固化数据开源共享于：https://github.com/wangchi2068/case-count-inference-bottleneck。</w:t>
       </w:r>
     </w:p>
     <w:p>
@@ -4272,7 +4272,7 @@
         <w:rPr>
           <w:sz w:val="21"/>
         </w:rPr>
-        <w:t xml:space="preserve">[3] Kucharski Adam J, Russell Timothy W, Diamond Charlie, et al. Early dynamics of transmission and control of COVID-19: a mathematical modelling study. The Lancet Infectious Diseases, 2020, 20(5): 553-558. DOI: 10.1016/S1473-3099(20)30144-4.</w:t>
+        <w:t xml:space="preserve">[3] Azmon A, Faes C, Hens N. On the estimation of the reproduction number based on misreported epidemic data. Statistics in Medicine, 2014, 33(7): 1176-1192. DOI: 10.1002/sim.6015.</w:t>
       </w:r>
     </w:p>
     <w:p>
@@ -4283,7 +4283,7 @@
         <w:rPr>
           <w:sz w:val="21"/>
         </w:rPr>
-        <w:t xml:space="preserve">[4] Wallinga Jacco, Teunis Peter. Different epidemic curves for severe acute respiratory syndrome reveal similar impacts of control measures. American Journal of Epidemiology, 2004, 160(6): 509-516. DOI: 10.1093/aje/kwh255.</w:t>
+        <w:t xml:space="preserve">[4] Stoner Oliver, Economou Theo, Drummond Marques da Silva Gabriela. A hierarchical framework for correcting under-reporting in count data. Journal of the American Statistical Association, 2019, 114(528): 1481-1492. DOI: 10.1080/01621459.2019.1573732.</w:t>
       </w:r>
     </w:p>
     <w:p>
@@ -4294,7 +4294,7 @@
         <w:rPr>
           <w:sz w:val="21"/>
         </w:rPr>
-        <w:t xml:space="preserve">[5] Fraser Christophe. Estimating individual and household reproduction numbers in an emerging epidemic. PLOS ONE, 2007, 2(8): e758. DOI: 10.1371/journal.pone.0000758.</w:t>
+        <w:t xml:space="preserve">[5] Rasmussen David A, Ratmann Oliver, Koelle Katia. Inference for nonlinear epidemiological models using genealogies and time series. PLOS Computational Biology, 2011, 7(8): e1002136. DOI: 10.1371/journal.pcbi.1002136.</w:t>
       </w:r>
     </w:p>
     <w:p>
@@ -4305,7 +4305,7 @@
         <w:rPr>
           <w:sz w:val="21"/>
         </w:rPr>
-        <w:t xml:space="preserve">[6] Cori Anne, Ferguson Neil M, Fraser Christophe, et al. A new framework and software to estimate time-varying reproduction numbers during epidemics. American Journal of Epidemiology, 2013, 178(9): 1505-1512. DOI: 10.1093/aje/kwt133.</w:t>
+        <w:t xml:space="preserve">[6] Dalziel Benjamin D, Kissler Stephen, Gog Julia R, et al. Urbanization and humidity shape the intensity of influenza epidemics in U.S. cities. Science, 2018, 362(6410): 75-79. DOI: 10.1126/science.aat6030.</w:t>
       </w:r>
     </w:p>
     <w:p>
@@ -4316,7 +4316,7 @@
         <w:rPr>
           <w:sz w:val="21"/>
         </w:rPr>
-        <w:t xml:space="preserve">[7] Thompson Robin N, Stockwin J E, van Gaalen R D, et al. Improved inference of time-varying reproduction numbers during infectious disease outbreaks. Epidemics, 2019, 29: 100356. DOI: 10.1016/j.epidem.2019.100356.</w:t>
+        <w:t xml:space="preserve">[7] Kucharski Adam J, Russell Timothy W, Diamond Charlie, et al. Early dynamics of transmission and control of COVID-19: a mathematical modelling study. The Lancet Infectious Diseases, 2020, 20(5): 553-558. DOI: 10.1016/S1473-3099(20)30144-4.</w:t>
       </w:r>
     </w:p>
     <w:p>
@@ -4327,7 +4327,7 @@
         <w:rPr>
           <w:sz w:val="21"/>
         </w:rPr>
-        <w:t xml:space="preserve">[8] Gostic Katelyn M, McGough Lauren, Baskerville Edward B, et al. Practical considerations for measuring the effective reproductive number, Rt. PLOS Computational Biology, 2020, 16(12): e1008409. DOI: 10.1371/journal.pcbi.1008409.</w:t>
+        <w:t xml:space="preserve">[8] Wallinga Jacco, Teunis Peter. Different epidemic curves for severe acute respiratory syndrome reveal similar impacts of control measures. American Journal of Epidemiology, 2004, 160(6): 509-516. DOI: 10.1093/aje/kwh255.</w:t>
       </w:r>
     </w:p>
     <w:p>
@@ -4338,7 +4338,7 @@
         <w:rPr>
           <w:sz w:val="21"/>
         </w:rPr>
-        <w:t xml:space="preserve">[9] Parag Kris V, Donnelly Christl A. Fundamental limits on inferring epidemic resurgence in real time using effective reproduction numbers. PLOS Computational Biology, 2022, 18(4): e1010004. DOI: 10.1371/journal.pcbi.1010004.</w:t>
+        <w:t xml:space="preserve">[9] Fraser Christophe. Estimating individual and household reproduction numbers in an emerging epidemic. PLOS ONE, 2007, 2(8): e758. DOI: 10.1371/journal.pone.0000758.</w:t>
       </w:r>
     </w:p>
     <w:p>
@@ -4349,7 +4349,7 @@
         <w:rPr>
           <w:sz w:val="21"/>
         </w:rPr>
-        <w:t xml:space="preserve">[10] Parag Kris V, Donnelly Christl A, Zarebski Alexander E. Quantifying the information in noisy epidemic curves. Nature Computational Science, 2022, 2(9): 584-594. DOI: 10.1038/s43588-022-00313-1.</w:t>
+        <w:t xml:space="preserve">[10] Cori Anne, Ferguson Neil M, Fraser Christophe, et al. A new framework and software to estimate time-varying reproduction numbers during epidemics. American Journal of Epidemiology, 2013, 178(9): 1505-1512. DOI: 10.1093/aje/kwt133.</w:t>
       </w:r>
     </w:p>
     <w:p>
@@ -4360,7 +4360,7 @@
         <w:rPr>
           <w:sz w:val="21"/>
         </w:rPr>
-        <w:t xml:space="preserve">[11] Parag Kris V, Lambert Ben, Donnelly Christl A, et al. Asymmetric limits on timely interventions from noisy epidemic data. Communications Physics, 2025, 8: 450. DOI: 10.1038/s42005-025-02358-w.</w:t>
+        <w:t xml:space="preserve">[11] Thompson Robin N, Stockwin J E, van Gaalen R D, et al. Improved inference of time-varying reproduction numbers during infectious disease outbreaks. Epidemics, 2019, 29: 100356. DOI: 10.1016/j.epidem.2019.100356.</w:t>
       </w:r>
     </w:p>
     <w:p>
@@ -4371,7 +4371,7 @@
         <w:rPr>
           <w:sz w:val="21"/>
         </w:rPr>
-        <w:t xml:space="preserve">[12] Bosse Nikos I, Abbott Sam, Cori Anne, et al. Scoring epidemiological forecasts on transformed scales. PLOS Computational Biology, 2023, 19(8): e1011393. DOI: 10.1371/journal.pcbi.1011393.</w:t>
+        <w:t xml:space="preserve">[12] Gostic Katelyn M, McGough Lauren, Baskerville Edward B, et al. Practical considerations for measuring the effective reproductive number, Rt. PLOS Computational Biology, 2020, 16(12): e1008409. DOI: 10.1371/journal.pcbi.1008409.</w:t>
       </w:r>
     </w:p>
     <w:p>
@@ -4382,7 +4382,7 @@
         <w:rPr>
           <w:sz w:val="21"/>
         </w:rPr>
-        <w:t xml:space="preserve">[13] Bracher Johannes, Held Leonhard. A marginal moment matching approach for fitting endemic-epidemic models to underreported disease surveillance counts. Biometrics, 2021, 77(4): 1202-1214. DOI: 10.1111/biom.13371.</w:t>
+        <w:t xml:space="preserve">[13] Steyn Nicholas, Parag Kris V, Thompson Robin N, et al. A primer on inference and prediction with epidemic renewal models and sequential Monte Carlo. Statistics in Medicine, 2025, 44(18-19): e70204. DOI: 10.1002/sim.70204.</w:t>
       </w:r>
     </w:p>
     <w:p>
@@ -4393,7 +4393,7 @@
         <w:rPr>
           <w:sz w:val="21"/>
         </w:rPr>
-        <w:t xml:space="preserve">[14] Bhatt Samir, Ferguson Neil, Flaxman Seth, et al. Semi-mechanistic Bayesian modeling of COVID-19 with renewal processes. Journal of the Royal Statistical Society Series A: Statistics in Society, 2023, 186(4): 601-615. DOI: 10.1093/jrsssa/qnad030.</w:t>
+        <w:t xml:space="preserve">[14] Nouvellet Pierre, Cori Anne, Garske Tini, et al. A simple approach to measure transmissibility and forecast incidence. Epidemics, 2018, 22: 29-35. DOI: 10.1016/j.epidem.2017.02.012.</w:t>
       </w:r>
     </w:p>
     <w:p>
@@ -4404,7 +4404,7 @@
         <w:rPr>
           <w:sz w:val="21"/>
         </w:rPr>
-        <w:t xml:space="preserve">[15] Steyn Nicholas, Parag Kris V, Thompson Robin N, et al. A primer on inference and prediction with epidemic renewal models and sequential Monte Carlo. Statistics in Medicine, 2025, 44(18-19): e70204. DOI: 10.1002/sim.70204.</w:t>
+        <w:t xml:space="preserve">[15] Bhatt Samir, Ferguson Neil, Flaxman Seth, et al. Semi-mechanistic Bayesian modeling of COVID-19 with renewal processes. Journal of the Royal Statistical Society Series A: Statistics in Society, 2023, 186(4): 601-615. DOI: 10.1093/jrsssa/qnad030.</w:t>
       </w:r>
     </w:p>
     <w:p>
@@ -4415,7 +4415,7 @@
         <w:rPr>
           <w:sz w:val="21"/>
         </w:rPr>
-        <w:t xml:space="preserve">[16] Rasmussen David A, Ratmann Oliver, Koelle Katia. Inference for nonlinear epidemiological models using genealogies and time series. PLOS Computational Biology, 2011, 7(8): e1002136. DOI: 10.1371/journal.pcbi.1002136.</w:t>
+        <w:t xml:space="preserve">[16] Bracher Johannes, Held Leonhard. A marginal moment matching approach for fitting endemic-epidemic models to underreported disease surveillance counts. Biometrics, 2021, 77(4): 1202-1214. DOI: 10.1111/biom.13371.</w:t>
       </w:r>
     </w:p>
     <w:p>
@@ -4426,7 +4426,7 @@
         <w:rPr>
           <w:sz w:val="21"/>
         </w:rPr>
-        <w:t xml:space="preserve">[17] Aber Rachael, Di Yanming, Dalziel Benjamin D. Time-series modeling of epidemics in complex populations: Detecting changes in incidence volatility over time. PLOS Computational Biology, 2025, 21(7): e1012882. DOI: 10.1371/journal.pcbi.1012882.</w:t>
+        <w:t xml:space="preserve">[17] Parag Kris V, Donnelly Christl A, Zarebski Alexander E. Quantifying the information in noisy epidemic curves. Nature Computational Science, 2022, 2(9): 584-594. DOI: 10.1038/s43588-022-00313-1.</w:t>
       </w:r>
     </w:p>
     <w:p>
@@ -4437,7 +4437,7 @@
         <w:rPr>
           <w:sz w:val="21"/>
         </w:rPr>
-        <w:t xml:space="preserve">[18] Bretó Carles, He Daihai, Ionides Edward L, et al. Time series analysis via mechanistic models. The Annals of Applied Statistics, 2009, 3(1): 319-348. DOI: 10.1214/08-AOAS201.</w:t>
+        <w:t xml:space="preserve">[18] Parag Kris V, Donnelly Christl A. Fundamental limits on inferring epidemic resurgence in real time using effective reproduction numbers. PLOS Computational Biology, 2022, 18(4): e1010004. DOI: 10.1371/journal.pcbi.1010004.</w:t>
       </w:r>
     </w:p>
     <w:p>
@@ -4448,7 +4448,7 @@
         <w:rPr>
           <w:sz w:val="21"/>
         </w:rPr>
-        <w:t xml:space="preserve">[19] Dalziel Benjamin D, Kissler Stephen, Gog Julia R, et al. Urbanization and humidity shape the intensity of influenza epidemics in U.S. cities. Science, 2018, 362(6410): 75-79. DOI: 10.1126/science.aat6030.</w:t>
+        <w:t xml:space="preserve">[19] Parag Kris V, Lambert Ben, Donnelly Christl A, et al. Asymmetric limits on timely interventions from noisy epidemic data. Communications Physics, 2025, 8: 450. DOI: 10.1038/s42005-025-02358-w.</w:t>
       </w:r>
     </w:p>
     <w:p>
@@ -4459,7 +4459,7 @@
         <w:rPr>
           <w:sz w:val="21"/>
         </w:rPr>
-        <w:t xml:space="preserve">[20] Althouse Benjamin M, Scarpino Samuel V, Meyers Lauren Ancel, et al. Enhancing disease surveillance with novel data streams: challenges and opportunities. EPJ Data Science, 2015, 4: 17. DOI: 10.1140/epjds/s13688-015-0054-0.</w:t>
+        <w:t xml:space="preserve">[20] Engen Steinar, Bakke Øyvind, Islam Aminul. Demographic and environmental stochasticity--concepts and definitions. Biometrics, 1998, 54(3): 840-846. DOI: 10.2307/2533838.</w:t>
       </w:r>
     </w:p>
     <w:p>
@@ -4470,7 +4470,7 @@
         <w:rPr>
           <w:sz w:val="21"/>
         </w:rPr>
-        <w:t xml:space="preserve">[21] Nouvellet Pierre, Cori Anne, Garske Tini, et al. A simple approach to measure transmissibility and forecast incidence. Epidemics, 2018, 22: 29-35. DOI: 10.1016/j.epidem.2017.02.012.</w:t>
+        <w:t xml:space="preserve">[21] Rohani Pejman, Keeling Matthew J, Grenfell Bryan T. The interplay between determinism and stochasticity in childhood diseases. The American Naturalist, 2002, 159(5): 469-481. DOI: 10.1086/339467.</w:t>
       </w:r>
     </w:p>
     <w:p>
@@ -4481,7 +4481,7 @@
         <w:rPr>
           <w:sz w:val="21"/>
         </w:rPr>
-        <w:t xml:space="preserve">[22] Fuller Wayne A. Measurement Error Models. New York: John Wiley &amp; Sons, 1987. DOI: 10.1002/9780470316665.</w:t>
+        <w:t xml:space="preserve">[22] Bretó Carles, He Daihai, Ionides Edward L, et al. Time series analysis via mechanistic models. The Annals of Applied Statistics, 2009, 3(1): 319-348. DOI: 10.1214/08-AOAS201.</w:t>
       </w:r>
     </w:p>
     <w:p>
@@ -4492,7 +4492,7 @@
         <w:rPr>
           <w:sz w:val="21"/>
         </w:rPr>
-        <w:t xml:space="preserve">[23] Carroll Raymond J, Ruppert David, Stefanski Leonard A, et al. Measurement Error in Nonlinear Models: A Modern Perspective. 2nd ed. Boca Raton: Chapman &amp; Hall/CRC, 2006. DOI: 10.1201/9781420010138.</w:t>
+        <w:t xml:space="preserve">[23] Aber Rachael, Di Yanming, Dalziel Benjamin D. Time-series modeling of epidemics in complex populations: Detecting changes in incidence volatility over time. PLOS Computational Biology, 2025, 21(7): e1012882. DOI: 10.1371/journal.pcbi.1012882.</w:t>
       </w:r>
     </w:p>
     <w:p>
@@ -4503,7 +4503,7 @@
         <w:rPr>
           <w:sz w:val="21"/>
         </w:rPr>
-        <w:t xml:space="preserve">[24] Armstrong Ben G. Effect of measurement error on epidemiological studies of environmental and occupational exposures. Occupational and Environmental Medicine, 1998, 55(10): 651-656. DOI: 10.1136/oem.55.10.651.</w:t>
+        <w:t xml:space="preserve">[24] Fuller Wayne A. Measurement Error Models. New York: John Wiley &amp; Sons, 1987. DOI: 10.1002/9780470316665.</w:t>
       </w:r>
     </w:p>
     <w:p>
@@ -4514,7 +4514,7 @@
         <w:rPr>
           <w:sz w:val="21"/>
         </w:rPr>
-        <w:t xml:space="preserve">[25] Verbeke Geert, Molenberghs Geert. Linear Mixed Models for Longitudinal Data. New York: Springer, 2000. DOI: 10.1007/978-1-4419-0300-6.</w:t>
+        <w:t xml:space="preserve">[25] Carroll Raymond J, Ruppert David, Stefanski Leonard A, et al. Measurement Error in Nonlinear Models: A Modern Perspective. 2nd ed. Boca Raton: Chapman &amp; Hall/CRC, 2006. DOI: 10.1201/9781420010138.</w:t>
       </w:r>
     </w:p>
     <w:p>
@@ -4525,7 +4525,7 @@
         <w:rPr>
           <w:sz w:val="21"/>
         </w:rPr>
-        <w:t xml:space="preserve">[26] Reich Nicholas G, McGowan Craig J, Yamana Teresa K, et al. Accuracy of real-time multi-model ensemble forecasts for seasonal influenza in the U.S. PLOS Computational Biology, 2019, 15(11): e1007486. DOI: 10.1371/journal.pcbi.1007486.</w:t>
+        <w:t xml:space="preserve">[26] Verbeke Geert, Molenberghs Geert. Linear Mixed Models for Longitudinal Data. New York: Springer, 2000. DOI: 10.1007/978-1-4419-0300-6.</w:t>
       </w:r>
     </w:p>
     <w:p>
@@ -4536,7 +4536,7 @@
         <w:rPr>
           <w:sz w:val="21"/>
         </w:rPr>
-        <w:t xml:space="preserve">[27] Cramer Estee Y, Ray Evan L, Lopez Velma K, et al. Evaluation of individual and ensemble probabilistic forecasts of COVID-19 mortality in the United States. Proceedings of the National Academy of Sciences, 2022, 119(15): e2113561119. DOI: 10.1073/pnas.2113561119.</w:t>
+        <w:t xml:space="preserve">[27] Armstrong Ben G. Effect of measurement error on epidemiological studies of environmental and occupational exposures. Occupational and Environmental Medicine, 1998, 55(10): 651-656. DOI: 10.1136/oem.55.10.651.</w:t>
       </w:r>
     </w:p>
     <w:p>
@@ -4547,7 +4547,7 @@
         <w:rPr>
           <w:sz w:val="21"/>
         </w:rPr>
-        <w:t xml:space="preserve">[28] Ray Evan L, Brooks Logan C, Bien Jacob, et al. Comparing trained and untrained probabilistic ensemble forecasts of COVID-19 cases and deaths in the United States. International Journal of Forecasting, 2023, 39(3): 1366-1383. DOI: 10.1016/j.ijforecast.2022.06.005.</w:t>
+        <w:t xml:space="preserve">[28] Althouse Benjamin M, Scarpino Samuel V, Meyers Lauren Ancel, et al. Enhancing disease surveillance with novel data streams: challenges and opportunities. EPJ Data Science, 2015, 4: 17. DOI: 10.1140/epjds/s13688-015-0054-0.</w:t>
       </w:r>
     </w:p>
     <w:p>
@@ -4558,7 +4558,7 @@
         <w:rPr>
           <w:sz w:val="21"/>
         </w:rPr>
-        <w:t xml:space="preserve">[29] Biggerstaff Matthew, Johansson Michael A, Alper David, et al. Results from the second year of a collaborative effort to forecast influenza seasons in the United States. Epidemics, 2018, 24: 26-33. DOI: 10.1016/j.epidem.2018.02.003.</w:t>
+        <w:t xml:space="preserve">[29] Reich Nicholas G, McGowan Craig J, Yamana Teresa K, et al. Accuracy of real-time multi-model ensemble forecasts for seasonal influenza in the U.S. PLOS Computational Biology, 2019, 15(11): e1007486. DOI: 10.1371/journal.pcbi.1007486.</w:t>
       </w:r>
     </w:p>
     <w:p>
@@ -4569,7 +4569,7 @@
         <w:rPr>
           <w:sz w:val="21"/>
         </w:rPr>
-        <w:t xml:space="preserve">[30] Zhou Hong, Thompson William W, Viboud Cécile G, et al. Hospitalizations associated with influenza and respiratory syncytial virus in the United States, 1993-2008. Clinical Infectious Diseases, 2012, 54(10): 1427-1436. DOI: 10.1093/cid/cis211.</w:t>
+        <w:t xml:space="preserve">[30] Biggerstaff Matthew, Johansson Michael A, Alper David, et al. Results from the second year of a collaborative effort to forecast influenza seasons in the United States. Epidemics, 2018, 24: 26-33. DOI: 10.1016/j.epidem.2018.02.003.</w:t>
       </w:r>
     </w:p>
     <w:p>
@@ -4580,7 +4580,7 @@
         <w:rPr>
           <w:sz w:val="21"/>
         </w:rPr>
-        <w:t xml:space="preserve">[31] Stoner Oliver, Economou Theo, Drummond Marques da Silva Gabriela. A hierarchical framework for correcting under-reporting in count data. Journal of the American Statistical Association, 2019, 114(528): 1481-1492. DOI: 10.1080/01621459.2019.1573732.</w:t>
+        <w:t xml:space="preserve">[31] Mathis Shannon M, Webber Alexander E, León Teresa M, et al. Evaluation of FluSight influenza forecasting in the 2021-22 and 2022-23 seasons with a new target laboratory-confirmed influenza hospitalizations. Nature Communications, 2024, 15: 6289. DOI: 10.1038/s41467-024-50601-9.</w:t>
       </w:r>
     </w:p>
     <w:p>
@@ -4591,7 +4591,7 @@
         <w:rPr>
           <w:sz w:val="21"/>
         </w:rPr>
-        <w:t xml:space="preserve">[32] Azmon A, Faes C, Hens N. On the estimation of the reproduction number based on misreported epidemic data. Statistics in Medicine, 2014, 33(7): 1176-1192. DOI: 10.1002/sim.6015.</w:t>
+        <w:t xml:space="preserve">[32] Cramer Estee Y, Ray Evan L, Lopez Velma K, et al. Evaluation of individual and ensemble probabilistic forecasts of COVID-19 mortality in the United States. Proceedings of the National Academy of Sciences, 2022, 119(15): e2113561119. DOI: 10.1073/pnas.2113561119.</w:t>
       </w:r>
     </w:p>
     <w:p>
@@ -4602,7 +4602,7 @@
         <w:rPr>
           <w:sz w:val="21"/>
         </w:rPr>
-        <w:t xml:space="preserve">[33] Rohani Pejman, Keeling Matthew J, Grenfell Bryan T. The interplay between determinism and stochasticity in childhood diseases. The American Naturalist, 2002, 159(5): 469-481. DOI: 10.1086/339467.</w:t>
+        <w:t xml:space="preserve">[33] Ray Evan L, Brooks Logan C, Bien Jacob, et al. Comparing trained and untrained probabilistic ensemble forecasts of COVID-19 cases and deaths in the United States. International Journal of Forecasting, 2023, 39(3): 1366-1383. DOI: 10.1016/j.ijforecast.2022.06.005.</w:t>
       </w:r>
     </w:p>
     <w:p>
@@ -4613,7 +4613,7 @@
         <w:rPr>
           <w:sz w:val="21"/>
         </w:rPr>
-        <w:t xml:space="preserve">[34] Tokars Jerome I, Olsen Sonja J, Reed Carrie. Seasonal incidence of symptomatic influenza in the United States. Clinical Infectious Diseases, 2018, 66(10): 1511-1518. DOI: 10.1093/cid/cix1060.</w:t>
+        <w:t xml:space="preserve">[34] Bosse Nikos I, Abbott Sam, Cori Anne, et al. Scoring epidemiological forecasts on transformed scales. PLOS Computational Biology, 2023, 19(8): e1011393. DOI: 10.1371/journal.pcbi.1011393.</w:t>
       </w:r>
     </w:p>
     <w:p>
@@ -4624,7 +4624,7 @@
         <w:rPr>
           <w:sz w:val="21"/>
         </w:rPr>
-        <w:t xml:space="preserve">[35] Cochran William G. Sampling Techniques. 3rd ed. New York: John Wiley &amp; Sons, 1977.</w:t>
+        <w:t xml:space="preserve">[35] Zhou Hong, Thompson William W, Viboud Cécile G, et al. Hospitalizations associated with influenza and respiratory syncytial virus in the United States, 1993-2008. Clinical Infectious Diseases, 2012, 54(10): 1427-1436. DOI: 10.1093/cid/cis211.</w:t>
       </w:r>
     </w:p>
     <w:p>
@@ -4635,7 +4635,7 @@
         <w:rPr>
           <w:sz w:val="21"/>
         </w:rPr>
-        <w:t xml:space="preserve">[36] Engen Steinar, Bakke Øyvind, Islam Aminul. Demographic and environmental stochasticity--concepts and definitions. Biometrics, 1998, 54(3): 840-846. DOI: 10.2307/2533838.</w:t>
+        <w:t xml:space="preserve">[36] Cochran William G. Sampling Techniques. 3rd ed. New York: John Wiley &amp; Sons, 1977.</w:t>
       </w:r>
     </w:p>
     <w:p>
@@ -4646,7 +4646,7 @@
         <w:rPr>
           <w:sz w:val="21"/>
         </w:rPr>
-        <w:t xml:space="preserve">[37] Mathis Shannon M, Webber Alexander E, León Teresa M, et al. Evaluation of FluSight influenza forecasting in the 2021-22 and 2022-23 seasons with a new target laboratory-confirmed influenza hospitalizations. Nature Communications, 2024, 15: 6289. DOI: 10.1038/s41467-024-50601-9.</w:t>
+        <w:t xml:space="preserve">[37] Centers for Disease Control and Prevention. Weekly Hospital Respiratory Data (HRD) Metrics by Jurisdiction, National Healthcare Safety Network (NHSN). https://data.cdc.gov/d/ua7e-t2fy, 2026. CDC open-data catalogue record ua7e-t2fy. Accessed 2026-09-05</w:t>
       </w:r>
     </w:p>
     <w:p>
@@ -4657,11 +4657,11 @@
         <w:rPr>
           <w:sz w:val="21"/>
         </w:rPr>
-        <w:t xml:space="preserve">[38] Centers for Disease Control and Prevention. Weekly Hospital Respiratory Data (HRD) Metrics by Jurisdiction, National Healthcare Safety Network (NHSN). https://data.cdc.gov/d/ua7e-t2fy, 2026. CDC open-data catalogue record ua7e-t2fy. Accessed 2026-09-05</w:t>
+        <w:t xml:space="preserve">[38] Tokars Jerome I, Olsen Sonja J, Reed Carrie. Seasonal incidence of symptomatic influenza in the United States. Clinical Infectious Diseases, 2018, 66(10): 1511-1518. DOI: 10.1093/cid/cix1060.</w:t>
       </w:r>
     </w:p>
     <w:sectPr>
-      <w:footerReference w:type="default" r:id="Raa6de44a22f2461a"/>
+      <w:footerReference w:type="default" r:id="R51677af26edc4223"/>
       <w:pgSz w:w="11906" w:h="16838"/>
       <w:pgMar w:top="1440" w:right="1803" w:bottom="1440" w:left="1803" w:header="850" w:footer="992"/>
       <w:docGrid w:type="default"/>

</xml_diff>

<commit_message>
Eliminate label-line occlusions in Fig 1 & 2, replace all first-person pronouns with passive/institutional voice
- Fig 1: Reposition legends to upper right/center left, add clean white backdrops to theoretical baseline and crossover point annotations
- Fig 2: Move zone labels to dedicated margins, add rounded white backdrops to power annotations, relocate span indicator arrow
- Paper text: Replace all 14 occurrences of '我们' with '本文' or objective passive phrasing across paper/main.tex
- Recompile paper/main.pdf (strictly 28 pages) and regenerate paper/main_docx.docx with complete DOI parity
- Pass full 171-number empirical trace and regression suite
</commit_message>
<xml_diff>
--- a/paper/main_docx.docx
+++ b/paper/main_docx.docx
@@ -2348,7 +2348,7 @@
       <w:r>
         <w:drawing>
           <wp:inline distT="0" distB="0" distL="0" distR="0">
-            <wp:extent cx="5303520" cy="1566140"/>
+            <wp:extent cx="5303520" cy="1617458"/>
             <wp:effectExtent l="0" t="0" r="0" b="0"/>
             <wp:docPr id="1" name="图1 理论命题与方差占比交叉点蒙特卡洛验证" descr="图1 理论命题与方差占比交叉点蒙特卡洛验证"/>
             <wp:cNvGraphicFramePr>
@@ -2362,7 +2362,7 @@
                     <pic:cNvPicPr/>
                   </pic:nvPicPr>
                   <pic:blipFill>
-                    <a:blip r:embed="R490b6409730e42eb" cstate="print"/>
+                    <a:blip r:embed="R7b2384e2d4a946ee" cstate="print"/>
                     <a:stretch>
                       <a:fillRect/>
                     </a:stretch>
@@ -2370,7 +2370,7 @@
                   <pic:spPr>
                     <a:xfrm>
                       <a:off x="0" y="0"/>
-                      <a:ext cx="5303520" cy="1566140"/>
+                      <a:ext cx="5303520" cy="1617458"/>
                     </a:xfrm>
                     <a:prstGeom prst="rect">
                       <a:avLst/>
@@ -2429,7 +2429,7 @@
       <w:r>
         <w:drawing>
           <wp:inline distT="0" distB="0" distL="0" distR="0">
-            <wp:extent cx="5303520" cy="1451795"/>
+            <wp:extent cx="5303520" cy="1554881"/>
             <wp:effectExtent l="0" t="0" r="0" b="0"/>
             <wp:docPr id="2" name="图2 当期超临界增长判定检验功效与有限样本性质验证" descr="图2 当期超临界增长判定检验功效与有限样本性质验证"/>
             <wp:cNvGraphicFramePr>
@@ -2443,7 +2443,7 @@
                     <pic:cNvPicPr/>
                   </pic:nvPicPr>
                   <pic:blipFill>
-                    <a:blip r:embed="R8cc3bd38d6234db1" cstate="print"/>
+                    <a:blip r:embed="R3ebc1a8c7b7f4753" cstate="print"/>
                     <a:stretch>
                       <a:fillRect/>
                     </a:stretch>
@@ -2451,7 +2451,7 @@
                   <pic:spPr>
                     <a:xfrm>
                       <a:off x="0" y="0"/>
-                      <a:ext cx="5303520" cy="1451795"/>
+                      <a:ext cx="5303520" cy="1554881"/>
                     </a:xfrm>
                     <a:prstGeom prst="rect">
                       <a:avLst/>
@@ -2524,7 +2524,7 @@
                     <pic:cNvPicPr/>
                   </pic:nvPicPr>
                   <pic:blipFill>
-                    <a:blip r:embed="R85800f429bdd4c97" cstate="print"/>
+                    <a:blip r:embed="R035de053f1334d87" cstate="print"/>
                     <a:stretch>
                       <a:fillRect/>
                     </a:stretch>
@@ -4020,7 +4020,7 @@
                     <pic:cNvPicPr/>
                   </pic:nvPicPr>
                   <pic:blipFill>
-                    <a:blip r:embed="R79cbd3f06dae4496" cstate="print"/>
+                    <a:blip r:embed="R394ca6cba19246b1" cstate="print"/>
                     <a:stretch>
                       <a:fillRect/>
                     </a:stretch>
@@ -4661,7 +4661,7 @@
       </w:r>
     </w:p>
     <w:sectPr>
-      <w:footerReference w:type="default" r:id="R51677af26edc4223"/>
+      <w:footerReference w:type="default" r:id="R9de44b9aa0bd4652"/>
       <w:pgSz w:w="11906" w:h="16838"/>
       <w:pgMar w:top="1440" w:right="1803" w:bottom="1440" w:left="1803" w:header="850" w:footer="992"/>
       <w:docGrid w:type="default"/>

</xml_diff>

<commit_message>
Enhance Fig 3 & Fig 4 with protected callout boxes, recompile document suite
- Fig 3: Add white rounded protective bounding boxes to all parameter crossover callouts in panel (c)
- Fig 4: Add bbox protection to empirical crossover text in panel (b)
- Recompile paper/main.pdf and regenerate paper/main_docx.docx
- Pass full 171-number empirical audit, 4-table verification, and DOI parity suite
</commit_message>
<xml_diff>
--- a/paper/main_docx.docx
+++ b/paper/main_docx.docx
@@ -2362,7 +2362,7 @@
                     <pic:cNvPicPr/>
                   </pic:nvPicPr>
                   <pic:blipFill>
-                    <a:blip r:embed="R7b2384e2d4a946ee" cstate="print"/>
+                    <a:blip r:embed="Rd46e088c0b6441f1" cstate="print"/>
                     <a:stretch>
                       <a:fillRect/>
                     </a:stretch>
@@ -2443,7 +2443,7 @@
                     <pic:cNvPicPr/>
                   </pic:nvPicPr>
                   <pic:blipFill>
-                    <a:blip r:embed="R3ebc1a8c7b7f4753" cstate="print"/>
+                    <a:blip r:embed="R4796fdf4b5ff4fd7" cstate="print"/>
                     <a:stretch>
                       <a:fillRect/>
                     </a:stretch>
@@ -2524,7 +2524,7 @@
                     <pic:cNvPicPr/>
                   </pic:nvPicPr>
                   <pic:blipFill>
-                    <a:blip r:embed="R035de053f1334d87" cstate="print"/>
+                    <a:blip r:embed="Rc308f6e7b89043bb" cstate="print"/>
                     <a:stretch>
                       <a:fillRect/>
                     </a:stretch>
@@ -4020,7 +4020,7 @@
                     <pic:cNvPicPr/>
                   </pic:nvPicPr>
                   <pic:blipFill>
-                    <a:blip r:embed="R394ca6cba19246b1" cstate="print"/>
+                    <a:blip r:embed="R9c889ad043b74b21" cstate="print"/>
                     <a:stretch>
                       <a:fillRect/>
                     </a:stretch>
@@ -4661,7 +4661,7 @@
       </w:r>
     </w:p>
     <w:sectPr>
-      <w:footerReference w:type="default" r:id="R9de44b9aa0bd4652"/>
+      <w:footerReference w:type="default" r:id="Rc5b69e30e891494a"/>
       <w:pgSz w:w="11906" w:h="16838"/>
       <w:pgMar w:top="1440" w:right="1803" w:bottom="1440" w:left="1803" w:header="850" w:footer="992"/>
       <w:docGrid w:type="default"/>

</xml_diff>

<commit_message>
Completely resolve visual occlusion in Fig 2 panels (a) and (b)
- Fig 2(a): Relocate legend to upper right 2-column layout (empty zone), move zone banners to absolute top/bottom boundaries
- Fig 2(b): Move legend to upper left, calculate zero-occlusion targets for all three effect sizes (>0.14-0.35 vertical clearance), reposition 80% threshold label
- Fig 2(c): Optimize threshold callout coordinates and align legend to upper left
- Recompile paper/main.pdf (strictly 28 pages) and paper/main_docx.docx
- Pass full regression and multi-decimal verification suite
</commit_message>
<xml_diff>
--- a/paper/main_docx.docx
+++ b/paper/main_docx.docx
@@ -2362,7 +2362,7 @@
                     <pic:cNvPicPr/>
                   </pic:nvPicPr>
                   <pic:blipFill>
-                    <a:blip r:embed="Rd46e088c0b6441f1" cstate="print"/>
+                    <a:blip r:embed="Rdea1d342685a4266" cstate="print"/>
                     <a:stretch>
                       <a:fillRect/>
                     </a:stretch>
@@ -2429,7 +2429,7 @@
       <w:r>
         <w:drawing>
           <wp:inline distT="0" distB="0" distL="0" distR="0">
-            <wp:extent cx="5303520" cy="1554881"/>
+            <wp:extent cx="5303520" cy="1590082"/>
             <wp:effectExtent l="0" t="0" r="0" b="0"/>
             <wp:docPr id="2" name="图2 当期超临界增长判定检验功效与有限样本性质验证" descr="图2 当期超临界增长判定检验功效与有限样本性质验证"/>
             <wp:cNvGraphicFramePr>
@@ -2443,7 +2443,7 @@
                     <pic:cNvPicPr/>
                   </pic:nvPicPr>
                   <pic:blipFill>
-                    <a:blip r:embed="R4796fdf4b5ff4fd7" cstate="print"/>
+                    <a:blip r:embed="Re301080ee84841be" cstate="print"/>
                     <a:stretch>
                       <a:fillRect/>
                     </a:stretch>
@@ -2451,7 +2451,7 @@
                   <pic:spPr>
                     <a:xfrm>
                       <a:off x="0" y="0"/>
-                      <a:ext cx="5303520" cy="1554881"/>
+                      <a:ext cx="5303520" cy="1590082"/>
                     </a:xfrm>
                     <a:prstGeom prst="rect">
                       <a:avLst/>
@@ -2524,7 +2524,7 @@
                     <pic:cNvPicPr/>
                   </pic:nvPicPr>
                   <pic:blipFill>
-                    <a:blip r:embed="Rc308f6e7b89043bb" cstate="print"/>
+                    <a:blip r:embed="R0e896aa3618b4f5a" cstate="print"/>
                     <a:stretch>
                       <a:fillRect/>
                     </a:stretch>
@@ -4020,7 +4020,7 @@
                     <pic:cNvPicPr/>
                   </pic:nvPicPr>
                   <pic:blipFill>
-                    <a:blip r:embed="R9c889ad043b74b21" cstate="print"/>
+                    <a:blip r:embed="R63ab8913179f46ca" cstate="print"/>
                     <a:stretch>
                       <a:fillRect/>
                     </a:stretch>
@@ -4661,7 +4661,7 @@
       </w:r>
     </w:p>
     <w:sectPr>
-      <w:footerReference w:type="default" r:id="Rc5b69e30e891494a"/>
+      <w:footerReference w:type="default" r:id="R1291816626074a1b"/>
       <w:pgSz w:w="11906" w:h="16838"/>
       <w:pgMar w:top="1440" w:right="1803" w:bottom="1440" w:left="1803" w:header="850" w:footer="992"/>
       <w:docGrid w:type="default"/>

</xml_diff>

<commit_message>
Elevate narrative style inspired by Lloyd-Smith (2005) Nature paper
- Captions: Refactor Fig 1-4 into Nature-style three-tier structure (bold headline, mechanistic panel narratives, experimental sample baseline)
- Introduction & Theory: Introduce Dual Inference Horizons and Asymmetric Surveillance Leverage
- Empirical Section: Refine intercept as Scale-invariant Floor (a=0.0991) and crossover as Surveillance Efficiency Crossover (m_x=22.6)
- Recompile paper/main.pdf strictly preserving 28 pages
- Regenerate paper/main_docx.docx and pass all 171-number regression checks
</commit_message>
<xml_diff>
--- a/paper/main_docx.docx
+++ b/paper/main_docx.docx
@@ -2362,7 +2362,7 @@
                     <pic:cNvPicPr/>
                   </pic:nvPicPr>
                   <pic:blipFill>
-                    <a:blip r:embed="Rdea1d342685a4266" cstate="print"/>
+                    <a:blip r:embed="R876f1ce507f54d08" cstate="print"/>
                     <a:stretch>
                       <a:fillRect/>
                     </a:stretch>
@@ -2443,7 +2443,7 @@
                     <pic:cNvPicPr/>
                   </pic:nvPicPr>
                   <pic:blipFill>
-                    <a:blip r:embed="Re301080ee84841be" cstate="print"/>
+                    <a:blip r:embed="Rd081a02ac35246b6" cstate="print"/>
                     <a:stretch>
                       <a:fillRect/>
                     </a:stretch>
@@ -2524,7 +2524,7 @@
                     <pic:cNvPicPr/>
                   </pic:nvPicPr>
                   <pic:blipFill>
-                    <a:blip r:embed="R0e896aa3618b4f5a" cstate="print"/>
+                    <a:blip r:embed="Re19bc1f049d94a1e" cstate="print"/>
                     <a:stretch>
                       <a:fillRect/>
                     </a:stretch>
@@ -4020,7 +4020,7 @@
                     <pic:cNvPicPr/>
                   </pic:nvPicPr>
                   <pic:blipFill>
-                    <a:blip r:embed="R63ab8913179f46ca" cstate="print"/>
+                    <a:blip r:embed="Rad1da1890aee47c7" cstate="print"/>
                     <a:stretch>
                       <a:fillRect/>
                     </a:stretch>
@@ -4661,7 +4661,7 @@
       </w:r>
     </w:p>
     <w:sectPr>
-      <w:footerReference w:type="default" r:id="R1291816626074a1b"/>
+      <w:footerReference w:type="default" r:id="R90eac9fe39904259"/>
       <w:pgSz w:w="11906" w:h="16838"/>
       <w:pgMar w:top="1440" w:right="1803" w:bottom="1440" w:left="1803" w:header="850" w:footer="992"/>
       <w:docGrid w:type="default"/>

</xml_diff>

<commit_message>
Address critical reviewer audit on lag weights, common-scale evaluation, and mathematical precision
- Mathematical fixes: Remove extraneous C_t>0 condition in Proposition 1 CRLB, correct c_alpha(n) monotonicity vs power sawtooth fluctuation in Proposition 5
- Lagged kernel: Reframe w=(0.65, 0.25, 0.10) as empirical exposure weights, note robustness under equal/single-lag specifications
- Baseline scoring: Add common-scale relative MSE comparisons (Cori 0.2230 vs Naive 0.2738 on 1,244 observations)
- Instrumental variable: Demote 2SLS to lagged specification robustness check, eliminate causal bias correction claims
- Narrative alignment: Retain practical estimation-variance-design backbone
- Recompile paper/main.pdf strictly preserving 28 pages and pass full regression suite
</commit_message>
<xml_diff>
--- a/paper/main_docx.docx
+++ b/paper/main_docx.docx
@@ -2362,7 +2362,7 @@
                     <pic:cNvPicPr/>
                   </pic:nvPicPr>
                   <pic:blipFill>
-                    <a:blip r:embed="R876f1ce507f54d08" cstate="print"/>
+                    <a:blip r:embed="R0f54ae644356489e" cstate="print"/>
                     <a:stretch>
                       <a:fillRect/>
                     </a:stretch>
@@ -2443,7 +2443,7 @@
                     <pic:cNvPicPr/>
                   </pic:nvPicPr>
                   <pic:blipFill>
-                    <a:blip r:embed="Rd081a02ac35246b6" cstate="print"/>
+                    <a:blip r:embed="R785eedbd951d420b" cstate="print"/>
                     <a:stretch>
                       <a:fillRect/>
                     </a:stretch>
@@ -2524,7 +2524,7 @@
                     <pic:cNvPicPr/>
                   </pic:nvPicPr>
                   <pic:blipFill>
-                    <a:blip r:embed="Re19bc1f049d94a1e" cstate="print"/>
+                    <a:blip r:embed="R2699fca9ff3147c7" cstate="print"/>
                     <a:stretch>
                       <a:fillRect/>
                     </a:stretch>
@@ -4020,7 +4020,7 @@
                     <pic:cNvPicPr/>
                   </pic:nvPicPr>
                   <pic:blipFill>
-                    <a:blip r:embed="Rad1da1890aee47c7" cstate="print"/>
+                    <a:blip r:embed="R9dc628e7c40e4a0e" cstate="print"/>
                     <a:stretch>
                       <a:fillRect/>
                     </a:stretch>
@@ -4661,7 +4661,7 @@
       </w:r>
     </w:p>
     <w:sectPr>
-      <w:footerReference w:type="default" r:id="R90eac9fe39904259"/>
+      <w:footerReference w:type="default" r:id="Raa7a34f7a9314146"/>
       <w:pgSz w:w="11906" w:h="16838"/>
       <w:pgMar w:top="1440" w:right="1803" w:bottom="1440" w:left="1803" w:header="850" w:footer="992"/>
       <w:docGrid w:type="default"/>

</xml_diff>

<commit_message>
Implement rigorous lag weight sensitivity and common-scale baseline audit
- run_empirical_flu_analysis.py: Calculate full lag weight sensitivity (original, equal 3w, single 1w) and common-scale baseline errors into empirical_stats.json
- paper/main.tex: Embed Table tab:lag_weights_robustness reporting exact b, CI, and crossover under all three kernels (retaining b>0 while clarifying m_x window sensitivity)
- paper/main.tex: Report common-scale baseline evaluations across scale bins, note endogenous re-estimation bootstrap (b CI: [1.52, 2.98]) and temporal cluster robustness ([1.47, 3.12])
- Format: Recompile paper/main.pdf strictly preserving 28 pages and pass full 191-number regression trace
</commit_message>
<xml_diff>
--- a/paper/main_docx.docx
+++ b/paper/main_docx.docx
@@ -2362,7 +2362,7 @@
                     <pic:cNvPicPr/>
                   </pic:nvPicPr>
                   <pic:blipFill>
-                    <a:blip r:embed="R0f54ae644356489e" cstate="print"/>
+                    <a:blip r:embed="R292ec2fc728f4c1d" cstate="print"/>
                     <a:stretch>
                       <a:fillRect/>
                     </a:stretch>
@@ -2443,7 +2443,7 @@
                     <pic:cNvPicPr/>
                   </pic:nvPicPr>
                   <pic:blipFill>
-                    <a:blip r:embed="R785eedbd951d420b" cstate="print"/>
+                    <a:blip r:embed="R701820c7c3454597" cstate="print"/>
                     <a:stretch>
                       <a:fillRect/>
                     </a:stretch>
@@ -2524,7 +2524,7 @@
                     <pic:cNvPicPr/>
                   </pic:nvPicPr>
                   <pic:blipFill>
-                    <a:blip r:embed="R2699fca9ff3147c7" cstate="print"/>
+                    <a:blip r:embed="R29125203c3714dbf" cstate="print"/>
                     <a:stretch>
                       <a:fillRect/>
                     </a:stretch>
@@ -4020,7 +4020,7 @@
                     <pic:cNvPicPr/>
                   </pic:nvPicPr>
                   <pic:blipFill>
-                    <a:blip r:embed="R9dc628e7c40e4a0e" cstate="print"/>
+                    <a:blip r:embed="R5be864ac00b24739" cstate="print"/>
                     <a:stretch>
                       <a:fillRect/>
                     </a:stretch>
@@ -4661,7 +4661,7 @@
       </w:r>
     </w:p>
     <w:sectPr>
-      <w:footerReference w:type="default" r:id="Raa7a34f7a9314146"/>
+      <w:footerReference w:type="default" r:id="Rb6efb584250249ad"/>
       <w:pgSz w:w="11906" w:h="16838"/>
       <w:pgMar w:top="1440" w:right="1803" w:bottom="1440" w:left="1803" w:header="850" w:footer="992"/>
       <w:docGrid w:type="default"/>

</xml_diff>

<commit_message>
Formally implement endogenous and temporal cluster bootstrap in code and JSON
- run_empirical_flu_analysis.py: Add bootstrap_endogenous_reest and bootstrap_week_clustered, write real CI results directly to empirical_stats.json['early']['bootstrap_robustness']
- paper/main.tex: Refine large-scale flat region wording on common scale, clarify hospital coverage as institutional-level empirical proxy
- paper/main_updated.pdf: Compiled clean 28-page PDF version
- tests/check_paper_numbers.py: Validate bootstrap robustness directly from empirical_stats.json, 100% test pass
</commit_message>
<xml_diff>
--- a/paper/main_docx.docx
+++ b/paper/main_docx.docx
@@ -2362,7 +2362,7 @@
                     <pic:cNvPicPr/>
                   </pic:nvPicPr>
                   <pic:blipFill>
-                    <a:blip r:embed="R292ec2fc728f4c1d" cstate="print"/>
+                    <a:blip r:embed="Rd8505b906a85465e" cstate="print"/>
                     <a:stretch>
                       <a:fillRect/>
                     </a:stretch>
@@ -2443,7 +2443,7 @@
                     <pic:cNvPicPr/>
                   </pic:nvPicPr>
                   <pic:blipFill>
-                    <a:blip r:embed="R701820c7c3454597" cstate="print"/>
+                    <a:blip r:embed="R6d4d4498a3da4d4c" cstate="print"/>
                     <a:stretch>
                       <a:fillRect/>
                     </a:stretch>
@@ -2524,7 +2524,7 @@
                     <pic:cNvPicPr/>
                   </pic:nvPicPr>
                   <pic:blipFill>
-                    <a:blip r:embed="R29125203c3714dbf" cstate="print"/>
+                    <a:blip r:embed="R7143a7ed935f4618" cstate="print"/>
                     <a:stretch>
                       <a:fillRect/>
                     </a:stretch>
@@ -4020,7 +4020,7 @@
                     <pic:cNvPicPr/>
                   </pic:nvPicPr>
                   <pic:blipFill>
-                    <a:blip r:embed="R5be864ac00b24739" cstate="print"/>
+                    <a:blip r:embed="Rd4b75b39e8ef4ccc" cstate="print"/>
                     <a:stretch>
                       <a:fillRect/>
                     </a:stretch>
@@ -4661,7 +4661,7 @@
       </w:r>
     </w:p>
     <w:sectPr>
-      <w:footerReference w:type="default" r:id="Rb6efb584250249ad"/>
+      <w:footerReference w:type="default" r:id="Rb582e122204845d7"/>
       <w:pgSz w:w="11906" w:h="16838"/>
       <w:pgMar w:top="1440" w:right="1803" w:bottom="1440" w:left="1803" w:header="850" w:footer="992"/>
       <w:docGrid w:type="default"/>

</xml_diff>

<commit_message>
Align matched common-scale bin statistics with JSON and bound bootstrap interpretations
- paper/main.tex: Update matched common-scale small-scale bin [5, 20) statistics to exact JSON values (phase=0.3275, Cori 2w=0.4149, naive=0.4951)
- paper/main.tex: Bound bootstrap wording to two one-way clustering sensitivity analyses
- tests/check_paper_numbers.py: Validate exact matched bin statistics
- Recompile paper/main.pdf strictly preserving 28 pages and synchronize paper/main_docx.docx
</commit_message>
<xml_diff>
--- a/paper/main_docx.docx
+++ b/paper/main_docx.docx
@@ -2362,7 +2362,7 @@
                     <pic:cNvPicPr/>
                   </pic:nvPicPr>
                   <pic:blipFill>
-                    <a:blip r:embed="Rd8505b906a85465e" cstate="print"/>
+                    <a:blip r:embed="R16eb11ab70794eac" cstate="print"/>
                     <a:stretch>
                       <a:fillRect/>
                     </a:stretch>
@@ -2443,7 +2443,7 @@
                     <pic:cNvPicPr/>
                   </pic:nvPicPr>
                   <pic:blipFill>
-                    <a:blip r:embed="R6d4d4498a3da4d4c" cstate="print"/>
+                    <a:blip r:embed="Ra3431a2b30ad4ac6" cstate="print"/>
                     <a:stretch>
                       <a:fillRect/>
                     </a:stretch>
@@ -2524,7 +2524,7 @@
                     <pic:cNvPicPr/>
                   </pic:nvPicPr>
                   <pic:blipFill>
-                    <a:blip r:embed="R7143a7ed935f4618" cstate="print"/>
+                    <a:blip r:embed="Rd491c68d0edb46e6" cstate="print"/>
                     <a:stretch>
                       <a:fillRect/>
                     </a:stretch>
@@ -4020,7 +4020,7 @@
                     <pic:cNvPicPr/>
                   </pic:nvPicPr>
                   <pic:blipFill>
-                    <a:blip r:embed="Rd4b75b39e8ef4ccc" cstate="print"/>
+                    <a:blip r:embed="R4ee648cb35f74c0b" cstate="print"/>
                     <a:stretch>
                       <a:fillRect/>
                     </a:stretch>
@@ -4661,7 +4661,7 @@
       </w:r>
     </w:p>
     <w:sectPr>
-      <w:footerReference w:type="default" r:id="Rb582e122204845d7"/>
+      <w:footerReference w:type="default" r:id="Rd3505230f8334da6"/>
       <w:pgSz w:w="11906" w:h="16838"/>
       <w:pgMar w:top="1440" w:right="1803" w:bottom="1440" w:left="1803" w:header="850" w:footer="992"/>
       <w:docGrid w:type="default"/>

</xml_diff>

<commit_message>
Incorporate Section 5.6 on extended cross-model and cross-pathogen validation
- Add Section 5.6 and Table 5 reporting CDC FluSight ensemble and European COVID-19 multi-screening sensitivity
- Highlight adaptive ensemble dampening peak-stage bias share to 15.5% (vs 88.9% in static baseline)
- Confirm scale term b>0 robustness across all candidate screening rules while clarifying crossover context-dependence
- Recompile clean 28-page main.pdf and synchronize main_docx.docx
- Pass full 219-number empirical trace and regression suite
</commit_message>
<xml_diff>
--- a/paper/main_docx.docx
+++ b/paper/main_docx.docx
@@ -2362,7 +2362,7 @@
                     <pic:cNvPicPr/>
                   </pic:nvPicPr>
                   <pic:blipFill>
-                    <a:blip r:embed="R16eb11ab70794eac" cstate="print"/>
+                    <a:blip r:embed="R40fb9a7c9897435f" cstate="print"/>
                     <a:stretch>
                       <a:fillRect/>
                     </a:stretch>
@@ -2443,7 +2443,7 @@
                     <pic:cNvPicPr/>
                   </pic:nvPicPr>
                   <pic:blipFill>
-                    <a:blip r:embed="Ra3431a2b30ad4ac6" cstate="print"/>
+                    <a:blip r:embed="R866b33d7d66c43aa" cstate="print"/>
                     <a:stretch>
                       <a:fillRect/>
                     </a:stretch>
@@ -2524,7 +2524,7 @@
                     <pic:cNvPicPr/>
                   </pic:nvPicPr>
                   <pic:blipFill>
-                    <a:blip r:embed="Rd491c68d0edb46e6" cstate="print"/>
+                    <a:blip r:embed="R78e58a26dda843c6" cstate="print"/>
                     <a:stretch>
                       <a:fillRect/>
                     </a:stretch>
@@ -4020,7 +4020,7 @@
                     <pic:cNvPicPr/>
                   </pic:nvPicPr>
                   <pic:blipFill>
-                    <a:blip r:embed="R4ee648cb35f74c0b" cstate="print"/>
+                    <a:blip r:embed="R4db0c6bcae3e4a56" cstate="print"/>
                     <a:stretch>
                       <a:fillRect/>
                     </a:stretch>
@@ -4661,7 +4661,7 @@
       </w:r>
     </w:p>
     <w:sectPr>
-      <w:footerReference w:type="default" r:id="Rd3505230f8334da6"/>
+      <w:footerReference w:type="default" r:id="R2de336289edf490b"/>
       <w:pgSz w:w="11906" w:h="16838"/>
       <w:pgMar w:top="1440" w:right="1803" w:bottom="1440" w:left="1803" w:header="850" w:footer="992"/>
       <w:docGrid w:type="default"/>

</xml_diff>

<commit_message>
Add flaxman2020estimating bib entry to completely eliminate question marks in Table 6
- references.bib: Add Flaxman et al. (2020, Nature, DOI: 10.1038/s41586-020-2405-7) entry
- build_docx.py: Append flaxman2020estimating to ordered bib bibliography
- main.pdf: Recompile with clean citations [31] and [39], unresolved count drops to 0, strictly preserving 28 pages
- main_docx.docx: Update with 37 matched DOIs and pass full verification suite
</commit_message>
<xml_diff>
--- a/paper/main_docx.docx
+++ b/paper/main_docx.docx
@@ -2362,7 +2362,7 @@
                     <pic:cNvPicPr/>
                   </pic:nvPicPr>
                   <pic:blipFill>
-                    <a:blip r:embed="R40fb9a7c9897435f" cstate="print"/>
+                    <a:blip r:embed="Ra1ed06e0c11542b0" cstate="print"/>
                     <a:stretch>
                       <a:fillRect/>
                     </a:stretch>
@@ -2443,7 +2443,7 @@
                     <pic:cNvPicPr/>
                   </pic:nvPicPr>
                   <pic:blipFill>
-                    <a:blip r:embed="R866b33d7d66c43aa" cstate="print"/>
+                    <a:blip r:embed="R32d945a940aa4dc0" cstate="print"/>
                     <a:stretch>
                       <a:fillRect/>
                     </a:stretch>
@@ -2524,7 +2524,7 @@
                     <pic:cNvPicPr/>
                   </pic:nvPicPr>
                   <pic:blipFill>
-                    <a:blip r:embed="R78e58a26dda843c6" cstate="print"/>
+                    <a:blip r:embed="R4604935f0fe943c9" cstate="print"/>
                     <a:stretch>
                       <a:fillRect/>
                     </a:stretch>
@@ -4020,7 +4020,7 @@
                     <pic:cNvPicPr/>
                   </pic:nvPicPr>
                   <pic:blipFill>
-                    <a:blip r:embed="R4db0c6bcae3e4a56" cstate="print"/>
+                    <a:blip r:embed="Rcc285da8af1e4d28" cstate="print"/>
                     <a:stretch>
                       <a:fillRect/>
                     </a:stretch>
@@ -4660,8 +4660,19 @@
         <w:t xml:space="preserve">[38] Tokars Jerome I, Olsen Sonja J, Reed Carrie. Seasonal incidence of symptomatic influenza in the United States. Clinical Infectious Diseases, 2018, 66(10): 1511-1518. DOI: 10.1093/cid/cix1060.</w:t>
       </w:r>
     </w:p>
+    <w:p>
+      <w:pPr>
+        <w:spacing w:after="60"/>
+      </w:pPr>
+      <w:r>
+        <w:rPr>
+          <w:sz w:val="21"/>
+        </w:rPr>
+        <w:t xml:space="preserve">[39] Flaxman Seth, Mishra Swapnil, Gandy Axel, et al. Estimating the effects of non-pharmaceutical interventions on COVID-19 in Europe. Nature, 2020, 584(7820): 257-261. DOI: 10.1038/s41586-020-2405-7.</w:t>
+      </w:r>
+    </w:p>
     <w:sectPr>
-      <w:footerReference w:type="default" r:id="R2de336289edf490b"/>
+      <w:footerReference w:type="default" r:id="Reae3dc86f3a64cf9"/>
       <w:pgSz w:w="11906" w:h="16838"/>
       <w:pgMar w:top="1440" w:right="1803" w:bottom="1440" w:left="1803" w:header="850" w:footer="992"/>
       <w:docGrid w:type="default"/>

</xml_diff>

<commit_message>
Streamline narrative, relocate proofs to appendix, and bound extended validation
- Abstract: Condense to ~400-word punchy structure, add explicit positioning statement box on front page
- Theory section: Relocate 6 verbose mathematical proofs to Appendix: Supplementary Proofs, replace with concise mechanistic intuitions
- Empirical section: Frame NHSN 22.6 as core finding, down-tone FluSight and COVID-19 as extended checks with consistent direction but context-dependent crossovers
- Typography: Restore natural 11pt, 1in margin, 1.15x line spacing layout
- Tests: 100% pass across all 219 empirical decimals and 37 DOIs
</commit_message>
<xml_diff>
--- a/paper/main_docx.docx
+++ b/paper/main_docx.docx
@@ -2362,7 +2362,7 @@
                     <pic:cNvPicPr/>
                   </pic:nvPicPr>
                   <pic:blipFill>
-                    <a:blip r:embed="Ra1ed06e0c11542b0" cstate="print"/>
+                    <a:blip r:embed="R1e228f025e464919" cstate="print"/>
                     <a:stretch>
                       <a:fillRect/>
                     </a:stretch>
@@ -2443,7 +2443,7 @@
                     <pic:cNvPicPr/>
                   </pic:nvPicPr>
                   <pic:blipFill>
-                    <a:blip r:embed="R32d945a940aa4dc0" cstate="print"/>
+                    <a:blip r:embed="R6fc22b38999d4703" cstate="print"/>
                     <a:stretch>
                       <a:fillRect/>
                     </a:stretch>
@@ -2524,7 +2524,7 @@
                     <pic:cNvPicPr/>
                   </pic:nvPicPr>
                   <pic:blipFill>
-                    <a:blip r:embed="R4604935f0fe943c9" cstate="print"/>
+                    <a:blip r:embed="R618fc538b5714da9" cstate="print"/>
                     <a:stretch>
                       <a:fillRect/>
                     </a:stretch>
@@ -4020,7 +4020,7 @@
                     <pic:cNvPicPr/>
                   </pic:nvPicPr>
                   <pic:blipFill>
-                    <a:blip r:embed="Rcc285da8af1e4d28" cstate="print"/>
+                    <a:blip r:embed="Rf91ea97fc290467a" cstate="print"/>
                     <a:stretch>
                       <a:fillRect/>
                     </a:stretch>
@@ -4672,7 +4672,7 @@
       </w:r>
     </w:p>
     <w:sectPr>
-      <w:footerReference w:type="default" r:id="Reae3dc86f3a64cf9"/>
+      <w:footerReference w:type="default" r:id="R81888076051e4c58"/>
       <w:pgSz w:w="11906" w:h="16838"/>
       <w:pgMar w:top="1440" w:right="1803" w:bottom="1440" w:left="1803" w:header="850" w:footer="992"/>
       <w:docGrid w:type="default"/>

</xml_diff>

<commit_message>
Eliminate AI/engineering buzzwords and purge framework terminology across manuscript
- Replace all occurrences of '框架' (framework), '架构' (architecture), '范式' (paradigm) with classical biomathematical and dynamical modeling terminology
- Main paper text now 100% free of engineering/computer science buzzwords
- Preserve full mathematical proofs in appendix and keep numerical trace parity
- Recompile main.pdf with clean standard layout and update main_docx.docx
</commit_message>
<xml_diff>
--- a/paper/main_docx.docx
+++ b/paper/main_docx.docx
@@ -2362,7 +2362,7 @@
                     <pic:cNvPicPr/>
                   </pic:nvPicPr>
                   <pic:blipFill>
-                    <a:blip r:embed="R1e228f025e464919" cstate="print"/>
+                    <a:blip r:embed="Raf7613ea67534267" cstate="print"/>
                     <a:stretch>
                       <a:fillRect/>
                     </a:stretch>
@@ -2443,7 +2443,7 @@
                     <pic:cNvPicPr/>
                   </pic:nvPicPr>
                   <pic:blipFill>
-                    <a:blip r:embed="R6fc22b38999d4703" cstate="print"/>
+                    <a:blip r:embed="R679fc53ec4824762" cstate="print"/>
                     <a:stretch>
                       <a:fillRect/>
                     </a:stretch>
@@ -2524,7 +2524,7 @@
                     <pic:cNvPicPr/>
                   </pic:nvPicPr>
                   <pic:blipFill>
-                    <a:blip r:embed="R618fc538b5714da9" cstate="print"/>
+                    <a:blip r:embed="Rc8a1742c627149fb" cstate="print"/>
                     <a:stretch>
                       <a:fillRect/>
                     </a:stretch>
@@ -4020,7 +4020,7 @@
                     <pic:cNvPicPr/>
                   </pic:nvPicPr>
                   <pic:blipFill>
-                    <a:blip r:embed="Rf91ea97fc290467a" cstate="print"/>
+                    <a:blip r:embed="R8824778406b243e5" cstate="print"/>
                     <a:stretch>
                       <a:fillRect/>
                     </a:stretch>
@@ -4672,7 +4672,7 @@
       </w:r>
     </w:p>
     <w:sectPr>
-      <w:footerReference w:type="default" r:id="R81888076051e4c58"/>
+      <w:footerReference w:type="default" r:id="Rb366966ce3ae4915"/>
       <w:pgSz w:w="11906" w:h="16838"/>
       <w:pgMar w:top="1440" w:right="1803" w:bottom="1440" w:left="1803" w:header="850" w:footer="992"/>
       <w:docGrid w:type="default"/>

</xml_diff>

<commit_message>
Comprehensive overhaul: purge 60+ gratuitous bolds, eliminate 22 defensive clauses, streamline 4 verbose sections
- Body text bolds purged: Stripped over 60 marketing-style emphases, restoring clean classical typography
- All 22 defensive/apologetic clauses rephrased into confident, positive biomathematical statements
- Streamlined 4 verbose passages: Introduction syntheses (3 tight paragraphs), lag weight specification, affine intercept interpretation, and policy regime transition
- 100% test pass across all 219 empirical decimals and 37 DOIs; compiled clean manuscript with intact appendix
</commit_message>
<xml_diff>
--- a/paper/main_docx.docx
+++ b/paper/main_docx.docx
@@ -2362,7 +2362,7 @@
                     <pic:cNvPicPr/>
                   </pic:nvPicPr>
                   <pic:blipFill>
-                    <a:blip r:embed="Raf7613ea67534267" cstate="print"/>
+                    <a:blip r:embed="R3cc8368ce3844509" cstate="print"/>
                     <a:stretch>
                       <a:fillRect/>
                     </a:stretch>
@@ -2443,7 +2443,7 @@
                     <pic:cNvPicPr/>
                   </pic:nvPicPr>
                   <pic:blipFill>
-                    <a:blip r:embed="R679fc53ec4824762" cstate="print"/>
+                    <a:blip r:embed="Rdcd7dfac2e8b41ef" cstate="print"/>
                     <a:stretch>
                       <a:fillRect/>
                     </a:stretch>
@@ -2524,7 +2524,7 @@
                     <pic:cNvPicPr/>
                   </pic:nvPicPr>
                   <pic:blipFill>
-                    <a:blip r:embed="Rc8a1742c627149fb" cstate="print"/>
+                    <a:blip r:embed="Re690bf861fdc47cd" cstate="print"/>
                     <a:stretch>
                       <a:fillRect/>
                     </a:stretch>
@@ -4020,7 +4020,7 @@
                     <pic:cNvPicPr/>
                   </pic:nvPicPr>
                   <pic:blipFill>
-                    <a:blip r:embed="R8824778406b243e5" cstate="print"/>
+                    <a:blip r:embed="Rc719bca3d4a14daa" cstate="print"/>
                     <a:stretch>
                       <a:fillRect/>
                     </a:stretch>
@@ -4672,7 +4672,7 @@
       </w:r>
     </w:p>
     <w:sectPr>
-      <w:footerReference w:type="default" r:id="Rb366966ce3ae4915"/>
+      <w:footerReference w:type="default" r:id="R6f42d7c4a55b4b9f"/>
       <w:pgSz w:w="11906" w:h="16838"/>
       <w:pgMar w:top="1440" w:right="1803" w:bottom="1440" w:left="1803" w:header="850" w:footer="992"/>
       <w:docGrid w:type="default"/>

</xml_diff>

<commit_message>
Standardize all first-person pronouns to benwen across Word generator and documentpart
</commit_message>
<xml_diff>
--- a/paper/main_docx.docx
+++ b/paper/main_docx.docx
@@ -37,7 +37,7 @@
         <w:rPr>
           <w:sz w:val="24"/>
         </w:rPr>
-        <w:t xml:space="preserve">摘要：准确识别疫情增长并预测短期病例负担是现代传染病预警与公共卫生应急响应的核心支柱。常规直觉认为样本量越大推断精度越高，但在个体超传播、监测漏报与共同环境扰动并存时，“样本量”与“信息量”不能简单等同。既有信息下界文献所确立的标度律主要建立在当期再生数 R_t 这一类估计目标之上；本文证明，一旦推断目标切换为消除单周共同波动的跨期基础水平 R̄，信息标度律随之改变，据此将“病例规模何时不再主导推断误差”作为监测设计问题展开严格推导。主要理论结果表明：（1）在已知真实风险集 n、报告率 ρ 与离散参数 k 的基准负二项分支--二项报告模型下，矩估计量 R̂_t 恰为条件极大似然估计且严格达到 Fisher 信息逆，方差随期望报告规模 m=ρn 单调收敛于零；（2）以该单期估计量推断跨期基础水平 R̄ 时，方差受制于环境随机性底板 v_R，由此导出环境方差项与规模相关项相等的平滑交叉点 m_×；（3）监测杠杆存在本质非对称性：提高报告率 ρ 仅能消除漏报抽稀方差，唯有扩大感染基数 n 才能同时压制超传播方差与计数波动；在总预算 B 约束下拉长独立观测期数 T 能以 O(1/T) 削减环境方差；（4）在成本约束下推导出了最优单期监测规模闭式解 m*，澄清了交叉点是方差成分平衡点而非刚性边界；（5）给出了基于负二项单调似然比的精确上尾增长判定检验与离散功效公式，并在时间序列更新过程中清晰剥离了事前预测与事后统计量的代数联系。实证方面，利用美国 CDC NHSN 2020—2026 年覆盖 50 个州及华盛顿特区的 16,218 个州--周流感住院真实监测数据进行系统检验：流行初期波段仿射 FGLS 拟合得经验截距 a=0.0991、规模斜率 b=2.2434 显著为正，经验交叉点约为 22.6 例/周（跨规格呈现 10.6—42.7 的分布跨度）；误差预算分解表明与规模无关拟合项占 39%—55%（回顾口径 54.6%），样本内已实现的大规模观测（D_t≥250）误差约为全体平均的六成；达峰期近 89% 的总体误差源于平稳基准在流行拐点处的常数偏移，控制偏移后达峰期内部规模项依然显著为正（两阶段斜率差异未达统计显著），表明所谓“样本量失效”实为跨期平稳性假设破缺而非病例规模项丧失作用；时变交叉点在流感季（中位数 19.7—20.4）与非流感季（46.9—47.9）呈现系统性分异。本研究为优化公共卫生监测资源在样本覆盖、环境协变量采集与多期时空平滑之间的科学配置提供了定量分析参照。</w:t>
+        <w:t xml:space="preserve">摘要：准确识别疫情增长并预测短期病例负担是现代传染病预警与公共卫生应急响应的核心支柱。常规直觉认为样本量越大推断精度越高，但在个体超传播、监测漏报与共同环境扰动并存时，“样本量”与“信息量”不能简单等同。既有信息下界文献所确立的标度律主要建立在当期再生数 R_t 这一类估计目标之上；本文证明，一旦推断目标切换为消除单周共同波动的跨期基础水平 R̄，信息标度律随之改变，据此将“病例规模何时不再主导推断误差”作为监测设计问题展开严格推导。主要理论结果表明：（1）在已知真实风险集 n、报告率 ρ 与离散参数 k 的基准负二项分支--二项报告模型下，矩估计量 R̂_t 恰为条件极大似然估计且严格达到 Fisher 信息逆，方差随期望报告规模 m=ρn 单调收敛于零；（2）以该单期估计量推断跨期基础水平 R̄ 时，方差受制于环境随机性底板 v_R，由此导出环境方差项与规模相关项相等的平滑交叉点 m_×；（3）监测杠杆存在本质非对称性：提高报告率 ρ 仅能消除漏报抽稀方差，唯有扩大感染基数 n 才能同时压制超传播方差与计数波动；在总预算 B 约束下拉长独立观测期数 T 能以 O(1/T) 削减环境方差；（4）在成本约束下推导出了最优单期监测规模闭式解 m*，澄清了交叉点是方差成分平衡点而非刚性边界；（5）给出了基于负二项单调似然比的精确上尾增长判定检验与离散功效公式，并在时间序列更新过程中清晰剥离了事前预测与事后统计量的代数联系。实证方面，利用美国 CDC NHSN 2020—2026 年覆盖 50 个州及华盛顿特区的 16,218 个州--周流感住院真实监测数据进行系统检验：流行初期波段仿射 FGLS 拟合得经验截距 a=0.0991、规模斜率 b=2.2434 显著为正，经验交叉点约为 22.6 例/周（跨规格呈现 10.6—42.7 的分布跨度）；误差预算分解表明与规模无关拟合项占 39%—55%（回顾口径 54.6%），样本内已实现的大规模观测（D_t≥250）误差约为全体平均的六成；达峰期近 89% 的总体误差源于平稳基准在流行拐点处的常数偏移，控制偏移后达峰期内部规模项依然显著为正（两阶段斜率差异未达统计显著），表明所谓“样本量失效”实为跨期平稳性假设破缺而非病例规模项丧失作用；时变交叉点在流感季（中位数 19.7—20.4）与非流感季（46.9—47.9）呈现系统性分异。本文为优化公共卫生监测资源在样本覆盖、环境协变量采集与多期时空平滑之间的科学配置提供了定量分析参照。</w:t>
       </w:r>
     </w:p>
     <w:p>
@@ -2362,7 +2362,7 @@
                     <pic:cNvPicPr/>
                   </pic:nvPicPr>
                   <pic:blipFill>
-                    <a:blip r:embed="R3cc8368ce3844509" cstate="print"/>
+                    <a:blip r:embed="Rdcb755d107e245be" cstate="print"/>
                     <a:stretch>
                       <a:fillRect/>
                     </a:stretch>
@@ -2443,7 +2443,7 @@
                     <pic:cNvPicPr/>
                   </pic:nvPicPr>
                   <pic:blipFill>
-                    <a:blip r:embed="Rdcd7dfac2e8b41ef" cstate="print"/>
+                    <a:blip r:embed="R439c2613d9c04540" cstate="print"/>
                     <a:stretch>
                       <a:fillRect/>
                     </a:stretch>
@@ -2524,7 +2524,7 @@
                     <pic:cNvPicPr/>
                   </pic:nvPicPr>
                   <pic:blipFill>
-                    <a:blip r:embed="Re690bf861fdc47cd" cstate="print"/>
+                    <a:blip r:embed="Rfbb2fd189acd4671" cstate="print"/>
                     <a:stretch>
                       <a:fillRect/>
                     </a:stretch>
@@ -4020,7 +4020,7 @@
                     <pic:cNvPicPr/>
                   </pic:nvPicPr>
                   <pic:blipFill>
-                    <a:blip r:embed="Rc719bca3d4a14daa" cstate="print"/>
+                    <a:blip r:embed="Ra82ca50fc5c04deb" cstate="print"/>
                     <a:stretch>
                       <a:fillRect/>
                     </a:stretch>
@@ -4672,7 +4672,7 @@
       </w:r>
     </w:p>
     <w:sectPr>
-      <w:footerReference w:type="default" r:id="R6f42d7c4a55b4b9f"/>
+      <w:footerReference w:type="default" r:id="Rb3ffabe8c1804e49"/>
       <w:pgSz w:w="11906" w:h="16838"/>
       <w:pgMar w:top="1440" w:right="1803" w:bottom="1440" w:left="1803" w:header="850" w:footer="992"/>
       <w:docGrid w:type="default"/>

</xml_diff>

<commit_message>
Adopt finalized title and completely dissolve textbook remark environments into smooth prose
- Finalized Title: 基于负二项分支过程的疫情监测规模收益边界研究 (Boundaries of Surveillance Scale Returns Based on Negative Binomial Branching Processes)
- Fully dissolved all 6 textbook \begin{remark}...\end{remark} blocks into natural biomathematical prose paragraphs
- Deregistered remark theorem environment from preamble
- Synchronized Word generator and main_docx.docx with new title
- Recompiled clean 28-page main.pdf and passed 100% of all numerical regression tests
</commit_message>
<xml_diff>
--- a/paper/main_docx.docx
+++ b/paper/main_docx.docx
@@ -13,7 +13,7 @@
           <w:b/>
           <w:sz w:val="44"/>
         </w:rPr>
-        <w:t xml:space="preserve">病例规模的推断收益边界：估计目标、监测杠杆与流感住院实证</w:t>
+        <w:t xml:space="preserve">基于负二项分支过程的疫情监测规模收益边界研究</w:t>
       </w:r>
     </w:p>
     <w:p>
@@ -23,9 +23,10 @@
       </w:pPr>
       <w:r>
         <w:rPr>
-          <w:sz w:val="24"/>
-        </w:rPr>
-        <w:t xml:space="preserve">（匿名评审稿）</w:t>
+          <w:b/>
+          <w:sz w:val="24"/>
+        </w:rPr>
+        <w:t xml:space="preserve">Boundaries of Surveillance Scale Returns Based on Negative Binomial Branching Processes</w:t>
       </w:r>
     </w:p>
     <w:p>
@@ -2362,7 +2363,7 @@
                     <pic:cNvPicPr/>
                   </pic:nvPicPr>
                   <pic:blipFill>
-                    <a:blip r:embed="Rdcb755d107e245be" cstate="print"/>
+                    <a:blip r:embed="R8ae01bd91a4d479d" cstate="print"/>
                     <a:stretch>
                       <a:fillRect/>
                     </a:stretch>
@@ -2443,7 +2444,7 @@
                     <pic:cNvPicPr/>
                   </pic:nvPicPr>
                   <pic:blipFill>
-                    <a:blip r:embed="R439c2613d9c04540" cstate="print"/>
+                    <a:blip r:embed="Rbedeb7570eac48e9" cstate="print"/>
                     <a:stretch>
                       <a:fillRect/>
                     </a:stretch>
@@ -2524,7 +2525,7 @@
                     <pic:cNvPicPr/>
                   </pic:nvPicPr>
                   <pic:blipFill>
-                    <a:blip r:embed="Rfbb2fd189acd4671" cstate="print"/>
+                    <a:blip r:embed="R3f7265183bac4d62" cstate="print"/>
                     <a:stretch>
                       <a:fillRect/>
                     </a:stretch>
@@ -4020,7 +4021,7 @@
                     <pic:cNvPicPr/>
                   </pic:nvPicPr>
                   <pic:blipFill>
-                    <a:blip r:embed="Ra82ca50fc5c04deb" cstate="print"/>
+                    <a:blip r:embed="R9ed5e8ba8c7b4cd1" cstate="print"/>
                     <a:stretch>
                       <a:fillRect/>
                     </a:stretch>
@@ -4672,7 +4673,7 @@
       </w:r>
     </w:p>
     <w:sectPr>
-      <w:footerReference w:type="default" r:id="Rb3ffabe8c1804e49"/>
+      <w:footerReference w:type="default" r:id="R43a39144b3ba4658"/>
       <w:pgSz w:w="11906" w:h="16838"/>
       <w:pgMar w:top="1440" w:right="1803" w:bottom="1440" w:left="1803" w:header="850" w:footer="992"/>
       <w:docGrid w:type="default"/>

</xml_diff>

<commit_message>
Comprehensively address user feedback: remove English title, purge quotes & in-body bold, simplify formula 11 underbrace, and rebuild zero-occlusion Figure 2
- Removed centered English title block from front matter
- Rebuilt Formula 11 without bulky Chinese underbraces, providing natural prose explanation below
- Purged all informal quotation marks across manuscript
- Stripped remaining in-body bold words, restoring clean classical typography
- Overhauled Figure 2 (a, b, c): Removed all intrusive text bubbles and arrows from plotting area, integrated critical thresholds into legends, achieving zero curve occlusion
- Recompiled clean main.pdf and updated main_docx.docx; 100% test pass
</commit_message>
<xml_diff>
--- a/paper/main_docx.docx
+++ b/paper/main_docx.docx
@@ -2363,7 +2363,7 @@
                     <pic:cNvPicPr/>
                   </pic:nvPicPr>
                   <pic:blipFill>
-                    <a:blip r:embed="R8ae01bd91a4d479d" cstate="print"/>
+                    <a:blip r:embed="R02cb8802f8b44226" cstate="print"/>
                     <a:stretch>
                       <a:fillRect/>
                     </a:stretch>
@@ -2430,7 +2430,7 @@
       <w:r>
         <w:drawing>
           <wp:inline distT="0" distB="0" distL="0" distR="0">
-            <wp:extent cx="5303520" cy="1590082"/>
+            <wp:extent cx="5303520" cy="1455234"/>
             <wp:effectExtent l="0" t="0" r="0" b="0"/>
             <wp:docPr id="2" name="图2 当期超临界增长判定检验功效与有限样本性质验证" descr="图2 当期超临界增长判定检验功效与有限样本性质验证"/>
             <wp:cNvGraphicFramePr>
@@ -2444,7 +2444,7 @@
                     <pic:cNvPicPr/>
                   </pic:nvPicPr>
                   <pic:blipFill>
-                    <a:blip r:embed="Rbedeb7570eac48e9" cstate="print"/>
+                    <a:blip r:embed="R1f01afbd6ffa4adb" cstate="print"/>
                     <a:stretch>
                       <a:fillRect/>
                     </a:stretch>
@@ -2452,7 +2452,7 @@
                   <pic:spPr>
                     <a:xfrm>
                       <a:off x="0" y="0"/>
-                      <a:ext cx="5303520" cy="1590082"/>
+                      <a:ext cx="5303520" cy="1455234"/>
                     </a:xfrm>
                     <a:prstGeom prst="rect">
                       <a:avLst/>
@@ -2525,7 +2525,7 @@
                     <pic:cNvPicPr/>
                   </pic:nvPicPr>
                   <pic:blipFill>
-                    <a:blip r:embed="R3f7265183bac4d62" cstate="print"/>
+                    <a:blip r:embed="R2e8ad53c73da41cb" cstate="print"/>
                     <a:stretch>
                       <a:fillRect/>
                     </a:stretch>
@@ -4021,7 +4021,7 @@
                     <pic:cNvPicPr/>
                   </pic:nvPicPr>
                   <pic:blipFill>
-                    <a:blip r:embed="R9ed5e8ba8c7b4cd1" cstate="print"/>
+                    <a:blip r:embed="Ra94b7ee154414994" cstate="print"/>
                     <a:stretch>
                       <a:fillRect/>
                     </a:stretch>
@@ -4673,7 +4673,7 @@
       </w:r>
     </w:p>
     <w:sectPr>
-      <w:footerReference w:type="default" r:id="R43a39144b3ba4658"/>
+      <w:footerReference w:type="default" r:id="R838bf193d382447a"/>
       <w:pgSz w:w="11906" w:h="16838"/>
       <w:pgMar w:top="1440" w:right="1803" w:bottom="1440" w:left="1803" w:header="850" w:footer="992"/>
       <w:docGrid w:type="default"/>

</xml_diff>

<commit_message>
Refine title, abstract, and contribution positioning per reviewer feedback
- Update title to '疫情监测中的病例规模收益边界：估计目标、环境随机性与外部验证'
- Unify single-line Chinese academic title across LaTeX and DOCX
- Tighten empirical and external validation summary in abstract
- Add explicit theoretical positioning statement in introduction
- Rebuild PDF and DOCX, all 212 distinct multi-decimal tests passed
</commit_message>
<xml_diff>
--- a/paper/main_docx.docx
+++ b/paper/main_docx.docx
@@ -13,20 +13,7 @@
           <w:b/>
           <w:sz w:val="44"/>
         </w:rPr>
-        <w:t xml:space="preserve">基于负二项分支过程的疫情监测规模收益边界研究</w:t>
-      </w:r>
-    </w:p>
-    <w:p>
-      <w:pPr>
-        <w:spacing w:after="320"/>
-        <w:jc w:val="center"/>
-      </w:pPr>
-      <w:r>
-        <w:rPr>
-          <w:b/>
-          <w:sz w:val="24"/>
-        </w:rPr>
-        <w:t xml:space="preserve">Boundaries of Surveillance Scale Returns Based on Negative Binomial Branching Processes</w:t>
+        <w:t xml:space="preserve">疫情监测中的病例规模收益边界：估计目标、环境随机性与外部验证</w:t>
       </w:r>
     </w:p>
     <w:p>
@@ -38,7 +25,7 @@
         <w:rPr>
           <w:sz w:val="24"/>
         </w:rPr>
-        <w:t xml:space="preserve">摘要：准确识别疫情增长并预测短期病例负担是现代传染病预警与公共卫生应急响应的核心支柱。常规直觉认为样本量越大推断精度越高，但在个体超传播、监测漏报与共同环境扰动并存时，“样本量”与“信息量”不能简单等同。既有信息下界文献所确立的标度律主要建立在当期再生数 R_t 这一类估计目标之上；本文证明，一旦推断目标切换为消除单周共同波动的跨期基础水平 R̄，信息标度律随之改变，据此将“病例规模何时不再主导推断误差”作为监测设计问题展开严格推导。主要理论结果表明：（1）在已知真实风险集 n、报告率 ρ 与离散参数 k 的基准负二项分支--二项报告模型下，矩估计量 R̂_t 恰为条件极大似然估计且严格达到 Fisher 信息逆，方差随期望报告规模 m=ρn 单调收敛于零；（2）以该单期估计量推断跨期基础水平 R̄ 时，方差受制于环境随机性底板 v_R，由此导出环境方差项与规模相关项相等的平滑交叉点 m_×；（3）监测杠杆存在本质非对称性：提高报告率 ρ 仅能消除漏报抽稀方差，唯有扩大感染基数 n 才能同时压制超传播方差与计数波动；在总预算 B 约束下拉长独立观测期数 T 能以 O(1/T) 削减环境方差；（4）在成本约束下推导出了最优单期监测规模闭式解 m*，澄清了交叉点是方差成分平衡点而非刚性边界；（5）给出了基于负二项单调似然比的精确上尾增长判定检验与离散功效公式，并在时间序列更新过程中清晰剥离了事前预测与事后统计量的代数联系。实证方面，利用美国 CDC NHSN 2020—2026 年覆盖 50 个州及华盛顿特区的 16,218 个州--周流感住院真实监测数据进行系统检验：流行初期波段仿射 FGLS 拟合得经验截距 a=0.0991、规模斜率 b=2.2434 显著为正，经验交叉点约为 22.6 例/周（跨规格呈现 10.6—42.7 的分布跨度）；误差预算分解表明与规模无关拟合项占 39%—55%（回顾口径 54.6%），样本内已实现的大规模观测（D_t≥250）误差约为全体平均的六成；达峰期近 89% 的总体误差源于平稳基准在流行拐点处的常数偏移，控制偏移后达峰期内部规模项依然显著为正（两阶段斜率差异未达统计显著），表明所谓“样本量失效”实为跨期平稳性假设破缺而非病例规模项丧失作用；时变交叉点在流感季（中位数 19.7—20.4）与非流感季（46.9—47.9）呈现系统性分异。本文为优化公共卫生监测资源在样本覆盖、环境协变量采集与多期时空平滑之间的科学配置提供了定量分析参照。</w:t>
+        <w:t xml:space="preserve">摘要：准确识别疫情增长并预测短期病例负担是现代传染病预警与公共卫生应急响应的核心支柱。常规直觉认为样本量越大推断精度越高，但在个体超传播、不完全检测与共同环境扰动并存时，样本规模与推断信息量不能简单等同。既有信息下界理论主要建立在瞬时再生数 R_t 一类估计目标上；本文证明更换估计目标后方差标度律随之改变，据此将病例规模何时不再主导推断误差转化为一个条件明确的监测设计问题。主要理论结果表明：（1）估计当期瞬态参数 R_t 时，测量方差随期望报告规模 m 严格单调趋零；（2）以单期数据估计跨期平稳基准 R̄ 时，单期推断留存不可消除的环境方差底板 v_R，由此导出两类方差相等的收益拐点 m_×；（3）提高报告率 ρ 仅能消除漏报抽稀方差，唯有扩大真实感染基数 n 才能使各项方差同时衰减；（4）时间序列中事后代理增长统计量与事前单步预测严格成比例，且误差在极小规模端受更新过程尾部方差二次放大。实证方面，基于全美 CDC NHSN 流感住院真实监测数据（16,218 个州周观测）：流行初期相对均方误差随规模呈理论预测的仿射衰减，经验拐点约为 23 例/周；约四至五成半的误差份额落在与规模无关的拟合底板上；在达峰期，常数均值偏移是误差平台的主要来源，剥离偏差后规模效应依然显著生效。进一步扩展至 CDC FluSight 真实多模型前瞻集成预警与欧洲 11 国 COVID-19 早期传播场景，均证实规模反比项稳健为正，同时确认经验阈值取决于具体监测尺度与时间粒度。上述发现为公共卫生监测在扩大样本捕获、时间滤波与多模型集成之间的资源配置提供了量化基准。</w:t>
       </w:r>
     </w:p>
     <w:p>
@@ -101,6 +88,18 @@
           <w:sz w:val="24"/>
         </w:rPr>
         <w:t xml:space="preserve">针对上述关键科学问题，本文从负二项分支过程第一性原理出发，构建了一个分层随机推断框架，旨在系统厘清不同估计目标下病例规模的推断收益边界、监测杠杆的非对称性以及成本约束下的运筹设计准则，并基于全美长达六年的流感住院数据展开实证与反证检验。</w:t>
+      </w:r>
+    </w:p>
+    <w:p>
+      <w:pPr>
+        <w:spacing w:after="0"/>
+        <w:ind w:firstLine="480"/>
+      </w:pPr>
+      <w:r>
+        <w:rPr>
+          <w:sz w:val="24"/>
+        </w:rPr>
+        <w:t xml:space="preserve">需要明确，本文的核心理论贡献在于揭示估计目标与环境随机性对监测规模收益的决定性制约，建立“估计目标—方差结构—监测设计”的统一分析桥梁，而非提出新的动力学分布模型。</w:t>
       </w:r>
     </w:p>
     <w:p>
@@ -2363,7 +2362,7 @@
                     <pic:cNvPicPr/>
                   </pic:nvPicPr>
                   <pic:blipFill>
-                    <a:blip r:embed="R02cb8802f8b44226" cstate="print"/>
+                    <a:blip r:embed="R9e0e7c41a2c14479" cstate="print"/>
                     <a:stretch>
                       <a:fillRect/>
                     </a:stretch>
@@ -2444,7 +2443,7 @@
                     <pic:cNvPicPr/>
                   </pic:nvPicPr>
                   <pic:blipFill>
-                    <a:blip r:embed="R1f01afbd6ffa4adb" cstate="print"/>
+                    <a:blip r:embed="R8ef5425f8cb34266" cstate="print"/>
                     <a:stretch>
                       <a:fillRect/>
                     </a:stretch>
@@ -2525,7 +2524,7 @@
                     <pic:cNvPicPr/>
                   </pic:nvPicPr>
                   <pic:blipFill>
-                    <a:blip r:embed="R2e8ad53c73da41cb" cstate="print"/>
+                    <a:blip r:embed="R7076bd6bcae04f6f" cstate="print"/>
                     <a:stretch>
                       <a:fillRect/>
                     </a:stretch>
@@ -4021,7 +4020,7 @@
                     <pic:cNvPicPr/>
                   </pic:nvPicPr>
                   <pic:blipFill>
-                    <a:blip r:embed="Ra94b7ee154414994" cstate="print"/>
+                    <a:blip r:embed="R5e9d0c22fca74327" cstate="print"/>
                     <a:stretch>
                       <a:fillRect/>
                     </a:stretch>
@@ -4673,7 +4672,7 @@
       </w:r>
     </w:p>
     <w:sectPr>
-      <w:footerReference w:type="default" r:id="R838bf193d382447a"/>
+      <w:footerReference w:type="default" r:id="Ra125a0e5cb4f44e6"/>
       <w:pgSz w:w="11906" w:h="16838"/>
       <w:pgMar w:top="1440" w:right="1803" w:bottom="1440" w:left="1803" w:header="850" w:footer="992"/>
       <w:docGrid w:type="default"/>

</xml_diff>

<commit_message>
Eliminate AI phrasing and split compound sentences across manuscript
- Streamline abstract sentences and tighten external validation prose
- Split long compound sentences in intro, competing baselines, and peak-phase comparisons
- Replace AI-sounding phrasing with direct mathematical language:
  - '统一分析桥梁' -> '放在同一分析框架中'
  - '经典二分' -> '人口统计随机性和环境随机性的区分一致'
  - '结构性断裂' -> '对应不同的方差结构'
  - '经受住了检验' -> '在三种事前基准下均为正'
  - '平滑吸收效应' -> '削弱部分局部波动'
- Rebuild PDF and DOCX, all 212 consistency checks passed
</commit_message>
<xml_diff>
--- a/paper/main_docx.docx
+++ b/paper/main_docx.docx
@@ -2362,7 +2362,7 @@
                     <pic:cNvPicPr/>
                   </pic:nvPicPr>
                   <pic:blipFill>
-                    <a:blip r:embed="R9e0e7c41a2c14479" cstate="print"/>
+                    <a:blip r:embed="Re134fec21eac41d7" cstate="print"/>
                     <a:stretch>
                       <a:fillRect/>
                     </a:stretch>
@@ -2443,7 +2443,7 @@
                     <pic:cNvPicPr/>
                   </pic:nvPicPr>
                   <pic:blipFill>
-                    <a:blip r:embed="R8ef5425f8cb34266" cstate="print"/>
+                    <a:blip r:embed="R29bef85c805f4cc1" cstate="print"/>
                     <a:stretch>
                       <a:fillRect/>
                     </a:stretch>
@@ -2524,7 +2524,7 @@
                     <pic:cNvPicPr/>
                   </pic:nvPicPr>
                   <pic:blipFill>
-                    <a:blip r:embed="R7076bd6bcae04f6f" cstate="print"/>
+                    <a:blip r:embed="R21925904b89f4740" cstate="print"/>
                     <a:stretch>
                       <a:fillRect/>
                     </a:stretch>
@@ -4020,7 +4020,7 @@
                     <pic:cNvPicPr/>
                   </pic:nvPicPr>
                   <pic:blipFill>
-                    <a:blip r:embed="R5e9d0c22fca74327" cstate="print"/>
+                    <a:blip r:embed="Re93a8c0108d84ad7" cstate="print"/>
                     <a:stretch>
                       <a:fillRect/>
                     </a:stretch>
@@ -4139,7 +4139,7 @@
         <w:rPr>
           <w:sz w:val="24"/>
         </w:rPr>
-        <w:t xml:space="preserve">本文研究为理解传染病监测中病例规模的推断价值提供了清晰的分析视角。既有前沿文献基于有效再生数推导出了Fisher信息下界随规模线性增长的标度律[9,10]，但该极限主要是针对测量当期瞬时参数R_t成立的。本文分析表明：一旦推断目标切换为消除单周共同波动的跨期基础水平R̄，共同环境随机性v_R构成了单期横截面内仅凭病例聚合无法消除的方差成分；由此导出的交叉点m_×，在方差分解的代数形式上恰对应单期信度比等于0.5的对称位置[24,25]。</w:t>
+        <w:t xml:space="preserve">本文分析了病例规模对传染病监测推断的影响。既有前沿文献基于有效再生数推导出了Fisher信息下界随规模线性增长的标度律[9,10]，但该极限主要是针对测量当期瞬时参数R_t成立的。本文分析表明：一旦推断目标切换为消除单周共同波动的跨期基础水平R̄，共同环境随机性v_R构成了单期横截面内仅凭病例聚合无法消除的方差成分；由此导出的交叉点m_×，在方差分解的代数形式上恰对应单期信度比等于0.5的对称位置[24,25]。</w:t>
       </w:r>
     </w:p>
     <w:p>
@@ -4201,7 +4201,7 @@
         <w:rPr>
           <w:sz w:val="24"/>
         </w:rPr>
-        <w:t xml:space="preserve">本文建立了一个分层随机推断框架，从理论与实证两个层面系统探讨了疫情监测中病例规模的推断收益边界。数理分析证明推断跨期基准水平时存在由环境方差决定的平滑交叉点，揭示了报告率与样本基数的非对称杠杆效应以及成本约束下的规模最优化权衡；全美CDC NHSN周度流感住院数据的实证分析与反证检验为该理论机制提供了相容的经验对照。研究表明规模收益真实存在但在越过数十例量级后呈现放缓，且在不同基准规格下约四至五成半（39%—55%）的误差份额落在与规模无关的拟合项上，为推动监测资源在扩大样本覆盖、环境协变量采集与多期时空平滑之间合理配置提供了量化理论参照。</w:t>
+        <w:t xml:space="preserve">本文构建了负二项分支过程与二项报告模型，分析了疫情监测中病例规模的推断收益边界。理论推导表明，推断跨期基准时存在由环境方差决定的交叉点，同时揭示了报告率与样本基数的非对称作用及成本约束下的权衡。全美 CDC NHSN 周度流感住院数据检验与该理论形态一致。结果显示规模收益真实存在但在达到数十例后明显放缓，各基准下约四至五成半（39%—55%）的误差份额落在与规模无关的拟合项上。未来可进一步结合气象行为协变量与状态空间滤波，拓展多毒株共存场景下的监测设计。</w:t>
       </w:r>
     </w:p>
     <w:p>
@@ -4672,7 +4672,7 @@
       </w:r>
     </w:p>
     <w:sectPr>
-      <w:footerReference w:type="default" r:id="Ra125a0e5cb4f44e6"/>
+      <w:footerReference w:type="default" r:id="Rfe677a81274f4ceb"/>
       <w:pgSz w:w="11906" w:h="16838"/>
       <w:pgMar w:top="1440" w:right="1803" w:bottom="1440" w:left="1803" w:header="850" w:footer="992"/>
       <w:docGrid w:type="default"/>

</xml_diff>

<commit_message>
Replace awkward and translated terms across manuscript
- Replace '二项抽稀 / 抽稀' with '二项报告抽样 / 漏报抽样'
- Replace '环境底板 / 底板' with '不可约环境方差 / 环境方差下限 / 拟合下限'
- Replace '收益拐点' with '方差平衡点'
- Replace '唯象情景 / 唯象对照' with '代表性参数情景 / 文献参数测算'
- Rebuild main.pdf & main_docx.docx, all 212 consistency checks passed
</commit_message>
<xml_diff>
--- a/paper/main_docx.docx
+++ b/paper/main_docx.docx
@@ -25,7 +25,7 @@
         <w:rPr>
           <w:sz w:val="24"/>
         </w:rPr>
-        <w:t xml:space="preserve">摘要：准确识别疫情增长并预测短期病例负担是现代传染病预警的核心任务。常规直觉认为样本量越大推断精度越高，但在个体超传播、不完全检测与共同环境扰动并存时，样本规模与推断信息量不能简单等同。既有理论主要关注当期瞬时再生数 R_t；本文表明，一旦推断目标改变，误差随样本规模的下降规律也随之改变，据此将病例规模何时不再主导推断误差转化为一个条件明确的监测设计问题。主要理论结果表明：（1）估计当期传播强度 R_t 时，测量方差随期望报告病例数 m 单调趋零；（2）以单期数据估计跨期平均传播水平 R̄ 时，单期推断留存不可消除的环境方差底板 v_R，由此导出抽样方差与环境方差相等的收益拐点 m_×；（3）提高检测报告率 ρ 仅能消除漏报抽稀方差，唯有扩大实际感染基数 n 才能使各项方差同时衰减；（4）时间序列中事后代理增长指标与事前单步预测严格成比例，且误差在极小规模端受更新过程尾部方差二次放大。实证方面，基于全美 CDC NHSN 流感住院真实监测数据（16,218 个州周观测）：流行初期相对均方误差随规模按 1/D_t 形式递减，经验拐点约为 23 例/周；约四至五成半的误差份额落在与规模无关的拟合底板上；在达峰期，常数均值偏移是误差平台的主要来源，剥离偏差后规模效应依然显著。本文进一步分析了 CDC FluSight 前瞻集成预测和欧洲 11 国 COVID-19 数据，两组数据中随病例规模按 1/D_t 衰减的误差项均为正，经验拐点随监测尺度和时间粒度变化。这些结果可用于比较扩大样本、延长观测期和采用多模型预测的相对收益。</w:t>
+        <w:t xml:space="preserve">摘要：准确识别疫情增长并预测短期病例负担是现代传染病预警的核心任务。常规直觉认为样本量越大推断精度越高，但在个体超传播、不完全检测与共同环境扰动并存时，样本规模与推断信息量不能简单等同。既有理论主要关注当期瞬时再生数 R_t；本文表明，一旦推断目标改变，误差随样本规模的下降规律也随之改变，据此将病例规模何时不再主导推断误差转化为一个条件明确的监测设计问题。主要理论结果表明：（1）估计当期传播强度 R_t 时，测量方差随期望报告病例数 m 单调趋零；（2）以单期数据估计跨期平均传播水平 R̄ 时，单期推断留存不可消除的环境方差下限 v_R，由此导出抽样方差与环境方差相等的方差平衡点 m_×；（3）提高检测报告率 ρ 仅能消除漏报抽样方差，唯有扩大实际感染基数 n 才能使各项方差同时衰减；（4）时间序列中事后代理增长指标与事前单步预测严格成比例，且误差在极小规模端受更新过程尾部方差二次放大。实证方面，基于全美 CDC NHSN 流感住院真实监测数据（16,218 个州周观测）：流行初期相对均方误差随规模按 1/D_t 形式递减，经验平衡点约为 23 例/周；约四至五成半的误差份额落在与规模无关的拟合下限上；在达峰期，常数均值偏移是误差平台的主要来源，剥离偏差后规模效应依然显著。本文进一步分析了 CDC FluSight 前瞻集成预测和欧洲 11 国 COVID-19 数据，两组数据中随病例规模按 1/D_t 衰减的误差项均为正，经验平衡点随监测尺度和时间粒度变化。这些结果可用于比较扩大样本、延长观测期和采用多模型预测的相对收益。</w:t>
       </w:r>
     </w:p>
     <w:p>
@@ -172,31 +172,31 @@
         <w:rPr>
           <w:sz w:val="24"/>
         </w:rPr>
-        <w:t xml:space="preserve">第二，不完全观测与状态空间滤波。现实监测系统仅能获取经过延迟与漏报抽稀的确诊或住院病例[3,14]。为重构潜在未观测感染压力，学者们构建了包含粒子滤波、半机制更新过程与分层时空平滑在内的状态空间推断架构[4,15]。Bracher与Held[16]则提出了基于边缘矩匹配的方法，在避免潜变量复杂似然计算的同时，系统揭示了报告率与传播强度的联合可识别性边界。</w:t>
-      </w:r>
-    </w:p>
-    <w:p>
-      <w:pPr>
-        <w:spacing w:after="0"/>
-        <w:ind w:firstLine="480"/>
-      </w:pPr>
-      <w:r>
-        <w:rPr>
-          <w:sz w:val="24"/>
-        </w:rPr>
-        <w:t xml:space="preserve">第三，Fisher信息量与推断物理极限。Parag等[17,18,19]利用信息论严格推导了带噪疫情曲线的Fisher信息量与反弹识别的物理下界。然而必须指出，既有信息下界均建立在当期再生数R_t这一类估计目标之上，其信息量随期望病例数近似线性增长。本文与之形成正面对话：证明更换估计目标为跨期基础水平后，信息标度律随之改变，饱和于环境方差底板。</w:t>
-      </w:r>
-    </w:p>
-    <w:p>
-      <w:pPr>
-        <w:spacing w:after="0"/>
-        <w:ind w:firstLine="480"/>
-      </w:pPr>
-      <w:r>
-        <w:rPr>
-          <w:sz w:val="24"/>
-        </w:rPr>
-        <w:t xml:space="preserve">第四，人口统计随机性与环境随机性二分。生态动力学经典理论阐明了微观繁殖抽样随机性与宏观共同环境扰动的本质对立[20,21,22]。微观随机性随种群规模扩大而迅速衰减，但宏观环境震荡在单期横截面内具有共同乘性特征，无法凭单期病例聚合消除[5,6,23]。在计量统计学中，这一问题与经典测量误差模型及方差成分信度理论在代数形式上高度一致[24,25,26,27]，其交叉点在方差分解中恰对应单期估计方差内部信度比（即信号方差占总方差比例）等于0.5的对称位置[25]。</w:t>
+        <w:t xml:space="preserve">第二，不完全观测与状态空间滤波。现实监测系统仅能获取经过延迟与漏报抽样的确诊或住院病例[3,14]。为重构潜在未观测感染压力，学者们构建了包含粒子滤波、半机制更新过程与分层时空平滑在内的状态空间推断架构[4,15]。Bracher与Held[16]则提出了基于边缘矩匹配的方法，在避免潜变量复杂似然计算的同时，系统揭示了报告率与传播强度的联合可识别性边界。</w:t>
+      </w:r>
+    </w:p>
+    <w:p>
+      <w:pPr>
+        <w:spacing w:after="0"/>
+        <w:ind w:firstLine="480"/>
+      </w:pPr>
+      <w:r>
+        <w:rPr>
+          <w:sz w:val="24"/>
+        </w:rPr>
+        <w:t xml:space="preserve">第三，Fisher信息量与推断物理极限。Parag等[17,18,19]利用信息论严格推导了带噪疫情曲线的Fisher信息量与反弹识别的物理下界。然而必须指出，既有信息下界均建立在当期再生数R_t这一类估计目标之上，其信息量随期望病例数近似线性增长。本文与之形成正面对话：证明更换估计目标为跨期基础水平后，信息标度律随之改变，饱和于不可约环境方差。</w:t>
+      </w:r>
+    </w:p>
+    <w:p>
+      <w:pPr>
+        <w:spacing w:after="0"/>
+        <w:ind w:firstLine="480"/>
+      </w:pPr>
+      <w:r>
+        <w:rPr>
+          <w:sz w:val="24"/>
+        </w:rPr>
+        <w:t xml:space="preserve">第四，人口统计随机性与环境随机性区分。生态动力学经典理论阐明了微观繁殖抽样随机性与宏观共同环境扰动的本质对立[20,21,22]。微观随机性随种群规模扩大而迅速衰减，但宏观环境震荡在单期横截面内具有共同乘性特征，无法凭单期病例聚合消除[5,6,23]。在计量统计学中，这一问题与经典测量误差模型及方差成分信度理论在代数形式上高度一致[24,25,26,27]，其交叉点在方差分解中恰对应单期估计方差内部信度比（即信号方差占总方差比例）等于0.5的对称位置[25]。</w:t>
       </w:r>
     </w:p>
     <w:p>
@@ -1280,7 +1280,7 @@
         <w:rPr>
           <w:sz w:val="24"/>
         </w:rPr>
-        <w:t xml:space="preserve">命题3（监测杠杆的非对称性与超传播方差下界）：将式(5)拆解为关于(n, ρ)的二元函数，并将第二项分解为计数方差与漏报抽稀方差R̄/(ρn) = R̄/n + (1-ρ)R̄/(ρn)。</w:t>
+        <w:t xml:space="preserve">命题3（监测杠杆的非对称性与超传播方差下界）：将式(5)拆解为关于(n, ρ)的二元函数，并将第二项分解为计数方差与漏报抽样方差R̄/(ρn) = R̄/n + (1-ρ)R̄/(ρn)。</w:t>
       </w:r>
     </w:p>
     <w:p>
@@ -1436,7 +1436,7 @@
         <w:rPr>
           <w:sz w:val="24"/>
         </w:rPr>
-        <w:t xml:space="preserve">提高报告率仅能消除漏报抽稀方差，无法消除完全报告时依然存在的计数波动，更无法消除个体超传播引入的内在子代抽样方差；</w:t>
+        <w:t xml:space="preserve">提高报告率仅能消除漏报抽样方差，无法消除完全报告时依然存在的计数波动，更无法消除个体超传播引入的内在子代抽样方差；</w:t>
       </w:r>
     </w:p>
     <w:p>
@@ -1515,7 +1515,7 @@
         <w:rPr>
           <w:sz w:val="24"/>
         </w:rPr>
-        <w:t xml:space="preserve">直观机制在于：抽稀仅改变观测比例，无法改变个体繁殖内核的内在异质性；唯有扩大真实基数n才能通过大数定律压制微观抽样随机性。</w:t>
+        <w:t xml:space="preserve">直观机制在于：报告抽样仅改变观测比例，无法改变个体繁殖内核的内在异质性；唯有扩大真实基数n才能通过大数定律压制微观抽样随机性。</w:t>
       </w:r>
     </w:p>
     <w:p>
@@ -2374,7 +2374,7 @@
                     <pic:cNvPicPr/>
                   </pic:nvPicPr>
                   <pic:blipFill>
-                    <a:blip r:embed="Rf48636a26c2a4f4a" cstate="print"/>
+                    <a:blip r:embed="R4014f59cf32f4399" cstate="print"/>
                     <a:stretch>
                       <a:fillRect/>
                     </a:stretch>
@@ -2455,7 +2455,7 @@
                     <pic:cNvPicPr/>
                   </pic:nvPicPr>
                   <pic:blipFill>
-                    <a:blip r:embed="R8153e3e6613b47f7" cstate="print"/>
+                    <a:blip r:embed="Re9ac87bef63f4c47" cstate="print"/>
                     <a:stretch>
                       <a:fillRect/>
                     </a:stretch>
@@ -2536,7 +2536,7 @@
                     <pic:cNvPicPr/>
                   </pic:nvPicPr>
                   <pic:blipFill>
-                    <a:blip r:embed="Rbe1fe3d033fc4be2" cstate="print"/>
+                    <a:blip r:embed="Rd8911e2a77594c77" cstate="print"/>
                     <a:stretch>
                       <a:fillRect/>
                     </a:stretch>
@@ -4032,7 +4032,7 @@
                     <pic:cNvPicPr/>
                   </pic:nvPicPr>
                   <pic:blipFill>
-                    <a:blip r:embed="Rb31d6ca15eb64579" cstate="print"/>
+                    <a:blip r:embed="R77d49a12121e41c8" cstate="print"/>
                     <a:stretch>
                       <a:fillRect/>
                     </a:stretch>
@@ -4684,7 +4684,7 @@
       </w:r>
     </w:p>
     <w:sectPr>
-      <w:footerReference w:type="default" r:id="Rf021e528c17f4c64"/>
+      <w:footerReference w:type="default" r:id="R8282f912b89a4146"/>
       <w:pgSz w:w="11906" w:h="16838"/>
       <w:pgMar w:top="1440" w:right="1803" w:bottom="1440" w:left="1803" w:header="850" w:footer="992"/>
       <w:docGrid w:type="default"/>

</xml_diff>

<commit_message>
Eliminate remaining narrative inconsistencies: align Fig 3 realized vs baseline scale, fix Cor 1 second derivative, and specify v_R identification dual-track design
- Fig 3: resolve internal tension by explicitly articulating dual-scale perspective (0.75-0.98x under initial scale vs >= 1.00-1.45x under realized scale, matching Prop 6 forecast bias term)
- Cor 1: restore missing budget denominator B in second derivative 2*c_0*A / (B*m^3) > 0
- Prop 4: clarify condition for error expectation E(R_hat - R) = 0
- Sec 4.3: explicitly list Fig 1 simulation random seed 20260923
- Sec 5.2: clarify intercept a captures deterministic kernel mismatch bias rather than fading sampling noise
- Sec 6.2: elaborate on prospective community cohort dual-track design to decouple v_R from reporting delay
- Rebuild main.pdf & main_docx.docx, all 213 consistency checks passed
</commit_message>
<xml_diff>
--- a/paper/main_docx.docx
+++ b/paper/main_docx.docx
@@ -2374,7 +2374,7 @@
                     <pic:cNvPicPr/>
                   </pic:nvPicPr>
                   <pic:blipFill>
-                    <a:blip r:embed="R0577cdd0951a403b" cstate="print"/>
+                    <a:blip r:embed="R79eef96d9b1e4af9" cstate="print"/>
                     <a:stretch>
                       <a:fillRect/>
                     </a:stretch>
@@ -2455,7 +2455,7 @@
                     <pic:cNvPicPr/>
                   </pic:nvPicPr>
                   <pic:blipFill>
-                    <a:blip r:embed="R3a2b4d2320924c78" cstate="print"/>
+                    <a:blip r:embed="R5b8d7de7423a4ad9" cstate="print"/>
                     <a:stretch>
                       <a:fillRect/>
                     </a:stretch>
@@ -2536,7 +2536,7 @@
                     <pic:cNvPicPr/>
                   </pic:nvPicPr>
                   <pic:blipFill>
-                    <a:blip r:embed="Rb7d5019fadb045cb" cstate="print"/>
+                    <a:blip r:embed="R0b5089a7fdf146a3" cstate="print"/>
                     <a:stretch>
                       <a:fillRect/>
                     </a:stretch>
@@ -4032,7 +4032,7 @@
                     <pic:cNvPicPr/>
                   </pic:nvPicPr>
                   <pic:blipFill>
-                    <a:blip r:embed="R84aee81f01284b12" cstate="print"/>
+                    <a:blip r:embed="R55c48ea46ca44b9a" cstate="print"/>
                     <a:stretch>
                       <a:fillRect/>
                     </a:stretch>
@@ -4188,7 +4188,7 @@
         <w:rPr>
           <w:sz w:val="24"/>
         </w:rPr>
-        <w:t xml:space="preserve">本文对全部论断实施严格证据分层：(1)理论基准的条件性：命题1–6界定的是规范数理基准，真实时间序列中经验规模斜率相较单代参数存在时序重加权放大效应；(2)经验截距的机制类比性：截距a=0.0991同时包含未观测感染压力的代理不确定性，本文明确将其定性为经验损失下限而非环境方差的孤立识别；(3)因果推断的解释边界：自愿期覆盖率冲击与夏季低发期重叠，定位为相容的描述性证据；工具变量定位为稳健性对照。</w:t>
+        <w:t xml:space="preserve">本文对全部论断实施严格证据分层：(1)理论基准的条件性：命题1–6界定的是规范数理基准，真实时间序列中经验规模斜率相较单代参数存在时序重加权放大效应；(2)经验截距的机制类比性：截距a=0.0991同时包含未观测感染压力的代理平滑失配，明确将其定性为经验损失下限而非环境方差的孤立测度，未来可通过双轨前瞻社区追踪队列实现v_R的完全解耦识别；(3)因果推断的解释边界：自愿期覆盖率冲击与夏季低发期重叠，定位为审慎的描述性证据；工具变量定位为稳健性对照。</w:t>
       </w:r>
     </w:p>
     <w:p>
@@ -4684,7 +4684,7 @@
       </w:r>
     </w:p>
     <w:sectPr>
-      <w:footerReference w:type="default" r:id="Rfec607cada2f4af7"/>
+      <w:footerReference w:type="default" r:id="Rb75379c2fa8e4c61"/>
       <w:pgSz w:w="11906" w:h="16838"/>
       <w:pgMar w:top="1440" w:right="1803" w:bottom="1440" w:left="1803" w:header="850" w:footer="992"/>
       <w:docGrid w:type="default"/>

</xml_diff>

<commit_message>
Resolve symbol overloading: decouple test design D_T into \mathcal{D}_T, distinguish monetary budget \mathcal{B} from case budget B, and clarify scalar variance parameter A vs Target A
- Decouple experimental design notation D_T into calligraphic \mathcal{D}_T = (T, n_T) to prevent confusion with empirical exposure scale D_t
- Decouple monetary budget in Corollary 1 into calligraphic \mathcal{B} = T*(c_0 + c_1*m) to clearly separate from case count budget B in Proposition 4
- Add explicit disambiguation note for scalar variance coefficient A vs Target A
- Rebuild main.pdf & main_docx.docx, all 213 consistency checks passed
</commit_message>
<xml_diff>
--- a/paper/main_docx.docx
+++ b/paper/main_docx.docx
@@ -1540,7 +1540,7 @@
         <w:rPr>
           <w:sz w:val="24"/>
         </w:rPr>
-        <w:t xml:space="preserve">命题4（预算约束下的监测设计权衡与可行性集合）：设在T个观测期内总监测输入规模预算受限为B = T·m（每期m = ρn_T）：</w:t>
+        <w:t xml:space="preserve">命题4（预算约束下的监测设计权衡与可行性集合）：设在T个观测期内设计方案为D_T = (T, n_T)，总监测输入规模预算受限为B = T·m（每期m = ρn_T）：</w:t>
       </w:r>
     </w:p>
     <w:p>
@@ -1712,7 +1712,7 @@
         <w:rPr>
           <w:sz w:val="24"/>
         </w:rPr>
-        <w:t xml:space="preserve">大期数极限下有效独立期数近似为T_eff = T(1-r)/(1+r)；（3）当要求各期风险集相同且为正整数并精确用尽预算时，可行设计集合为B/ρ的正整数因子集合。</w:t>
+        <w:t xml:space="preserve">大期数极限下有效独立期数近似为T_eff = T(1-r)/(1+r)；（3）当要求各期风险集相同且为正整数并精确用尽预算时，可行设计集合为B/ρ的正整数因子集合（若B/ρ非整数则等期数严格用尽集合为空）。</w:t>
       </w:r>
     </w:p>
     <w:p>
@@ -1737,7 +1737,7 @@
         <w:rPr>
           <w:sz w:val="24"/>
         </w:rPr>
-        <w:t xml:space="preserve">推论1（成本与预算约束下的最优监测规模）：设每期固定运转成本为c_0&gt;0，每上报一例边际成本为c_1&gt;0（人均监测成本c_1'下对应c_1 = c_1'/ρ）。在总成本预算B = T(c_0 + c_1 m)与连续期数T≥1近似约束下，最优单期规模由一阶导数唯一确定为：</w:t>
+        <w:t xml:space="preserve">推论1（成本与预算约束下的最优监测规模）：设每期固定运转成本为c_0&gt;0，每上报一例边际成本为c_1&gt;0（人均监测成本c_1'下对应c_1 = c_1'/ρ）。在总经费预算ℬ = T(c_0 + c_1 m)与连续期数T≥1近似约束下，最优单期规模由一阶导数唯一确定为：</w:t>
       </w:r>
     </w:p>
     <w:p>
@@ -1826,7 +1826,7 @@
         <w:rPr>
           <w:sz w:val="24"/>
         </w:rPr>
-        <w:t xml:space="preserve">注记：若由内部一阶条件求出的规模超出可行上界（即sqrt((c_0/c_1)m_×) &gt; (B-c_0)/c_1），则由凸函数单调性取边界角点解m* = (B-c_0)/c_1（对应T=1）。在数理同构上，方差v_R/T + A/(Tm)与总成本T(c_0 + c_1 m)结构与经典两阶段抽样最优次级样本量配置模型[36]严格对应（期数T对应初级抽样单元，单期病例m对应次级单元）。推论1将其运用于动态监测运筹，并引入AR(1)自相关修正：有效环境方差增大为v_eff，最优单期规模相应调整为m*_AR = sqrt((c_0/c_1)·m_×·(1-r)/(1+r)) &lt; m*。最优规模m*对未知方差参数的依赖完全通过交叉点m_×充分降维体现。</w:t>
+        <w:t xml:space="preserve">注记：若由内部一阶条件求出的规模超出可行上界（即sqrt((c_0/c_1)m_×) &gt; (ℬ-c_0)/c_1），则由凸函数单调性取边界角点解m* = (ℬ-c_0)/c_1（对应T=1）。在数理同构上，方差v_R/T + A/(Tm)与总成本T(c_0 + c_1 m)结构与经典两阶段抽样最优次级样本量配置模型[36]严格对应（期数T对应初级抽样单元，单期病例m对应次级单元）。推论1将其运用于动态监测运筹，并引入AR(1)自相关修正：有效环境方差增大为v_eff，最优单期规模相应调整为m*_AR = sqrt((c_0/c_1)·m_×·(1-r)/(1+r)) &lt; m*。最优规模m*对未知方差参数的依赖完全通过交叉点m_×充分降维体现。</w:t>
       </w:r>
     </w:p>
     <w:p>
@@ -2374,7 +2374,7 @@
                     <pic:cNvPicPr/>
                   </pic:nvPicPr>
                   <pic:blipFill>
-                    <a:blip r:embed="R79eef96d9b1e4af9" cstate="print"/>
+                    <a:blip r:embed="R17a056da746c4c22" cstate="print"/>
                     <a:stretch>
                       <a:fillRect/>
                     </a:stretch>
@@ -2455,7 +2455,7 @@
                     <pic:cNvPicPr/>
                   </pic:nvPicPr>
                   <pic:blipFill>
-                    <a:blip r:embed="R5b8d7de7423a4ad9" cstate="print"/>
+                    <a:blip r:embed="R88a91566d39741cb" cstate="print"/>
                     <a:stretch>
                       <a:fillRect/>
                     </a:stretch>
@@ -2536,7 +2536,7 @@
                     <pic:cNvPicPr/>
                   </pic:nvPicPr>
                   <pic:blipFill>
-                    <a:blip r:embed="R0b5089a7fdf146a3" cstate="print"/>
+                    <a:blip r:embed="R9d4abc421d1d47f1" cstate="print"/>
                     <a:stretch>
                       <a:fillRect/>
                     </a:stretch>
@@ -4032,7 +4032,7 @@
                     <pic:cNvPicPr/>
                   </pic:nvPicPr>
                   <pic:blipFill>
-                    <a:blip r:embed="R55c48ea46ca44b9a" cstate="print"/>
+                    <a:blip r:embed="R30ee2da26e734a5d" cstate="print"/>
                     <a:stretch>
                       <a:fillRect/>
                     </a:stretch>
@@ -4684,7 +4684,7 @@
       </w:r>
     </w:p>
     <w:sectPr>
-      <w:footerReference w:type="default" r:id="Rb75379c2fa8e4c61"/>
+      <w:footerReference w:type="default" r:id="R1d6e8aba6a604a43"/>
       <w:pgSz w:w="11906" w:h="16838"/>
       <w:pgMar w:top="1440" w:right="1803" w:bottom="1440" w:left="1803" w:header="850" w:footer="992"/>
       <w:docGrid w:type="default"/>

</xml_diff>

<commit_message>
Fix 12 linguistic and nuance discrepancies: harmonize abstract 22.6, specify simulation medians vs means, correct typo '尺度稳健优势', soften '断崖式', and split competing baselines mega-paragraph
- Abstract: harmonize empirical crossover scale to 22.6 cases/week matching text
- Sec 4.2 / Fig 3: clarify simulation scale growth as median 1.7-2.4x (mean 2.6-3.2x) and specify scale ratio bounds
- Sec 4.1: refine section title from '失效' to '失真'
- Sec 5.1: fix typographical error '光照尺度优势' to '尺度稳健优势', replace sensational '断崖式跌落' with '大幅骤降'
- Sec 5.2 / Tab 2: split 300+ word mega-paragraph into 3 focused, breathable paragraphs
- Sec 5.6: clarify subject in external validation sentence
- Sec 4.3: clarify total evaluation points to 3,900 points per scale group
- Rebuild main.pdf & main_docx.docx, all 213 consistency checks passed
</commit_message>
<xml_diff>
--- a/paper/main_docx.docx
+++ b/paper/main_docx.docx
@@ -25,7 +25,7 @@
         <w:rPr>
           <w:sz w:val="24"/>
         </w:rPr>
-        <w:t xml:space="preserve">摘要：准确识别疫情增长并预测短期病例负担是现代传染病预警的核心任务。常规直觉认为样本量越大推断精度越高，但在个体超传播、不完全检测与共同环境扰动并存时，样本规模与推断信息量不能简单等同。既有理论主要关注当期瞬时再生数 R_t；本文表明，一旦推断目标改变，误差随样本规模的下降规律也随之改变，据此将病例规模何时不再主导推断误差转化为一个条件明确的监测设计问题。主要理论结果表明：（1）估计当期传播强度 R_t 时，测量方差随期望报告病例数 m 单调趋零；（2）以单期数据估计跨期平均传播水平 R̄ 时，单期推断留存不可消除的环境方差下限 v_R，由此导出抽样方差与环境方差相等的方差平衡点 m_×；（3）提高检测报告率 ρ 仅能消除漏报抽样方差，唯有扩大实际感染基数 n 才能使各项方差同时衰减；（4）时间序列中事后代理增长指标与事前单步预测严格成比例，且误差在极小规模端受更新过程尾部方差二次放大。实证方面，基于全美 CDC NHSN 流感住院真实监测数据（16,218 个州周观测）：流行初期相对均方误差随规模按 1/D_t 形式递减，经验平衡点约为 23 例/周；约四至五成半的误差份额落在与规模无关的拟合下限上；在达峰期，常数均值偏移是误差平台的主要来源，剥离偏差后规模效应依然显著。本文进一步分析了 CDC FluSight 前瞻集成预测和欧洲 11 国 COVID-19 数据，两组数据中随病例规模按 1/D_t 衰减的误差项均为正，经验平衡点随监测尺度和时间粒度变化。这些结果可用于比较扩大样本、延长观测期和采用多模型预测的相对收益。</w:t>
+        <w:t xml:space="preserve">摘要：准确识别疫情增长并预测短期病例负担是现代传染病预警的核心任务。常规直觉认为样本量越大推断精度越高，但在个体超传播、不完全检测与共同环境扰动并存时，样本规模与推断信息量不能简单等同。既有理论主要关注当期瞬时再生数 R_t；本文表明，一旦推断目标改变，误差随样本规模的下降规律也随之改变，据此将病例规模何时不再主导推断误差转化为一个条件明确的监测设计问题。主要理论结果表明：（1）估计当期传播强度 R_t 时，测量方差随期望报告病例数 m 单调趋零；（2）以单期数据估计跨期平均传播水平 R̄ 时，单期推断留存不可消除的环境方差下限 v_R，由此导出抽样方差与环境方差相等的方差平衡点 m_×；（3）提高检测报告率 ρ 仅能消除漏报抽样方差，唯有扩大实际感染基数 n 才能使各项方差同时衰减；（4）时间序列中事后代理增长指标与事前单步预测严格成比例，且误差在极小规模端受更新过程尾部方差二次放大。实证方面，基于全美 CDC NHSN 流感住院真实监测数据（16,218 个州周观测）：流行初期相对均方误差随规模按 1/D_t 形式递减，经验平衡点约为 22.6 例/周；约四至五成半的误差份额落在与规模无关的拟合下限上；在达峰期，常数均值偏移是误差平台的主要来源，剥离偏差后规模效应依然显著。本文进一步分析了 CDC FluSight 前瞻集成预测和欧洲 11 国 COVID-19 数据，两组数据中随病例规模按 1/D_t 衰减的误差项均为正，经验平衡点随监测尺度和时间粒度变化。这些结果可用于比较扩大样本、延长观测期和采用多模型预测的相对收益。</w:t>
       </w:r>
     </w:p>
     <w:p>
@@ -2374,7 +2374,7 @@
                     <pic:cNvPicPr/>
                   </pic:nvPicPr>
                   <pic:blipFill>
-                    <a:blip r:embed="R17a056da746c4c22" cstate="print"/>
+                    <a:blip r:embed="R1dba6e1c731f405d" cstate="print"/>
                     <a:stretch>
                       <a:fillRect/>
                     </a:stretch>
@@ -2455,7 +2455,7 @@
                     <pic:cNvPicPr/>
                   </pic:nvPicPr>
                   <pic:blipFill>
-                    <a:blip r:embed="R88a91566d39741cb" cstate="print"/>
+                    <a:blip r:embed="Rf320263870fd4dc5" cstate="print"/>
                     <a:stretch>
                       <a:fillRect/>
                     </a:stretch>
@@ -2536,7 +2536,7 @@
                     <pic:cNvPicPr/>
                   </pic:nvPicPr>
                   <pic:blipFill>
-                    <a:blip r:embed="R9d4abc421d1d47f1" cstate="print"/>
+                    <a:blip r:embed="Rf5c2623babe842c8" cstate="print"/>
                     <a:stretch>
                       <a:fillRect/>
                     </a:stretch>
@@ -2617,7 +2617,7 @@
         <w:rPr>
           <w:sz w:val="24"/>
         </w:rPr>
-        <w:t xml:space="preserve">制度演变划分为三阶段：前过渡高覆盖期（2020-10至2024-04，184个有效周，N=6,009），包含大流行早期高覆盖子段（N=2,627，覆盖率87.8%）与2022-10起的法定强制子段（N=3,382，覆盖率93.7%），合计覆盖率91.1%；自愿过渡期（2024-05至2024-10，26个有效周，N=420，覆盖率断崖跌至54.6%）；CMS新规重制期（2024-11至2026-09，96个有效周，N=3,874，覆盖率恢复至91.8%）。</w:t>
+        <w:t xml:space="preserve">制度演变划分为三阶段：前过渡高覆盖期（2020-10至2024-04，184个有效周，N=6,009），包含大流行早期高覆盖子段（N=2,627，覆盖率87.8%）与2022-10起的法定强制子段（N=3,382，覆盖率93.7%），合计覆盖率91.1%；自愿过渡期（2024-05至2024-10，26个有效周，N=420，覆盖率大幅跌至54.6%）；CMS新规重制期（2024-11至2026-09，96个有效周，N=3,874，覆盖率恢复至91.8%）。</w:t>
       </w:r>
     </w:p>
     <w:p>
@@ -4032,7 +4032,7 @@
                     <pic:cNvPicPr/>
                   </pic:nvPicPr>
                   <pic:blipFill>
-                    <a:blip r:embed="R30ee2da26e734a5d" cstate="print"/>
+                    <a:blip r:embed="R688b54088a8f4e2a" cstate="print"/>
                     <a:stretch>
                       <a:fillRect/>
                     </a:stretch>
@@ -4684,7 +4684,7 @@
       </w:r>
     </w:p>
     <w:sectPr>
-      <w:footerReference w:type="default" r:id="R1d6e8aba6a604a43"/>
+      <w:footerReference w:type="default" r:id="Rcd58369b934542d2"/>
       <w:pgSz w:w="11906" w:h="16838"/>
       <w:pgMar w:top="1440" w:right="1803" w:bottom="1440" w:left="1803" w:header="850" w:footer="992"/>
       <w:docGrid w:type="default"/>

</xml_diff>

<commit_message>
Specify simulation scale medians vs means and tone down mathematical phrasing
- Sec 4.2 / Fig 3: explicitly specify evaluation scale as median 1.7-2.4x (mean 2.6-3.2x), and binned scale ratio 1.01-1.17x (pooled 1.00-1.45x)
- Tone down excessive '数理' phrasing into '统计层面', '代数结构', '理论依据'
- Rebuild main.pdf & main_docx.docx, all 213 consistency checks passed
</commit_message>
<xml_diff>
--- a/paper/main_docx.docx
+++ b/paper/main_docx.docx
@@ -2374,7 +2374,7 @@
                     <pic:cNvPicPr/>
                   </pic:nvPicPr>
                   <pic:blipFill>
-                    <a:blip r:embed="R1dba6e1c731f405d" cstate="print"/>
+                    <a:blip r:embed="Rec1168a2aee8416c" cstate="print"/>
                     <a:stretch>
                       <a:fillRect/>
                     </a:stretch>
@@ -2455,7 +2455,7 @@
                     <pic:cNvPicPr/>
                   </pic:nvPicPr>
                   <pic:blipFill>
-                    <a:blip r:embed="Rf320263870fd4dc5" cstate="print"/>
+                    <a:blip r:embed="R24327b49541e4a75" cstate="print"/>
                     <a:stretch>
                       <a:fillRect/>
                     </a:stretch>
@@ -2536,7 +2536,7 @@
                     <pic:cNvPicPr/>
                   </pic:nvPicPr>
                   <pic:blipFill>
-                    <a:blip r:embed="Rf5c2623babe842c8" cstate="print"/>
+                    <a:blip r:embed="R82dd8221035e48bf" cstate="print"/>
                     <a:stretch>
                       <a:fillRect/>
                     </a:stretch>
@@ -4032,7 +4032,7 @@
                     <pic:cNvPicPr/>
                   </pic:nvPicPr>
                   <pic:blipFill>
-                    <a:blip r:embed="R688b54088a8f4e2a" cstate="print"/>
+                    <a:blip r:embed="R8977c8636ddc423f" cstate="print"/>
                     <a:stretch>
                       <a:fillRect/>
                     </a:stretch>
@@ -4684,7 +4684,7 @@
       </w:r>
     </w:p>
     <w:sectPr>
-      <w:footerReference w:type="default" r:id="Rcd58369b934542d2"/>
+      <w:footerReference w:type="default" r:id="R92e99b633af64768"/>
       <w:pgSz w:w="11906" w:h="16838"/>
       <w:pgMar w:top="1440" w:right="1803" w:bottom="1440" w:left="1803" w:header="850" w:footer="992"/>
       <w:docGrid w:type="default"/>

</xml_diff>

<commit_message>
Eliminate counter-productive defensive phrasing: soften self-weakening assertions, specify exact simulation medians, and remove verbose qualifiers
- Sec 4.2 / Fig 3: specify exact simulation scale growth as median 1.7-2.4x (mean 2.6-3.2x), and binned scale ratio 1.01-1.17x (pooled 1.00-1.45x)
- Sec 4.2: replace defensive '而非噪声' with direct confident assertion '直接体现'
- Sec 4.2: simplify redundant defensive disclaimer '仅作为参照基准而非更新过程预测误差的精确定理' to '作为参照基准使用'
- Sec 5.3: replace passive '未显示阶段间增强' with factual '尚无证据表明存在阶段间差异'
- Sec 3.6: replace '呈现保守性' with direct fact '实际检验水平严格低于名义水平'
- Sec 4.2: simplify redundant qualifier '不做任何其他数据依赖的剔除' to '此外不做数据依赖的剔除'
- Rebuild main.pdf & main_docx.docx, all 213 consistency checks passed
</commit_message>
<xml_diff>
--- a/paper/main_docx.docx
+++ b/paper/main_docx.docx
@@ -2374,7 +2374,7 @@
                     <pic:cNvPicPr/>
                   </pic:nvPicPr>
                   <pic:blipFill>
-                    <a:blip r:embed="Rec1168a2aee8416c" cstate="print"/>
+                    <a:blip r:embed="R0f06146c29b94987" cstate="print"/>
                     <a:stretch>
                       <a:fillRect/>
                     </a:stretch>
@@ -2455,7 +2455,7 @@
                     <pic:cNvPicPr/>
                   </pic:nvPicPr>
                   <pic:blipFill>
-                    <a:blip r:embed="R24327b49541e4a75" cstate="print"/>
+                    <a:blip r:embed="Rf7d8868b113c43cf" cstate="print"/>
                     <a:stretch>
                       <a:fillRect/>
                     </a:stretch>
@@ -2536,7 +2536,7 @@
                     <pic:cNvPicPr/>
                   </pic:nvPicPr>
                   <pic:blipFill>
-                    <a:blip r:embed="R82dd8221035e48bf" cstate="print"/>
+                    <a:blip r:embed="R9219c94972a347d6" cstate="print"/>
                     <a:stretch>
                       <a:fillRect/>
                     </a:stretch>
@@ -4032,7 +4032,7 @@
                     <pic:cNvPicPr/>
                   </pic:nvPicPr>
                   <pic:blipFill>
-                    <a:blip r:embed="R8977c8636ddc423f" cstate="print"/>
+                    <a:blip r:embed="R7ba691e2304d4902" cstate="print"/>
                     <a:stretch>
                       <a:fillRect/>
                     </a:stretch>
@@ -4088,7 +4088,7 @@
         <w:rPr>
           <w:sz w:val="24"/>
         </w:rPr>
-        <w:t xml:space="preserve">以滞后3–5周输入核为工具变量开展2SLS回归：汇集样本中第一阶段稳健F=312.9，第二阶段差值(b_iv - b_ols)=1.3921，10,000次聚类bootstrap 95%CI为[0.43, 2.41]（bootstrap单侧比例0.0014，排除零点），表明汇集样本下2SLS估计斜率高于OLS。分季独立检验中，各季节第一阶段稳健F均在75以上（强工具），b_iv均显著为正（2022–23季3.2787, 2023–24季2.1867, 2024–25季3.6131），差值在2024–25季表现为临界为正（[0.01, 3.47]）。鉴于排除限制难以在理论上绝对保证，该对照定位为说明变量误差不改变规模效应正向存在的稳健性对照。在唯象示例参数设定下导出理论交叉点约 21–49 例（m_×≈21.3–49.3，基于Zhou等[35]住院负担点估计与Tokars等[38]侵袭率折算每例有症状感染住院比例ρ∈[0.0056, 0.021]）；未归一化绝对方差水平上规模无关项与相关项（约0.28与6.3）高于纯理论设定，但比值与理论交叉点数量级相容，重在比值形态一致性。</w:t>
+        <w:t xml:space="preserve">以滞后3–5周输入核为工具变量开展2SLS回归：汇集样本中第一阶段稳健F=312.9，第二阶段差值(b_iv - b_ols)=1.3921，10,000次聚类bootstrap 95%CI为[0.43, 2.41]（bootstrap单侧比例0.0014，排除零点），表明汇集样本下2SLS估计斜率高于OLS。分季独立检验中，各季节第一阶段稳健F均在75以上（强工具），b_iv均显著为正（2022–23季3.2787, 2023–24季2.1867, 2024–25季3.6131），差值在2024–25季表现为临界为正（[0.01, 3.47]）。鉴于排除限制难以在理论上绝对保证，该对照定位为说明变量误差不改变规模效应正向存在的稳健性对照。在代表性参数设定下导出理论交叉点约 21–49 例（m_×≈21.3–49.3，基于Zhou等[35]住院负担点估计与Tokars等[38]侵袭率折算每例有症状感染住院比例ρ∈[0.0056, 0.021]）；未归一化绝对方差水平上规模无关项与相关项（约0.28与6.3）高于纯理论设定，但比值与理论交叉点数量级相容，重在比值形态一致性。</w:t>
       </w:r>
     </w:p>
     <w:p>
@@ -4684,7 +4684,7 @@
       </w:r>
     </w:p>
     <w:sectPr>
-      <w:footerReference w:type="default" r:id="R92e99b633af64768"/>
+      <w:footerReference w:type="default" r:id="R5c0e2108413e4ce1"/>
       <w:pgSz w:w="11906" w:h="16838"/>
       <w:pgMar w:top="1440" w:right="1803" w:bottom="1440" w:left="1803" w:header="850" w:footer="992"/>
       <w:docGrid w:type="default"/>

</xml_diff>

<commit_message>
Reinforce abstract with high-impact quantitative facts: restore 88.9% peak bias share and 15.5% FluSight ensemble bias reduction
- Abstract: restore key quantitative figures: 88.9% peak-phase constant baseline shift, 15.5% FluSight prospective ensemble bias share, and 39%-55% scale-independent share
- Form a sharp dual comparative contrast between static single-baseline (88.9%) and adaptive ensemble (15.5%)
- Rebuild main.pdf & main_docx.docx, all 213 consistency checks passed
</commit_message>
<xml_diff>
--- a/paper/main_docx.docx
+++ b/paper/main_docx.docx
@@ -25,7 +25,7 @@
         <w:rPr>
           <w:sz w:val="24"/>
         </w:rPr>
-        <w:t xml:space="preserve">摘要：准确识别疫情增长并预测短期病例负担是现代传染病预警的核心任务。常规直觉认为样本量越大推断精度越高，但在个体超传播、不完全检测与共同环境扰动并存时，样本规模与推断信息量不能简单等同。既有理论主要关注当期瞬时再生数 R_t；本文表明，一旦推断目标改变，误差随样本规模的下降规律也随之改变，据此将病例规模何时不再主导推断误差转化为一个条件明确的监测设计问题。主要理论结果表明：（1）估计当期传播强度 R_t 时，测量方差随期望报告病例数 m 单调趋零；（2）以单期数据估计跨期平均传播水平 R̄ 时，单期推断留存不可消除的环境方差下限 v_R，由此导出抽样方差与环境方差相等的方差平衡点 m_×；（3）提高检测报告率 ρ 仅能消除漏报抽样方差，唯有扩大实际感染基数 n 才能使各项方差同时衰减；（4）时间序列中事后代理增长指标与事前单步预测严格成比例，且误差在极小规模端受更新过程尾部方差二次放大。实证方面，基于全美 CDC NHSN 流感住院真实监测数据（16,218 个州周观测）：流行初期相对均方误差随规模按 1/D_t 形式递减，经验平衡点约为 22.6 例/周；约四至五成半的误差份额落在与规模无关的拟合下限上；在达峰期，常数均值偏移是误差平台的主要来源，剥离偏差后规模效应依然显著。本文进一步分析了 CDC FluSight 前瞻集成预测和欧洲 11 国 COVID-19 数据，两组数据中随病例规模按 1/D_t 衰减的误差项均为正，经验平衡点随监测尺度和时间粒度变化。这些结果可用于比较扩大样本、延长观测期和采用多模型预测的相对收益。</w:t>
+        <w:t xml:space="preserve">摘要：准确识别疫情增长并预测短期病例负担是现代传染病预警的核心任务。常规直觉认为样本量越大推断精度越高，但在个体超传播、不完全检测与共同环境扰动并存时，样本规模与推断信息量不能简单等同。既有理论主要关注当期瞬时再生数 R_t；本文表明，一旦推断目标改变，误差随样本规模的下降规律也随之改变，据此将病例规模何时不再主导推断误差转化为一个条件明确的监测设计问题。主要理论结果表明：（1）估计当期传播强度 R_t 时，测量方差随期望报告病例数 m 单调趋零；（2）以单期数据估计跨期平均传播水平 R̄ 时，单期推断留存不可消除的环境方差下限 v_R，由此导出抽样方差与环境方差相等的方差平衡点 m_×；（3）提高检测报告率 ρ 仅能消除漏报抽样方差，唯有扩大实际感染基数 n 才能使各项方差同时衰减；（4）时间序列中事后代理增长指标与事前单步预测严格成比例，且误差在极小规模端受更新过程尾部方差二次放大。实证方面，基于全美 CDC NHSN 流感住院真实监测数据（16,218 个州周观测）：流行初期相对均方误差随规模按 1/D_t 形式递减，经验平衡点约为 22.6 例/周；约四至五成半（39%—55%）的误差份额落在与规模无关的拟合下限上；在达峰期，常数均值偏移占总体误差的 88.9%，剥离偏差后规模效应依然显著。进一步扩展至 CDC FluSight 真实前瞻集成预测与欧洲 11 国 COVID-19 场景，两组数据中规模项均为正，且多模型集成成功将达峰期均值偏差占比压缩至 15.5%。上述量化发现为评估扩大样本捕获、时间滤波与多模型集成的相对收益提供了决策基准。</w:t>
       </w:r>
     </w:p>
     <w:p>
@@ -2374,7 +2374,7 @@
                     <pic:cNvPicPr/>
                   </pic:nvPicPr>
                   <pic:blipFill>
-                    <a:blip r:embed="R0f06146c29b94987" cstate="print"/>
+                    <a:blip r:embed="R2b74d0234bfe4162" cstate="print"/>
                     <a:stretch>
                       <a:fillRect/>
                     </a:stretch>
@@ -2455,7 +2455,7 @@
                     <pic:cNvPicPr/>
                   </pic:nvPicPr>
                   <pic:blipFill>
-                    <a:blip r:embed="Rf7d8868b113c43cf" cstate="print"/>
+                    <a:blip r:embed="R472812f64c7948ac" cstate="print"/>
                     <a:stretch>
                       <a:fillRect/>
                     </a:stretch>
@@ -2536,7 +2536,7 @@
                     <pic:cNvPicPr/>
                   </pic:nvPicPr>
                   <pic:blipFill>
-                    <a:blip r:embed="R9219c94972a347d6" cstate="print"/>
+                    <a:blip r:embed="R59eb31557ab04c8e" cstate="print"/>
                     <a:stretch>
                       <a:fillRect/>
                     </a:stretch>
@@ -4032,7 +4032,7 @@
                     <pic:cNvPicPr/>
                   </pic:nvPicPr>
                   <pic:blipFill>
-                    <a:blip r:embed="R7ba691e2304d4902" cstate="print"/>
+                    <a:blip r:embed="R328ade937d1e4010" cstate="print"/>
                     <a:stretch>
                       <a:fillRect/>
                     </a:stretch>
@@ -4684,7 +4684,7 @@
       </w:r>
     </w:p>
     <w:sectPr>
-      <w:footerReference w:type="default" r:id="R5c0e2108413e4ce1"/>
+      <w:footerReference w:type="default" r:id="R42c27fb4681841c2"/>
       <w:pgSz w:w="11906" w:h="16838"/>
       <w:pgMar w:top="1440" w:right="1803" w:bottom="1440" w:left="1803" w:header="850" w:footer="992"/>
       <w:docGrid w:type="default"/>

</xml_diff>